<commit_message>
docs: revise IJCCS manuscript after review
Addresses all review points: single-resource scope in title and aims,
threshold-free P/R/F1 (Table 6), stage-1 selection vs. conditional stage-2
accuracy (Table 7), Encounter absorption recomputed with the definition
catalogue for both models (Table 9), explicit evaluation procedure with a
worked example, confirmatory test family, honest pre-registration statement,
quoted prompts, and corrected model-gap figures. Figure 1 now marks gold
correspondences as illustration. The annotation kit gains a resource-level
agreement sheet. All new numbers come from cached model outputs
(revision_analyses.py, 0 new LLM calls). Point-by-point response in
paper/ijccs/tanggapan_reviewer.md; kappa, author details and repository URL
are still pending.

Co-Authored-By: Claude Opus 5.5 <noreply@anthropic.com>
</commit_message>
<xml_diff>
--- a/paper/ijccs/IJCCS_manuscript.docx
+++ b/paper/ijccs/IJCCS_manuscript.docx
@@ -21,7 +21,7 @@
           <w:szCs w:val="36"/>
           <w:lang w:val="en-US"/>
         </w:rPr>
-        <w:t xml:space="preserve">Single-Resource Two-Stage LLM Matching of Indonesian Hospital Schemas to FHIR</w:t>
+        <w:t xml:space="preserve">Single-Resource LLM Schema Matching of Indonesian Health Systems to FHIR</w:t>
       </w:r>
     </w:p>
     <w:p>
@@ -207,7 +207,7 @@
           <w:szCs w:val="22"/>
           <w:shd w:fill="FFFFFF" w:val="clear"/>
         </w:rPr>
-        <w:t xml:space="preserve">Fasilitas kesehatan di Indonesia wajib mengirim rekam medis elektronik ke platform SATUSEHAT dalam format HL7 FHIR R4, sehingga integrasi data menjadi masalah pencocokan skema antara skema basis data berbahasa Indonesia yang bersingkatan dan standar berbahasa Inggris. Penelitian ini membangun benchmark berisi 59 tabel dari tujuh sistem informasi kesehatan open-source Indonesia dengan 274 korespondensi beranotasi ke 289 elemen FHIR, dibagi menjadi set pengembangan dan set uji yang dipra-registrasi. Pencocok klasik gagal pada skema ini (COMA R@|GT| 0,15 dibanding 0,53 untuk LLM 8B). Ketika seluruh standar menjadi target, satu prompt LLM kehilangan sekitar separuh akurasinya. Kami mengusulkan pencocok dua tahap yang memilih resource FHIR dari definisi resminya, lalu mencocokkan kolom hanya ke resource peringkat pertama. Metode ini menaikkan recall 12,7–13,7 poin dibanding prompt penuh dengan sekitar separuh token prompt, baik untuk Qwen3-8B maupun GLM-5.3-Flash tanpa penyetelan ulang. Pada set uji, besar efeknya sama tetapi belum signifikan secara statistik (n = 18). Analisis galat menunjukkan bahwa kesalahan yang tersisa berkaitan dengan pemodelan FHIR, misalnya resource yang dirujuk lewat foreign key menyerap prediksi, bukan dengan kosakata atau singkatan bahasa Indonesia.</w:t>
+        <w:t xml:space="preserve">Fasilitas kesehatan di Indonesia wajib mengirim rekam medis elektronik ke platform SATUSEHAT dalam format HL7 FHIR R4, sehingga integrasi data menjadi masalah pencocokan skema antara skema basis data berbahasa Indonesia yang bersingkatan dan standar berbahasa Inggris. Kami membangun benchmark berisi 59 tabel dari tujuh sistem informasi kesehatan open-source Indonesia dengan 274 korespondensi beranotasi ke 289 elemen FHIR, di mana setiap tabel dipetakan ke satu resource FHIR, dibagi menjadi set pengembangan dan set uji yang dipra-registrasi. Pencocok klasik gagal pada skema ini (COMA R@|GT| 0,15 dibanding 0,53 untuk LLM 8B), dan ketika seluruh standar menjadi target, recall satu prompt LLM turun dari 0,55 ke 0,35 pada tabel pengembangan. Kami mengusulkan pencocok dua tahap yang memilih resource FHIR dari definisi resminya lalu mencocokkan kolom hanya ke resource peringkat pertama. Pada set pengembangan, recall naik 13,7 dan 12,7 poin untuk Qwen3-8B dan GLM-5.3-Flash dengan sekitar separuh token prompt; pada sistem uji, kenaikannya (12,2 dan 7,9 poin) searah tetapi belum terkonfirmasi secara statistik. Analisis galat menunjukkan bahwa hambatan utamanya adalah pemilihan resource, bukan pencocokan kolom, dan bahwa resource yang dirujuk lewat foreign key menyerap prediksi.</w:t>
       </w:r>
     </w:p>
     <w:p>
@@ -274,7 +274,7 @@
           <w:sz w:val="22"/>
           <w:szCs w:val="22"/>
         </w:rPr>
-        <w:t xml:space="preserve">Indonesian health facilities must report electronic medical records to the national SATUSEHAT platform in HL7 FHIR R4, which turns data integration into a schema-matching problem between abbreviated Indonesian database schemas and an English standard. We build a benchmark of 59 tables from seven open-source Indonesian health information systems, with 274 annotated correspondences into 289 FHIR elements, split into a development set and a pre-registered held-out set. Classic matchers fail on these schemas (COMA R@|GT| 0.15 vs. 0.53 for an 8B LLM). When the whole standard is the target, a single LLM prompt loses about half of its accuracy. We propose a two-stage matcher that selects the FHIR resource from its official definition and then matches columns only against the top-ranked resource. It improves recall by 12.7–13.7 points over the full prompt at about half the prompt tokens, for both Qwen3-8B and GLM-5.3-Flash without retuning. On the held-out set the effect has the same size but is not statistically confirmed (n = 18). Error analysis shows that the remaining errors concern FHIR modelling, such as resources referenced through foreign keys absorbing predictions, rather than Indonesian vocabulary or abbreviations.</w:t>
+        <w:t xml:space="preserve">Indonesian health facilities must report electronic medical records to the national SATUSEHAT platform in HL7 FHIR R4, which turns data integration into a schema-matching problem between abbreviated Indonesian database schemas and an English standard. We build a benchmark of 59 tables from seven open-source Indonesian health information systems with 274 annotated correspondences into 289 FHIR elements, in which each table maps to a single FHIR resource, split into a development set and a pre-registered held-out set. Classic matchers fail on these schemas (COMA R@|GT| 0.15 vs. 0.53 for an 8B LLM), and when the whole standard is the target, the recall of a single LLM prompt drops from 0.55 to 0.35 on development tables. We propose a two-stage matcher that selects the FHIR resource from its official definition and then matches columns only against the top-ranked resource. On the development set it improves recall by 13.7 and 12.7 points for Qwen3-8B and GLM-5.3-Flash at about half the prompt tokens; on held-out systems the gains (12.2 and 7.9 points) are directionally consistent but not statistically confirmed. Error analysis shows that resource selection, not column matching, is the bottleneck, and that resources referenced through foreign keys absorb predictions.</w:t>
       </w:r>
     </w:p>
     <w:p>
@@ -363,7 +363,7 @@
           <w:sz w:val="22"/>
           <w:szCs w:val="22"/>
         </w:rPr>
-        <w:t xml:space="preserve"> policy requires government data producers to follow shared data standards, metadata and interoperability rules [4]. For the thousands of facilities that run locally developed or open-source information systems, compliance is a schema-matching problem. An engineer has to decide which column of which local table corresponds to which element of which FHIR resource, table by table and column by column.</w:t>
+        <w:t xml:space="preserve"> policy requires government data producers to follow shared data standards, metadata and interoperability rules [4]. For the thousands of facilities that run locally developed or open-source information systems, compliance is a schema-matching problem: an engineer has to decide which column of which local table corresponds to which element of which FHIR resource.</w:t>
       </w:r>
     </w:p>
     <w:p>
@@ -382,7 +382,7 @@
           <w:szCs w:val="22"/>
           <w:lang w:val="id-ID"/>
         </w:rPr>
-        <w:t xml:space="preserve">Schema matching has mature lexical and structural solutions such as Cupid [5], COMA [6] and Similarity Flooding [7], and frameworks such as Valentine compare them on common benchmarks [8]. Learned matchers, from attention models trained on clinical schema pairs [9] to multi-task matching models [10], need labelled pairs that rarely exist for a new national standard. Large language models (LLMs) can match schemas from names and descriptions alone, although quality suffers both from too little and from too much context [11]. Retrieval lets LLM matchers scale to large schemas without training data [12], and retrieve-and-rerank pipelines combine small and large models [13]. Matchmaker composes candidate generation, refinement and confidence scoring into a self-improving program for medical schemas [14]. Other recent work proposes unified LLM matching frameworks [15] or general data-preprocessing LLMs [16]. In the biomedical domain, GDC-SM maps cancer-study data onto the Genomic Data Commons standard [17], and FHIR-GPT transforms clinical text into FHIR resources [18]. Column-name abbreviation is a recognised problem in English tables, addressed by NameGuess [19] and Columbo [20]. Indonesian NLP now has benchmarks for understanding, generation and sentiment [21,22], but not for data integration.</w:t>
+        <w:t xml:space="preserve">Schema matching has mature lexical and structural solutions such as Cupid [5], COMA [6] and Similarity Flooding [7], and frameworks such as Valentine compare them on common benchmarks [8]. Learned matchers, from attention models trained on clinical schema pairs [9] to multi-task matching models [10], need labelled pairs that rarely exist for a new national standard. Large language models (LLMs) can match schemas from names and descriptions alone, although quality suffers both from too little and from too much context [11]. Retrieval lets LLM matchers scale to large schemas without training data [12], retrieve-and-rerank pipelines combine small and large models [13], and Matchmaker composes candidate generation, refinement and confidence scoring into a self-improving program for medical schemas [14]. Other work proposes unified LLM matching frameworks [15] or general data-preprocessing LLMs [16]. In the biomedical domain, GDC-SM maps cancer-study data onto the Genomic Data Commons standard [17], and FHIR-GPT transforms clinical text into FHIR resources [18]. Column-name abbreviation is a recognised problem in English tables [19,20], and Indonesian NLP has benchmarks for generation and sentiment [21,22], but not for data integration.</w:t>
       </w:r>
     </w:p>
     <w:p>
@@ -401,7 +401,7 @@
           <w:szCs w:val="22"/>
           <w:lang w:val="id-ID"/>
         </w:rPr>
-        <w:t xml:space="preserve">Two features of the Indonesian setting are not covered by this literature. First, the source schemas are Indonesian and often abbreviated (</w:t>
+        <w:t xml:space="preserve">Two features of the Indonesian setting are not covered by this literature. The source schemas are Indonesian and often abbreviated (</w:t>
       </w:r>
       <w:r>
         <w:rPr>
@@ -449,7 +449,24 @@
           <w:szCs w:val="22"/>
           <w:lang w:val="id-ID"/>
         </w:rPr>
-        <w:t xml:space="preserve">), while the standard is English. Second, a hospital table must be mapped into a standard of hundreds of elements without knowing in advance which resource it belongs to; most benchmarks match a source table against a pre-selected target table. This paper addresses both. Its contributions are: (i) a benchmark of 59 tables from seven open-source Indonesian systems mapped to FHIR R4, with annotation conventions, a development/held-out split and a pre-registered confirmation protocol; (ii) a two-stage matcher that first selects the target resource and then matches columns against that single resource only, evaluated with two open model families; and (iii) an error analysis showing that the remaining failures concern FHIR modelling knowledge rather than language.</w:t>
+        <w:t xml:space="preserve">), while the standard is English; and a table must be mapped into a standard of hundreds of elements without knowing in advance which resource it belongs to. This paper studies the </w:t>
+      </w:r>
+      <w:r>
+        <w:rPr>
+          <w:sz w:val="22"/>
+          <w:szCs w:val="22"/>
+          <w:lang w:val="id-ID"/>
+          <w:i/>
+        </w:rPr>
+        <w:t xml:space="preserve">single-resource</w:t>
+      </w:r>
+      <w:r>
+        <w:rPr>
+          <w:sz w:val="22"/>
+          <w:szCs w:val="22"/>
+          <w:lang w:val="id-ID"/>
+        </w:rPr>
+        <w:t xml:space="preserve"> case, in which every table is exported as one FHIR resource plus references. Its contributions are: (i) a benchmark of 59 tables from seven open-source Indonesian systems mapped to FHIR R4, with annotation conventions, a development/held-out split and a pre-registered confirmation protocol; (ii) a two-stage matcher that first selects the target resource and then matches columns against that resource only, evaluated with two open model families; and (iii) an analysis that separates resource-selection errors from column-matching errors.</w:t>
       </w:r>
     </w:p>
     <w:p>
@@ -529,7 +546,7 @@
           <w:szCs w:val="22"/>
           <w:lang w:val="id-ID"/>
         </w:rPr>
-        <w:t xml:space="preserve">The target standard is HL7 FHIR R4 (4.0.1) [3]. We use 11 resources that cover the clinical and administrative core of a hospital system: Patient, Practitioner, Organization, Location, Encounter, Condition, Observation, MedicationRequest, Medication, DiagnosticReport and ServiceRequest. Elements are taken from the official StructureDefinition snapshots at the top and backbone level, without datatype expansion and without technical elements (</w:t>
+        <w:t xml:space="preserve">The target standard is HL7 FHIR R4 (4.0.1) [3]. We use 11 resources that cover the clinical and administrative core of a health information system: Patient, Practitioner, Organization, Location, Encounter, Condition, Observation, MedicationRequest, Medication, DiagnosticReport and ServiceRequest. Elements are taken from the official StructureDefinition snapshots at the top and backbone level, without datatype expansion and without technical elements (</w:t>
       </w:r>
       <w:r>
         <w:rPr>
@@ -577,7 +594,7 @@
           <w:szCs w:val="22"/>
           <w:lang w:val="id-ID"/>
         </w:rPr>
-        <w:t xml:space="preserve">, extensions). This gives 13–46 elements per resource and 289 elements in total. The development set (</w:t>
+        <w:t xml:space="preserve">, extensions), giving 13–46 elements per resource and 289 in total. The development set (</w:t>
       </w:r>
       <w:r>
         <w:rPr>
@@ -594,7 +611,7 @@
           <w:szCs w:val="22"/>
           <w:lang w:val="id-ID"/>
         </w:rPr>
-        <w:t xml:space="preserve">) has 40 tables of SIMRS Khanza, the most widely used open-source hospital information system in Indonesia, plus one citizen table of OpenSID; the 41 tables cover all 11 resources. The held-out confirmation set (</w:t>
+        <w:t xml:space="preserve">) has 40 tables of SIMRS Khanza, the most widely used open-source hospital information system in Indonesia, plus one citizen table of OpenSID. The held-out set (</w:t>
       </w:r>
       <w:r>
         <w:rPr>
@@ -611,7 +628,7 @@
           <w:szCs w:val="22"/>
           <w:lang w:val="id-ID"/>
         </w:rPr>
-        <w:t xml:space="preserve">) has 18 tables from six independent clinic and community-health systems found on GitHub. We excluded systems derived from Khanza, schemas with English identifiers, and a dump that appeared to be the production schema of a real hospital, because its provenance was unclear. Table 1 summarises the benchmark.</w:t>
+        <w:t xml:space="preserve">) has 18 tables from six independent clinic and community-health code bases found on GitHub, one of which is the health module of OpenSID; OpenSID is therefore counted once and the benchmark covers seven systems (Table 1). We excluded systems derived from Khanza, schemas with English identifiers, and a dump that appeared to be the production schema of a real hospital, because its provenance was unclear.</w:t>
       </w:r>
     </w:p>
     <w:p>
@@ -631,7 +648,7 @@
           <w:szCs w:val="22"/>
           <w:lang w:val="id-ID"/>
         </w:rPr>
-        <w:t xml:space="preserve">Table 1 Benchmark statistics per source system (FHIR pairs); abbreviated = column with a vowel-poor token or a two-letter acronym</w:t>
+        <w:t xml:space="preserve">Table 1 Benchmark statistics per source code base (FHIR pairs); abbreviated = column with a vowel-poor token or a two-letter acronym</w:t>
       </w:r>
     </w:p>
     <w:tbl>
@@ -707,7 +724,7 @@
                 <w:sz w:val="18"/>
                 <w:szCs w:val="18"/>
               </w:rPr>
-              <w:t xml:space="preserve">System (licence)</w:t>
+              <w:t xml:space="preserve">Code base (licence)</w:t>
             </w:r>
           </w:p>
         </w:tc>
@@ -1133,7 +1150,7 @@
                 <w:sz w:val="18"/>
                 <w:szCs w:val="18"/>
               </w:rPr>
-              <w:t xml:space="preserve">OpenSID, village administration (GPL-3.0)</w:t>
+              <w:t xml:space="preserve">OpenSID, citizen register (GPL-3.0)</w:t>
             </w:r>
           </w:p>
         </w:tc>
@@ -2622,7 +2639,7 @@
                 <w:sz w:val="18"/>
                 <w:szCs w:val="18"/>
               </w:rPr>
-              <w:t xml:space="preserve">7 systems</w:t>
+              <w:t xml:space="preserve">8 code bases, 7 systems</w:t>
             </w:r>
           </w:p>
         </w:tc>
@@ -2804,7 +2821,37 @@
           <w:sz w:val="22"/>
           <w:szCs w:val="22"/>
         </w:rPr>
-        <w:t xml:space="preserve">Each source table is paired with the one FHIR resource it would be exported as. The annotator marks 1:1 correspondences (scored), n:1 correspondences (further columns mapping onto an element already used, e.g. </w:t>
+        <w:t xml:space="preserve">Each source table is paired with the one FHIR resource it would be exported as. Every source column receives one of four labels: </w:t>
+      </w:r>
+      <w:r>
+        <w:rPr>
+          <w:sz w:val="22"/>
+          <w:szCs w:val="22"/>
+          <w:i/>
+        </w:rPr>
+        <w:t xml:space="preserve">1:1</w:t>
+      </w:r>
+      <w:r>
+        <w:rPr>
+          <w:sz w:val="22"/>
+          <w:szCs w:val="22"/>
+        </w:rPr>
+        <w:t xml:space="preserve"> (the scored correspondence), </w:t>
+      </w:r>
+      <w:r>
+        <w:rPr>
+          <w:sz w:val="22"/>
+          <w:szCs w:val="22"/>
+          <w:i/>
+        </w:rPr>
+        <w:t xml:space="preserve">n:1</w:t>
+      </w:r>
+      <w:r>
+        <w:rPr>
+          <w:sz w:val="22"/>
+          <w:szCs w:val="22"/>
+        </w:rPr>
+        <w:t xml:space="preserve"> (a further column mapping onto an element already used, e.g. </w:t>
       </w:r>
       <w:r>
         <w:rPr>
@@ -2825,7 +2872,7 @@
           <w:sz w:val="22"/>
           <w:szCs w:val="22"/>
         </w:rPr>
-        <w:t xml:space="preserve">Encounter.period</w:t>
+        <w:t xml:space="preserve">period</w:t>
       </w:r>
       <w:r>
         <w:rPr>
@@ -2860,7 +2907,37 @@
           <w:sz w:val="22"/>
           <w:szCs w:val="22"/>
         </w:rPr>
-        <w:t xml:space="preserve"> is the 1:1 link), and ambiguous cases with a reason. The conventions are: base FHIR R4 only, so SATUSEHAT extensions such as birth place and religion are true negatives; no datatype expansion; a foreign key reachable only through a join is ambiguous; a visit number in a non-visit table is a reference (</w:t>
+        <w:t xml:space="preserve"> is the 1:1 link), </w:t>
+      </w:r>
+      <w:r>
+        <w:rPr>
+          <w:sz w:val="22"/>
+          <w:szCs w:val="22"/>
+          <w:i/>
+        </w:rPr>
+        <w:t xml:space="preserve">ambiguous</w:t>
+      </w:r>
+      <w:r>
+        <w:rPr>
+          <w:sz w:val="22"/>
+          <w:szCs w:val="22"/>
+        </w:rPr>
+        <w:t xml:space="preserve"> (two readings are defensible; a reason is recorded) or </w:t>
+      </w:r>
+      <w:r>
+        <w:rPr>
+          <w:sz w:val="22"/>
+          <w:szCs w:val="22"/>
+          <w:i/>
+        </w:rPr>
+        <w:t xml:space="preserve">none</w:t>
+      </w:r>
+      <w:r>
+        <w:rPr>
+          <w:sz w:val="22"/>
+          <w:szCs w:val="22"/>
+        </w:rPr>
+        <w:t xml:space="preserve">. The conventions are: base FHIR R4 only, so SATUSEHAT extensions such as birth place and religion are true negatives; no datatype expansion; a foreign key reachable only through a join is ambiguous; a visit number in a non-visit table is a reference (</w:t>
       </w:r>
       <w:r>
         <w:rPr>
@@ -4166,7 +4243,120 @@
           <w:sz w:val="22"/>
           <w:szCs w:val="22"/>
         </w:rPr>
-        <w:t xml:space="preserve">The gold standard was drafted by one annotator, and a second annotator independently labelled all 713 columns [TBD: Cohen's κ, adjudication].</w:t>
+        <w:t xml:space="preserve">The gold standard was drafted by the first annotator. A second annotator, blind to the draft, labelled all 713 columns with the same four labels and judged, for each table, whether the assigned resource is correct. Agreement is reported at the resource level (share of tables whose resource is accepted) and at the element level (Cohen's κ over per-column labels, excluding columns that either annotator marked ambiguous, and F1 between the two sets of 1:1 links). Disagreements were resolved by discussion, and the adjudicated labels form the gold standard [TBD: resource agreement, κ, 1:1-link F1, number of changed labels, and two examples of disagreements that changed the gold standard].</w:t>
+      </w:r>
+    </w:p>
+    <w:p>
+      <w:pPr>
+        <w:pStyle w:val="Heading2"/>
+        <w:ind w:hanging="0" w:start="0"/>
+        <w:rPr>
+          <w:rFonts w:ascii="Times New Roman" w:hAnsi="Times New Roman" w:cs="Times New Roman"/>
+          <w:b w:val="false"/>
+          <w:sz w:val="22"/>
+          <w:szCs w:val="22"/>
+          <w:lang w:val="id-ID"/>
+        </w:rPr>
+      </w:pPr>
+      <w:r>
+        <w:rPr>
+          <w:rFonts w:cs="Times New Roman" w:ascii="Times New Roman" w:hAnsi="Times New Roman"/>
+          <w:sz w:val="22"/>
+          <w:szCs w:val="22"/>
+          <w:lang w:val="id-ID"/>
+        </w:rPr>
+        <w:t xml:space="preserve">2.2 Matchers</w:t>
+      </w:r>
+    </w:p>
+    <w:p>
+      <w:pPr>
+        <w:pStyle w:val="Text"/>
+        <w:ind w:hanging="0" w:end="0"/>
+        <w:rPr>
+          <w:sz w:val="22"/>
+          <w:szCs w:val="22"/>
+          <w:lang w:val="id-ID"/>
+        </w:rPr>
+      </w:pPr>
+      <w:r>
+        <w:rPr>
+          <w:sz w:val="22"/>
+          <w:szCs w:val="22"/>
+        </w:rPr>
+        <w:t xml:space="preserve">All matchers see column names and types only, without data rows and without the source table name. Two target sizes are studied: the small target (</w:t>
+      </w:r>
+      <w:r>
+        <w:rPr>
+          <w:sz w:val="22"/>
+          <w:szCs w:val="22"/>
+          <w:i/>
+        </w:rPr>
+        <w:t xml:space="preserve">oracle</w:t>
+      </w:r>
+      <w:r>
+        <w:rPr>
+          <w:sz w:val="22"/>
+          <w:szCs w:val="22"/>
+        </w:rPr>
+        <w:t xml:space="preserve">), which contains only the correct resource, and the large target, which is the union of all 11 resources (289 elements named </w:t>
+      </w:r>
+      <w:r>
+        <w:rPr>
+          <w:sz w:val="22"/>
+          <w:szCs w:val="22"/>
+        </w:rPr>
+        <w:t xml:space="preserve">Resource.path</w:t>
+      </w:r>
+      <w:r>
+        <w:rPr>
+          <w:sz w:val="22"/>
+          <w:szCs w:val="22"/>
+        </w:rPr>
+        <w:t xml:space="preserve">) with no indication of the correct one. The classic baselines are COMA, Cupid and Similarity Flooding through Valentine [8], and the embedding baseline is cosine similarity of bge-m3 [23] over normalised names. The </w:t>
+      </w:r>
+      <w:r>
+        <w:rPr>
+          <w:sz w:val="22"/>
+          <w:szCs w:val="22"/>
+          <w:i/>
+        </w:rPr>
+        <w:t xml:space="preserve">llm-full</w:t>
+      </w:r>
+      <w:r>
+        <w:rPr>
+          <w:sz w:val="22"/>
+          <w:szCs w:val="22"/>
+        </w:rPr>
+        <w:t xml:space="preserve"> matcher sends one prompt with all source columns and all target elements: "You are a data-integration engineer doing schema matching. Find 1:1 correspondences between columns of the SOURCE and TARGET schemas (same real-world attribute, possibly different naming or language). Leave a source column unmatched if nothing fits", followed by the two column lists and a request for JSON </w:t>
+      </w:r>
+      <w:r>
+        <w:rPr>
+          <w:sz w:val="22"/>
+          <w:szCs w:val="22"/>
+        </w:rPr>
+        <w:t xml:space="preserve">{source, target, confidence}</w:t>
+      </w:r>
+      <w:r>
+        <w:rPr>
+          <w:sz w:val="22"/>
+          <w:szCs w:val="22"/>
+        </w:rPr>
+        <w:t xml:space="preserve"> items. The </w:t>
+      </w:r>
+      <w:r>
+        <w:rPr>
+          <w:sz w:val="22"/>
+          <w:szCs w:val="22"/>
+          <w:i/>
+        </w:rPr>
+        <w:t xml:space="preserve">hybrid</w:t>
+      </w:r>
+      <w:r>
+        <w:rPr>
+          <w:sz w:val="22"/>
+          <w:szCs w:val="22"/>
+        </w:rPr>
+        <w:t xml:space="preserve"> matcher retrieves the top-k elements per source column with bge-m3 (k = 5, sensitivity k = 10) and one LLM prompt chooses among each column's candidates. This is the retrieve-and-rerank design of ReMatch and Magneto [12,13] without their training components; we do not compare with those systems or with Matchmaker [14] directly because Magneto fine-tunes its retriever on generated data and Matchmaker optimises in-context demonstrations, which is outside the zero-training setting studied here.</w:t>
       </w:r>
     </w:p>
     <w:p>
@@ -4185,95 +4375,7 @@
           <w:szCs w:val="22"/>
           <w:lang w:val="id-ID"/>
         </w:rPr>
-        <w:t xml:space="preserve">All design decisions in Section 2.2 were made on dev41. Before any matcher was run on confirm18, a pre-registration fixed the configurations, hypotheses, primary metric, test and correction, and the SHA-256 hashes of the confirm18 gold files; the run script refuses to execute if the hashes differ [23]. Only table names, column names and types are released, together with our annotations; licences of the sources are documented in the release.</w:t>
-      </w:r>
-    </w:p>
-    <w:p>
-      <w:pPr>
-        <w:pStyle w:val="Heading2"/>
-        <w:ind w:hanging="0" w:start="0"/>
-        <w:rPr>
-          <w:rFonts w:ascii="Times New Roman" w:hAnsi="Times New Roman" w:cs="Times New Roman"/>
-          <w:b w:val="false"/>
-          <w:sz w:val="22"/>
-          <w:szCs w:val="22"/>
-          <w:lang w:val="id-ID"/>
-        </w:rPr>
-      </w:pPr>
-      <w:r>
-        <w:rPr>
-          <w:rFonts w:cs="Times New Roman" w:ascii="Times New Roman" w:hAnsi="Times New Roman"/>
-          <w:sz w:val="22"/>
-          <w:szCs w:val="22"/>
-          <w:lang w:val="id-ID"/>
-        </w:rPr>
-        <w:t xml:space="preserve">2.2 Matchers</w:t>
-      </w:r>
-    </w:p>
-    <w:p>
-      <w:pPr>
-        <w:pStyle w:val="Text"/>
-        <w:ind w:hanging="0" w:end="0"/>
-        <w:rPr>
-          <w:sz w:val="22"/>
-          <w:szCs w:val="22"/>
-          <w:lang w:val="id-ID"/>
-        </w:rPr>
-      </w:pPr>
-      <w:r>
-        <w:rPr>
-          <w:sz w:val="22"/>
-          <w:szCs w:val="22"/>
-        </w:rPr>
-        <w:t xml:space="preserve">All matchers see column names and types only, without data rows and without the source table name. Two target sizes are studied: the small target (</w:t>
-      </w:r>
-      <w:r>
-        <w:rPr>
-          <w:sz w:val="22"/>
-          <w:szCs w:val="22"/>
-          <w:i/>
-        </w:rPr>
-        <w:t xml:space="preserve">oracle</w:t>
-      </w:r>
-      <w:r>
-        <w:rPr>
-          <w:sz w:val="22"/>
-          <w:szCs w:val="22"/>
-        </w:rPr>
-        <w:t xml:space="preserve">), which contains only the correct resource, and the large target, which is the union of all 11 resources (289 elements named </w:t>
-      </w:r>
-      <w:r>
-        <w:rPr>
-          <w:sz w:val="22"/>
-          <w:szCs w:val="22"/>
-        </w:rPr>
-        <w:t xml:space="preserve">Resource.path</w:t>
-      </w:r>
-      <w:r>
-        <w:rPr>
-          <w:sz w:val="22"/>
-          <w:szCs w:val="22"/>
-        </w:rPr>
-        <w:t xml:space="preserve">) with no indication of the correct one.</w:t>
-      </w:r>
-    </w:p>
-    <w:p>
-      <w:pPr>
-        <w:pStyle w:val="Text"/>
-        <w:ind w:firstLine="709" w:end="0"/>
-        <w:rPr>
-          <w:sz w:val="22"/>
-          <w:szCs w:val="22"/>
-          <w:lang w:val="id-ID"/>
-        </w:rPr>
-      </w:pPr>
-      <w:r>
-        <w:rPr>
-          <w:sz w:val="22"/>
-          <w:szCs w:val="22"/>
-          <w:lang w:val="id-ID"/>
-        </w:rPr>
-        <w:t xml:space="preserve">The classic baselines are COMA, Cupid and Similarity Flooding through Valentine [8], and the embedding baseline is cosine similarity of bge-m3 [24] over normalised names. The </w:t>
+        <w:t xml:space="preserve">The proposed </w:t>
       </w:r>
       <w:r>
         <w:rPr>
@@ -4282,7 +4384,7 @@
           <w:lang w:val="id-ID"/>
           <w:i/>
         </w:rPr>
-        <w:t xml:space="preserve">llm-full</w:t>
+        <w:t xml:space="preserve">two-stage</w:t>
       </w:r>
       <w:r>
         <w:rPr>
@@ -4290,7 +4392,23 @@
           <w:szCs w:val="22"/>
           <w:lang w:val="id-ID"/>
         </w:rPr>
-        <w:t xml:space="preserve"> matcher sends one prompt with all source columns and all target elements and asks for a JSON list of correspondences with confidences. The </w:t>
+        <w:t xml:space="preserve"> matcher works as follows. In stage 1, the LLM receives the instruction "You are a data-integration engineer mapping a hospital database table to HL7 FHIR R4. Given the columns of one SOURCE table, choose the 1 to 3 FHIR resources its columns would be mapped into, most likely first. Choose fewer when one resource clearly fits", the source columns, and a catalogue of the 11 resources, each described by the root </w:t>
+      </w:r>
+      <w:r>
+        <w:rPr>
+          <w:sz w:val="22"/>
+          <w:szCs w:val="22"/>
+          <w:lang w:val="id-ID"/>
+        </w:rPr>
+        <w:t xml:space="preserve">definition</w:t>
+      </w:r>
+      <w:r>
+        <w:rPr>
+          <w:sz w:val="22"/>
+          <w:szCs w:val="22"/>
+          <w:lang w:val="id-ID"/>
+        </w:rPr>
+        <w:t xml:space="preserve"> text of its StructureDefinition. In stage 2, the llm-full prompt is run against a reduced target, either the union of all selected resources (</w:t>
       </w:r>
       <w:r>
         <w:rPr>
@@ -4299,7 +4417,7 @@
           <w:lang w:val="id-ID"/>
           <w:i/>
         </w:rPr>
-        <w:t xml:space="preserve">hybrid</w:t>
+        <w:t xml:space="preserve">union</w:t>
       </w:r>
       <w:r>
         <w:rPr>
@@ -4307,26 +4425,7 @@
           <w:szCs w:val="22"/>
           <w:lang w:val="id-ID"/>
         </w:rPr>
-        <w:t xml:space="preserve"> matcher retrieves the top-k elements per source column with bge-m3 (k = 5, sensitivity k = 10), and one LLM prompt chooses among each column's candidates, following retrieve-and-rerank designs [12,13].</w:t>
-      </w:r>
-    </w:p>
-    <w:p>
-      <w:pPr>
-        <w:pStyle w:val="Text"/>
-        <w:ind w:firstLine="709" w:end="0"/>
-        <w:rPr>
-          <w:sz w:val="22"/>
-          <w:szCs w:val="22"/>
-          <w:lang w:val="id-ID"/>
-        </w:rPr>
-      </w:pPr>
-      <w:r>
-        <w:rPr>
-          <w:sz w:val="22"/>
-          <w:szCs w:val="22"/>
-          <w:lang w:val="id-ID"/>
-        </w:rPr>
-        <w:t xml:space="preserve">The proposed </w:t>
+        <w:t xml:space="preserve">) or only the rank-1 resource (</w:t>
       </w:r>
       <w:r>
         <w:rPr>
@@ -4335,7 +4434,7 @@
           <w:lang w:val="id-ID"/>
           <w:i/>
         </w:rPr>
-        <w:t xml:space="preserve">two-stage</w:t>
+        <w:t xml:space="preserve">primary</w:t>
       </w:r>
       <w:r>
         <w:rPr>
@@ -4343,89 +4442,7 @@
           <w:szCs w:val="22"/>
           <w:lang w:val="id-ID"/>
         </w:rPr>
-        <w:t xml:space="preserve"> matcher works as follows. In stage 1, the LLM sees the source columns and a catalogue of the 11 resources and returns one to three resources, most likely first. Each resource is described by the root </w:t>
-      </w:r>
-      <w:r>
-        <w:rPr>
-          <w:sz w:val="22"/>
-          <w:szCs w:val="22"/>
-          <w:lang w:val="id-ID"/>
-        </w:rPr>
-        <w:t xml:space="preserve">definition</w:t>
-      </w:r>
-      <w:r>
-        <w:rPr>
-          <w:sz w:val="22"/>
-          <w:szCs w:val="22"/>
-          <w:lang w:val="id-ID"/>
-        </w:rPr>
-        <w:t xml:space="preserve"> text of its StructureDefinition; alternatives evaluated on dev41 were the one-line </w:t>
-      </w:r>
-      <w:r>
-        <w:rPr>
-          <w:sz w:val="22"/>
-          <w:szCs w:val="22"/>
-          <w:lang w:val="id-ID"/>
-        </w:rPr>
-        <w:t xml:space="preserve">short</w:t>
-      </w:r>
-      <w:r>
-        <w:rPr>
-          <w:sz w:val="22"/>
-          <w:szCs w:val="22"/>
-          <w:lang w:val="id-ID"/>
-        </w:rPr>
-        <w:t xml:space="preserve"> text, </w:t>
-      </w:r>
-      <w:r>
-        <w:rPr>
-          <w:sz w:val="22"/>
-          <w:szCs w:val="22"/>
-          <w:lang w:val="id-ID"/>
-        </w:rPr>
-        <w:t xml:space="preserve">short</w:t>
-      </w:r>
-      <w:r>
-        <w:rPr>
-          <w:sz w:val="22"/>
-          <w:szCs w:val="22"/>
-          <w:lang w:val="id-ID"/>
-        </w:rPr>
-        <w:t xml:space="preserve"> plus element names, and the full "Scope and Usage" section of the specification. In stage 2, columns are matched as in llm-full against a reduced target, either the union of all selected resources (</w:t>
-      </w:r>
-      <w:r>
-        <w:rPr>
-          <w:sz w:val="22"/>
-          <w:szCs w:val="22"/>
-          <w:lang w:val="id-ID"/>
-          <w:i/>
-        </w:rPr>
-        <w:t xml:space="preserve">union</w:t>
-      </w:r>
-      <w:r>
-        <w:rPr>
-          <w:sz w:val="22"/>
-          <w:szCs w:val="22"/>
-          <w:lang w:val="id-ID"/>
-        </w:rPr>
-        <w:t xml:space="preserve">) or only the rank-1 resource (</w:t>
-      </w:r>
-      <w:r>
-        <w:rPr>
-          <w:sz w:val="22"/>
-          <w:szCs w:val="22"/>
-          <w:lang w:val="id-ID"/>
-          <w:i/>
-        </w:rPr>
-        <w:t xml:space="preserve">primary</w:t>
-      </w:r>
-      <w:r>
-        <w:rPr>
-          <w:sz w:val="22"/>
-          <w:szCs w:val="22"/>
-          <w:lang w:val="id-ID"/>
-        </w:rPr>
-        <w:t xml:space="preserve">). The primary variant follows from the one-resource-per-table property of the task. Figure 1 shows the pipeline together with the two reference configurations.</w:t>
+        <w:t xml:space="preserve">). The primary variant follows from the single-resource setting. Figure 1 shows the pipeline.</w:t>
       </w:r>
     </w:p>
     <w:p>
@@ -4499,7 +4516,7 @@
           <w:szCs w:val="22"/>
           <w:lang w:val="id-ID"/>
         </w:rPr>
-        <w:t xml:space="preserve"> (prescriptions); the ranking is the actual Qwen3-8B stage-1 output and the stage-2 mappings shown are gold correspondences</w:t>
+        <w:t xml:space="preserve"> (prescriptions); the ranking is the actual Qwen3-8B stage-1 output, while the mappings in the dashed box are gold correspondences shown for illustration, not model output</w:t>
       </w:r>
     </w:p>
     <w:p>
@@ -4517,7 +4534,7 @@
           <w:sz w:val="22"/>
           <w:szCs w:val="22"/>
         </w:rPr>
-        <w:t xml:space="preserve">An abbreviation dictionary is mined from the Khanza DDL without gold data or external lexicons. It uses identifiers that differ in one token (</w:t>
+        <w:t xml:space="preserve">An abbreviation dictionary is mined from the Khanza DDL without gold data or external lexicons, from identifiers that differ in one token (</w:t>
       </w:r>
       <w:r>
         <w:rPr>
@@ -4573,7 +4590,7 @@
           <w:sz w:val="22"/>
           <w:szCs w:val="22"/>
         </w:rPr>
-        <w:t xml:space="preserve">), and vowel-poor tokens matched to vocabulary words that contain them as a subsequence, ranked by shared neighbouring tokens. The 201 entries have a precision of 75% on tokens in the evaluation tables and 25% on a random held-out sample, where medical acronyms dominate. With the dictionary on, a column is shown as </w:t>
+        <w:t xml:space="preserve">), and vowel-poor tokens matched to vocabulary words that contain them as a subsequence. Its 201 entries have a precision of 75% (27 of 36) on tokens that occur in the evaluation tables and 25% (10 of 40, with 5 uncertain) on a random sample of other tokens, where medical acronyms dominate. With the dictionary on, a column is shown as </w:t>
       </w:r>
       <w:r>
         <w:rPr>
@@ -4587,7 +4604,7 @@
           <w:sz w:val="22"/>
           <w:szCs w:val="22"/>
         </w:rPr>
-        <w:t xml:space="preserve">. The same Khanza dictionary is applied unchanged to confirm18.</w:t>
+        <w:t xml:space="preserve">; a wrong expansion can mislead the model but never hides the original name. The same dictionary is applied unchanged to confirm18.</w:t>
       </w:r>
     </w:p>
     <w:p>
@@ -4627,7 +4644,7 @@
           <w:sz w:val="22"/>
           <w:szCs w:val="22"/>
         </w:rPr>
-        <w:t xml:space="preserve">Qwen3-8B [25] runs locally with Ollama on a laptop (Apple M3 Pro, 18 GB) at temperature 0, seed 0, JSON mode and thinking disabled. GLM-5.3-Flash [26] is an open-weight model accessed through an OpenAI-compatible API at temperature 0, seed 0, JSON mode and the minimum reasoning effort. Prompts are byte-identical across models; configurations were developed on Qwen only, and every response is cached so that all numbers can be recomputed.</w:t>
+        <w:t xml:space="preserve">Qwen3-8B [24] runs locally with Ollama on a laptop (Apple M3 Pro, 18 GB) at temperature 0, seed 0, JSON mode and thinking disabled. GLM-5.3-Flash [25] is an open-weight model accessed through an OpenAI-compatible API at temperature 0, seed 0, JSON mode and the minimum reasoning effort. Prompts are byte-identical across models, configurations were developed on Qwen only, and every response is cached.</w:t>
       </w:r>
     </w:p>
     <w:p>
@@ -4646,7 +4663,174 @@
           <w:szCs w:val="22"/>
           <w:lang w:val="id-ID"/>
         </w:rPr>
-        <w:t xml:space="preserve">The primary metric is R@|GT|, the fraction of gold 1:1 correspondences among a matcher's |GT| highest-scored predictions. F1 is computed after greedy one-to-one assignment by score. Both are n:1-neutral: n:1 and ambiguous pairs are removed from the predictions before scoring. The table pair is the unit of analysis. We report mean differences with 95% bootstrap confidence intervals (10,000 resamples) and Wilcoxon signed-rank tests; the confirmatory test is one-sided with Holm correction over two hypotheses. A correspondence-level analysis with cluster bootstrap and cluster sign-flip permutation over tables is used as a robustness check.</w:t>
+        <w:t xml:space="preserve">Evaluation of one table proceeds in four steps. (1) Parse the model's JSON into (source, target, confidence) triples. (2) Remove predictions that the gold standard labels n:1 or ambiguous, so that they are neither rewarded nor penalised (</w:t>
+      </w:r>
+      <w:r>
+        <w:rPr>
+          <w:sz w:val="22"/>
+          <w:szCs w:val="22"/>
+          <w:lang w:val="id-ID"/>
+          <w:i/>
+        </w:rPr>
+        <w:t xml:space="preserve">n:1-neutral</w:t>
+      </w:r>
+      <w:r>
+        <w:rPr>
+          <w:sz w:val="22"/>
+          <w:szCs w:val="22"/>
+          <w:lang w:val="id-ID"/>
+        </w:rPr>
+        <w:t xml:space="preserve">). (3) R@|GT|: rank the remaining predictions by confidence (ties keep the model's output order), take the top |GT|, and divide the number of gold 1:1 pairs among them by |GT|. (4) Threshold-free precision, recall and F1: assign greedily one-to-one by confidence over all predictions with confidence above 0, without using |GT|, and compare the assigned pairs with the gold 1:1 pairs. For example, for </w:t>
+      </w:r>
+      <w:r>
+        <w:rPr>
+          <w:sz w:val="22"/>
+          <w:szCs w:val="22"/>
+          <w:lang w:val="id-ID"/>
+        </w:rPr>
+        <w:t xml:space="preserve">resep_obat</w:t>
+      </w:r>
+      <w:r>
+        <w:rPr>
+          <w:sz w:val="22"/>
+          <w:szCs w:val="22"/>
+          <w:lang w:val="id-ID"/>
+        </w:rPr>
+        <w:t xml:space="preserve"> with five gold pairs, Qwen's primary output ranks </w:t>
+      </w:r>
+      <w:r>
+        <w:rPr>
+          <w:sz w:val="22"/>
+          <w:szCs w:val="22"/>
+          <w:lang w:val="id-ID"/>
+        </w:rPr>
+        <w:t xml:space="preserve">status</w:t>
+      </w:r>
+      <w:r>
+        <w:rPr>
+          <w:sz w:val="22"/>
+          <w:szCs w:val="22"/>
+          <w:lang w:val="id-ID"/>
+        </w:rPr>
+        <w:t xml:space="preserve"> → </w:t>
+      </w:r>
+      <w:r>
+        <w:rPr>
+          <w:sz w:val="22"/>
+          <w:szCs w:val="22"/>
+          <w:lang w:val="id-ID"/>
+        </w:rPr>
+        <w:t xml:space="preserve">status</w:t>
+      </w:r>
+      <w:r>
+        <w:rPr>
+          <w:sz w:val="22"/>
+          <w:szCs w:val="22"/>
+          <w:lang w:val="id-ID"/>
+        </w:rPr>
+        <w:t xml:space="preserve"> (gold: </w:t>
+      </w:r>
+      <w:r>
+        <w:rPr>
+          <w:sz w:val="22"/>
+          <w:szCs w:val="22"/>
+          <w:lang w:val="id-ID"/>
+        </w:rPr>
+        <w:t xml:space="preserve">category</w:t>
+      </w:r>
+      <w:r>
+        <w:rPr>
+          <w:sz w:val="22"/>
+          <w:szCs w:val="22"/>
+          <w:lang w:val="id-ID"/>
+        </w:rPr>
+        <w:t xml:space="preserve">) first, then two gold pairs, then two wrong date columns; R@|GT| is 2/5 = 0.40, and the n:1 prediction </w:t>
+      </w:r>
+      <w:r>
+        <w:rPr>
+          <w:sz w:val="22"/>
+          <w:szCs w:val="22"/>
+          <w:lang w:val="id-ID"/>
+        </w:rPr>
+        <w:t xml:space="preserve">jam_peresepan</w:t>
+      </w:r>
+      <w:r>
+        <w:rPr>
+          <w:sz w:val="22"/>
+          <w:szCs w:val="22"/>
+          <w:lang w:val="id-ID"/>
+        </w:rPr>
+        <w:t xml:space="preserve"> → </w:t>
+      </w:r>
+      <w:r>
+        <w:rPr>
+          <w:sz w:val="22"/>
+          <w:szCs w:val="22"/>
+          <w:lang w:val="id-ID"/>
+        </w:rPr>
+        <w:t xml:space="preserve">authoredOn</w:t>
+      </w:r>
+      <w:r>
+        <w:rPr>
+          <w:sz w:val="22"/>
+          <w:szCs w:val="22"/>
+          <w:lang w:val="id-ID"/>
+        </w:rPr>
+        <w:t xml:space="preserve"> is removed before scoring. The greedy assignment keeps six pairs, of which three are gold, because </w:t>
+      </w:r>
+      <w:r>
+        <w:rPr>
+          <w:sz w:val="22"/>
+          <w:szCs w:val="22"/>
+          <w:lang w:val="id-ID"/>
+        </w:rPr>
+        <w:t xml:space="preserve">authoredOn</w:t>
+      </w:r>
+      <w:r>
+        <w:rPr>
+          <w:sz w:val="22"/>
+          <w:szCs w:val="22"/>
+          <w:lang w:val="id-ID"/>
+        </w:rPr>
+        <w:t xml:space="preserve"> is taken by a wrong column with higher confidence: P = 0.50, R = 0.60, F1 = 0.55. R@|GT| is a ranking metric that needs |GT|; the threshold-free scores reflect the decisions a deployed matcher would output.</w:t>
+      </w:r>
+    </w:p>
+    <w:p>
+      <w:pPr>
+        <w:pStyle w:val="Text"/>
+        <w:ind w:firstLine="709" w:end="0"/>
+        <w:rPr>
+          <w:sz w:val="22"/>
+          <w:szCs w:val="22"/>
+          <w:lang w:val="id-ID"/>
+        </w:rPr>
+      </w:pPr>
+      <w:r>
+        <w:rPr>
+          <w:sz w:val="22"/>
+          <w:szCs w:val="22"/>
+          <w:lang w:val="id-ID"/>
+        </w:rPr>
+        <w:t xml:space="preserve">The table pair is the unit of analysis. Differences are computed from unrounded per-table values and reported with 95% bootstrap confidence intervals (10,000 resamples) and Wilcoxon signed-rank tests. The confirmatory analysis is limited to the pre-registered family of two hypotheses on confirm18 with Qwen3-8B and R@|GT|: H1, primary &gt; llm-full, and H2, primary &gt; union, tested one-sided with Holm correction. All other tests, including every GLM result, pooled sets and the correspondence-level analysis (cluster bootstrap and cluster sign-flip permutation over tables), are exploratory and uncorrected.</w:t>
+      </w:r>
+    </w:p>
+    <w:p>
+      <w:pPr>
+        <w:pStyle w:val="Text"/>
+        <w:ind w:firstLine="709" w:end="0"/>
+        <w:rPr>
+          <w:sz w:val="22"/>
+          <w:szCs w:val="22"/>
+          <w:lang w:val="id-ID"/>
+        </w:rPr>
+      </w:pPr>
+      <w:r>
+        <w:rPr>
+          <w:sz w:val="22"/>
+          <w:szCs w:val="22"/>
+          <w:lang w:val="id-ID"/>
+        </w:rPr>
+        <w:t xml:space="preserve">The pre-registration (configurations, hypotheses, metric, tests and the SHA-256 hashes of the confirm18 gold files) was written on 27 October 2026 before any matcher was run on confirm18, and the run script refuses to execute if the hashes differ. It was not deposited with an external registry, so its timing cannot be verified independently; we follow the practice recommended in [26] and release it with the code. Data and code availability: table and column names with types, gold annotations, guidelines, prompts, parser, cached model responses, pre-registration and statistics scripts are available at [repository URL, commit hash]; source dumps are not redistributed.</w:t>
       </w:r>
     </w:p>
     <w:p>
@@ -4707,7 +4891,7 @@
           <w:sz w:val="22"/>
           <w:szCs w:val="22"/>
         </w:rPr>
-        <w:t xml:space="preserve">Table 3 compares schema-only matchers on the small target. On the control pair, where names are nearly identical across two academic systems, every method reaches about 0.86. With abbreviations on one side (Khanza to the civil-registry export format SIAK or to OpenSID), classic matchers lose 30–40 points against the LLM. When abbreviation is combined with a language switch (Khanza to FHIR), COMA drops to 0.15 while the LLM keeps 0.53. This hardest group is the subject of the remaining experiments.</w:t>
+        <w:t xml:space="preserve">Table 3 compares schema-only matchers on the small target. On the control pair, where names are nearly identical across two academic systems, every method reaches about 0.86. With abbreviations on one side (Khanza to the civil-registry export format SIAK or to OpenSID), classic matchers lose 30–40 points against the LLM, and when abbreviation is combined with a language switch (Khanza to FHIR), COMA drops to 0.15 while the LLM keeps 0.53.</w:t>
       </w:r>
     </w:p>
     <w:p>
@@ -5736,7 +5920,7 @@
           <w:sz w:val="22"/>
           <w:szCs w:val="22"/>
         </w:rPr>
-        <w:t xml:space="preserve">On the 14 Khanza→FHIR pairs with the correct resource given, the abbreviation dictionary raises the hybrid matcher by 14.1 points (k = 5, CI [7, 22], p = 0.008) and the embedding retriever by 8.3 points, and bge-m3 recall@10 rises from 0.58 to 0.69. It has no effect on llm-full (−0.9, p = 0.59), which already reads Khanza abbreviations. The hybrid stays below llm-full (−28.4 points without the dictionary, p = 0.002); its best variant (k = 10 with dictionary) only matches llm-full while using 3.5–4 times as many prompt tokens. On a small target, the full prompt fits and retrieval adds cost without adding accuracy.</w:t>
+        <w:t xml:space="preserve">On the 14 Khanza→FHIR pairs with the correct resource given, the dictionary raises the hybrid matcher by 14.1 points (k = 5, CI [7, 22], p = 0.008) and the embedding retriever by 8.3 points, but has no effect on llm-full (−0.9, p = 0.59), which already reads Khanza abbreviations. The hybrid stays below llm-full (−28.4 points without the dictionary, p = 0.002); its best variant only matches llm-full while using 3.5–4 times as many prompt tokens.</w:t>
       </w:r>
     </w:p>
     <w:p>
@@ -5776,7 +5960,7 @@
           <w:sz w:val="22"/>
           <w:szCs w:val="22"/>
         </w:rPr>
-        <w:t xml:space="preserve">Replacing the correct resource with the 289-element union roughly halves accuracy: on the first 15 development pairs, llm-full with dictionary falls from 0.55 to 0.35 and the hybrid to 0.18. Retrieval becomes the bottleneck, as bge-m3 recall@10 drops to 0.40, and 54–59% of llm-full predictions fall into a resource other than the gold one. Table 4 shows the main result on the large target.</w:t>
+        <w:t xml:space="preserve">Replacing the correct resource with the 289-element union lowers recall sharply. On the first 15 development tables, llm-full with dictionary falls from 0.55 to 0.35 and the hybrid to 0.18, because bge-m3 recall@10 drops to 0.40; 54–59% of llm-full predictions fall into a resource other than the gold one. Table 4 shows the main result.</w:t>
       </w:r>
     </w:p>
     <w:p>
@@ -6646,7 +6830,7 @@
           <w:szCs w:val="22"/>
           <w:lang w:val="id-ID"/>
         </w:rPr>
-        <w:t xml:space="preserve">Table 5 Primary minus llm-full in R@|GT| points [95% CI], with Wilcoxon p (Qwen confirm18: pre-registered one-sided test, Holm-corrected)</w:t>
+        <w:t xml:space="preserve">Table 5 Primary minus llm-full in R@|GT| points [95% CI] from unrounded values, with Wilcoxon p; only the Qwen confirm18 test is confirmatory (one-sided, Holm-corrected)</w:t>
       </w:r>
     </w:p>
     <w:tbl>
@@ -7016,7 +7200,7 @@
           <w:sz w:val="22"/>
           <w:szCs w:val="22"/>
         </w:rPr>
-        <w:t xml:space="preserve">Restricting stage 2 to one resource is the effective ingredient. The union variant already halves the prompt, but its gain over llm-full is modest for Qwen (+6.8 points on dev41) and vanishes for the stronger GLM (+2.5 on dev41, −1.6 on confirm18). The primary variant adds 7–10 points on top of union for both models (GLM pooled: +9.9, p = 0.009). The gain is not uniform across resources (Table 6). It is largest where the referenced-resource problem of Section 3.3 is strongest, such as MedicationRequest, Organization and, for GLM, ServiceRequest. It is negative where the rank-1 choice is often wrong, such as Practitioner for Qwen, whose stage 1 ranks Patient first for staff tables, and Location for GLM.</w:t>
+        <w:t xml:space="preserve">Table 6 confirms the pattern with threshold-free decisions. With both models, the primary variant has higher precision and higher recall than llm-full, so the gain is not an artefact of ranking with knowledge of |GT|. The same holds on confirm18 (Qwen F1 0.435 → 0.520, GLM 0.569 → 0.669).</w:t>
       </w:r>
     </w:p>
     <w:p>
@@ -7036,7 +7220,1618 @@
           <w:szCs w:val="22"/>
           <w:lang w:val="id-ID"/>
         </w:rPr>
-        <w:t xml:space="preserve">Table 6 R@|GT| per FHIR resource on all 59 tables (n = tables)</w:t>
+        <w:t xml:space="preserve">Table 6 Threshold-free precision, recall and F1 on dev41 (greedy one-to-one assignment, n:1-neutral)</w:t>
+      </w:r>
+    </w:p>
+    <w:tbl>
+      <w:tblPr>
+        <w:tblW w:w="8504" w:type="dxa"/>
+        <w:jc w:val="center"/>
+        <w:tblLayout w:type="fixed"/>
+        <w:tblCellMar>
+          <w:start w:w="80" w:type="dxa"/>
+          <w:end w:w="80" w:type="dxa"/>
+        </w:tblCellMar>
+      </w:tblPr>
+      <w:tblGrid>
+        <w:gridCol w:w="2704"/>
+        <w:gridCol w:w="1016"/>
+        <w:gridCol w:w="1016"/>
+        <w:gridCol w:w="1312"/>
+        <w:gridCol w:w="720"/>
+        <w:gridCol w:w="720"/>
+        <w:gridCol w:w="1016"/>
+      </w:tblGrid>
+      <w:tr>
+        <w:trPr>
+          <w:cantSplit/>
+          <w:tblHeader/>
+        </w:trPr>
+        <w:tc>
+          <w:tcPr>
+            <w:tcW w:w="2704" w:type="dxa"/>
+            <w:tcBorders>
+              <w:top w:val="single" w:sz="4" w:space="0" w:color="000000"/>
+              <w:start w:val="single" w:sz="4" w:space="0" w:color="000000"/>
+              <w:bottom w:val="single" w:sz="4" w:space="0" w:color="000000"/>
+              <w:end w:val="single" w:sz="4" w:space="0" w:color="000000"/>
+            </w:tcBorders>
+          </w:tcPr>
+          <w:p>
+            <w:pPr>
+              <w:keepNext/>
+              <w:spacing w:before="0" w:after="0"/>
+              <w:jc w:val="left"/>
+            </w:pPr>
+            <w:r>
+              <w:rPr>
+                <w:rFonts w:ascii="Times New Roman" w:hAnsi="Times New Roman"/>
+                <w:sz w:val="18"/>
+                <w:szCs w:val="18"/>
+              </w:rPr>
+              <w:t xml:space="preserve">Configuration</w:t>
+            </w:r>
+          </w:p>
+        </w:tc>
+        <w:tc>
+          <w:tcPr>
+            <w:tcW w:w="1016" w:type="dxa"/>
+            <w:tcBorders>
+              <w:top w:val="single" w:sz="4" w:space="0" w:color="000000"/>
+              <w:start w:val="single" w:sz="4" w:space="0" w:color="000000"/>
+              <w:bottom w:val="single" w:sz="4" w:space="0" w:color="000000"/>
+              <w:end w:val="single" w:sz="4" w:space="0" w:color="000000"/>
+            </w:tcBorders>
+          </w:tcPr>
+          <w:p>
+            <w:pPr>
+              <w:keepNext/>
+              <w:spacing w:before="0" w:after="0"/>
+              <w:jc w:val="center"/>
+            </w:pPr>
+            <w:r>
+              <w:rPr>
+                <w:rFonts w:ascii="Times New Roman" w:hAnsi="Times New Roman"/>
+                <w:sz w:val="18"/>
+                <w:szCs w:val="18"/>
+              </w:rPr>
+              <w:t xml:space="preserve">Qwen P</w:t>
+            </w:r>
+          </w:p>
+        </w:tc>
+        <w:tc>
+          <w:tcPr>
+            <w:tcW w:w="1016" w:type="dxa"/>
+            <w:tcBorders>
+              <w:top w:val="single" w:sz="4" w:space="0" w:color="000000"/>
+              <w:start w:val="single" w:sz="4" w:space="0" w:color="000000"/>
+              <w:bottom w:val="single" w:sz="4" w:space="0" w:color="000000"/>
+              <w:end w:val="single" w:sz="4" w:space="0" w:color="000000"/>
+            </w:tcBorders>
+          </w:tcPr>
+          <w:p>
+            <w:pPr>
+              <w:keepNext/>
+              <w:spacing w:before="0" w:after="0"/>
+              <w:jc w:val="center"/>
+            </w:pPr>
+            <w:r>
+              <w:rPr>
+                <w:rFonts w:ascii="Times New Roman" w:hAnsi="Times New Roman"/>
+                <w:sz w:val="18"/>
+                <w:szCs w:val="18"/>
+              </w:rPr>
+              <w:t xml:space="preserve">Qwen R</w:t>
+            </w:r>
+          </w:p>
+        </w:tc>
+        <w:tc>
+          <w:tcPr>
+            <w:tcW w:w="1312" w:type="dxa"/>
+            <w:tcBorders>
+              <w:top w:val="single" w:sz="4" w:space="0" w:color="000000"/>
+              <w:start w:val="single" w:sz="4" w:space="0" w:color="000000"/>
+              <w:bottom w:val="single" w:sz="4" w:space="0" w:color="000000"/>
+              <w:end w:val="single" w:sz="4" w:space="0" w:color="000000"/>
+            </w:tcBorders>
+          </w:tcPr>
+          <w:p>
+            <w:pPr>
+              <w:keepNext/>
+              <w:spacing w:before="0" w:after="0"/>
+              <w:jc w:val="center"/>
+            </w:pPr>
+            <w:r>
+              <w:rPr>
+                <w:rFonts w:ascii="Times New Roman" w:hAnsi="Times New Roman"/>
+                <w:sz w:val="18"/>
+                <w:szCs w:val="18"/>
+              </w:rPr>
+              <w:t xml:space="preserve">Qwen F1</w:t>
+            </w:r>
+          </w:p>
+        </w:tc>
+        <w:tc>
+          <w:tcPr>
+            <w:tcW w:w="720" w:type="dxa"/>
+            <w:tcBorders>
+              <w:top w:val="single" w:sz="4" w:space="0" w:color="000000"/>
+              <w:start w:val="single" w:sz="4" w:space="0" w:color="000000"/>
+              <w:bottom w:val="single" w:sz="4" w:space="0" w:color="000000"/>
+              <w:end w:val="single" w:sz="4" w:space="0" w:color="000000"/>
+            </w:tcBorders>
+          </w:tcPr>
+          <w:p>
+            <w:pPr>
+              <w:keepNext/>
+              <w:spacing w:before="0" w:after="0"/>
+              <w:jc w:val="center"/>
+            </w:pPr>
+            <w:r>
+              <w:rPr>
+                <w:rFonts w:ascii="Times New Roman" w:hAnsi="Times New Roman"/>
+                <w:sz w:val="18"/>
+                <w:szCs w:val="18"/>
+              </w:rPr>
+              <w:t xml:space="preserve">GLM P</w:t>
+            </w:r>
+          </w:p>
+        </w:tc>
+        <w:tc>
+          <w:tcPr>
+            <w:tcW w:w="720" w:type="dxa"/>
+            <w:tcBorders>
+              <w:top w:val="single" w:sz="4" w:space="0" w:color="000000"/>
+              <w:start w:val="single" w:sz="4" w:space="0" w:color="000000"/>
+              <w:bottom w:val="single" w:sz="4" w:space="0" w:color="000000"/>
+              <w:end w:val="single" w:sz="4" w:space="0" w:color="000000"/>
+            </w:tcBorders>
+          </w:tcPr>
+          <w:p>
+            <w:pPr>
+              <w:keepNext/>
+              <w:spacing w:before="0" w:after="0"/>
+              <w:jc w:val="center"/>
+            </w:pPr>
+            <w:r>
+              <w:rPr>
+                <w:rFonts w:ascii="Times New Roman" w:hAnsi="Times New Roman"/>
+                <w:sz w:val="18"/>
+                <w:szCs w:val="18"/>
+              </w:rPr>
+              <w:t xml:space="preserve">GLM R</w:t>
+            </w:r>
+          </w:p>
+        </w:tc>
+        <w:tc>
+          <w:tcPr>
+            <w:tcW w:w="1016" w:type="dxa"/>
+            <w:tcBorders>
+              <w:top w:val="single" w:sz="4" w:space="0" w:color="000000"/>
+              <w:start w:val="single" w:sz="4" w:space="0" w:color="000000"/>
+              <w:bottom w:val="single" w:sz="4" w:space="0" w:color="000000"/>
+              <w:end w:val="single" w:sz="4" w:space="0" w:color="000000"/>
+            </w:tcBorders>
+          </w:tcPr>
+          <w:p>
+            <w:pPr>
+              <w:keepNext/>
+              <w:spacing w:before="0" w:after="0"/>
+              <w:jc w:val="center"/>
+            </w:pPr>
+            <w:r>
+              <w:rPr>
+                <w:rFonts w:ascii="Times New Roman" w:hAnsi="Times New Roman"/>
+                <w:sz w:val="18"/>
+                <w:szCs w:val="18"/>
+              </w:rPr>
+              <w:t xml:space="preserve">GLM F1</w:t>
+            </w:r>
+          </w:p>
+        </w:tc>
+      </w:tr>
+      <w:tr>
+        <w:trPr>
+          <w:cantSplit/>
+        </w:trPr>
+        <w:tc>
+          <w:tcPr>
+            <w:tcW w:w="2704" w:type="dxa"/>
+            <w:tcBorders>
+              <w:top w:val="single" w:sz="4" w:space="0" w:color="000000"/>
+              <w:start w:val="single" w:sz="4" w:space="0" w:color="000000"/>
+              <w:bottom w:val="single" w:sz="4" w:space="0" w:color="000000"/>
+              <w:end w:val="single" w:sz="4" w:space="0" w:color="000000"/>
+            </w:tcBorders>
+          </w:tcPr>
+          <w:p>
+            <w:pPr>
+              <w:keepNext/>
+              <w:spacing w:before="0" w:after="0"/>
+              <w:jc w:val="left"/>
+            </w:pPr>
+            <w:r>
+              <w:rPr>
+                <w:rFonts w:ascii="Times New Roman" w:hAnsi="Times New Roman"/>
+                <w:sz w:val="18"/>
+                <w:szCs w:val="18"/>
+              </w:rPr>
+              <w:t xml:space="preserve">llm-full</w:t>
+            </w:r>
+          </w:p>
+        </w:tc>
+        <w:tc>
+          <w:tcPr>
+            <w:tcW w:w="1016" w:type="dxa"/>
+            <w:tcBorders>
+              <w:top w:val="single" w:sz="4" w:space="0" w:color="000000"/>
+              <w:start w:val="single" w:sz="4" w:space="0" w:color="000000"/>
+              <w:bottom w:val="single" w:sz="4" w:space="0" w:color="000000"/>
+              <w:end w:val="single" w:sz="4" w:space="0" w:color="000000"/>
+            </w:tcBorders>
+          </w:tcPr>
+          <w:p>
+            <w:pPr>
+              <w:keepNext/>
+              <w:spacing w:before="0" w:after="0"/>
+              <w:jc w:val="center"/>
+            </w:pPr>
+            <w:r>
+              <w:rPr>
+                <w:rFonts w:ascii="Times New Roman" w:hAnsi="Times New Roman"/>
+                <w:sz w:val="18"/>
+                <w:szCs w:val="18"/>
+              </w:rPr>
+              <w:t xml:space="preserve">0.237</w:t>
+            </w:r>
+          </w:p>
+        </w:tc>
+        <w:tc>
+          <w:tcPr>
+            <w:tcW w:w="1016" w:type="dxa"/>
+            <w:tcBorders>
+              <w:top w:val="single" w:sz="4" w:space="0" w:color="000000"/>
+              <w:start w:val="single" w:sz="4" w:space="0" w:color="000000"/>
+              <w:bottom w:val="single" w:sz="4" w:space="0" w:color="000000"/>
+              <w:end w:val="single" w:sz="4" w:space="0" w:color="000000"/>
+            </w:tcBorders>
+          </w:tcPr>
+          <w:p>
+            <w:pPr>
+              <w:keepNext/>
+              <w:spacing w:before="0" w:after="0"/>
+              <w:jc w:val="center"/>
+            </w:pPr>
+            <w:r>
+              <w:rPr>
+                <w:rFonts w:ascii="Times New Roman" w:hAnsi="Times New Roman"/>
+                <w:sz w:val="18"/>
+                <w:szCs w:val="18"/>
+              </w:rPr>
+              <w:t xml:space="preserve">0.302</w:t>
+            </w:r>
+          </w:p>
+        </w:tc>
+        <w:tc>
+          <w:tcPr>
+            <w:tcW w:w="1312" w:type="dxa"/>
+            <w:tcBorders>
+              <w:top w:val="single" w:sz="4" w:space="0" w:color="000000"/>
+              <w:start w:val="single" w:sz="4" w:space="0" w:color="000000"/>
+              <w:bottom w:val="single" w:sz="4" w:space="0" w:color="000000"/>
+              <w:end w:val="single" w:sz="4" w:space="0" w:color="000000"/>
+            </w:tcBorders>
+          </w:tcPr>
+          <w:p>
+            <w:pPr>
+              <w:keepNext/>
+              <w:spacing w:before="0" w:after="0"/>
+              <w:jc w:val="center"/>
+            </w:pPr>
+            <w:r>
+              <w:rPr>
+                <w:rFonts w:ascii="Times New Roman" w:hAnsi="Times New Roman"/>
+                <w:sz w:val="18"/>
+                <w:szCs w:val="18"/>
+              </w:rPr>
+              <w:t xml:space="preserve">0.258</w:t>
+            </w:r>
+          </w:p>
+        </w:tc>
+        <w:tc>
+          <w:tcPr>
+            <w:tcW w:w="720" w:type="dxa"/>
+            <w:tcBorders>
+              <w:top w:val="single" w:sz="4" w:space="0" w:color="000000"/>
+              <w:start w:val="single" w:sz="4" w:space="0" w:color="000000"/>
+              <w:bottom w:val="single" w:sz="4" w:space="0" w:color="000000"/>
+              <w:end w:val="single" w:sz="4" w:space="0" w:color="000000"/>
+            </w:tcBorders>
+          </w:tcPr>
+          <w:p>
+            <w:pPr>
+              <w:keepNext/>
+              <w:spacing w:before="0" w:after="0"/>
+              <w:jc w:val="center"/>
+            </w:pPr>
+            <w:r>
+              <w:rPr>
+                <w:rFonts w:ascii="Times New Roman" w:hAnsi="Times New Roman"/>
+                <w:sz w:val="18"/>
+                <w:szCs w:val="18"/>
+              </w:rPr>
+              <w:t xml:space="preserve">0.448</w:t>
+            </w:r>
+          </w:p>
+        </w:tc>
+        <w:tc>
+          <w:tcPr>
+            <w:tcW w:w="720" w:type="dxa"/>
+            <w:tcBorders>
+              <w:top w:val="single" w:sz="4" w:space="0" w:color="000000"/>
+              <w:start w:val="single" w:sz="4" w:space="0" w:color="000000"/>
+              <w:bottom w:val="single" w:sz="4" w:space="0" w:color="000000"/>
+              <w:end w:val="single" w:sz="4" w:space="0" w:color="000000"/>
+            </w:tcBorders>
+          </w:tcPr>
+          <w:p>
+            <w:pPr>
+              <w:keepNext/>
+              <w:spacing w:before="0" w:after="0"/>
+              <w:jc w:val="center"/>
+            </w:pPr>
+            <w:r>
+              <w:rPr>
+                <w:rFonts w:ascii="Times New Roman" w:hAnsi="Times New Roman"/>
+                <w:sz w:val="18"/>
+                <w:szCs w:val="18"/>
+              </w:rPr>
+              <w:t xml:space="preserve">0.588</w:t>
+            </w:r>
+          </w:p>
+        </w:tc>
+        <w:tc>
+          <w:tcPr>
+            <w:tcW w:w="1016" w:type="dxa"/>
+            <w:tcBorders>
+              <w:top w:val="single" w:sz="4" w:space="0" w:color="000000"/>
+              <w:start w:val="single" w:sz="4" w:space="0" w:color="000000"/>
+              <w:bottom w:val="single" w:sz="4" w:space="0" w:color="000000"/>
+              <w:end w:val="single" w:sz="4" w:space="0" w:color="000000"/>
+            </w:tcBorders>
+          </w:tcPr>
+          <w:p>
+            <w:pPr>
+              <w:keepNext/>
+              <w:spacing w:before="0" w:after="0"/>
+              <w:jc w:val="center"/>
+            </w:pPr>
+            <w:r>
+              <w:rPr>
+                <w:rFonts w:ascii="Times New Roman" w:hAnsi="Times New Roman"/>
+                <w:sz w:val="18"/>
+                <w:szCs w:val="18"/>
+              </w:rPr>
+              <w:t xml:space="preserve">0.497</w:t>
+            </w:r>
+          </w:p>
+        </w:tc>
+      </w:tr>
+      <w:tr>
+        <w:trPr>
+          <w:cantSplit/>
+        </w:trPr>
+        <w:tc>
+          <w:tcPr>
+            <w:tcW w:w="2704" w:type="dxa"/>
+            <w:tcBorders>
+              <w:top w:val="single" w:sz="4" w:space="0" w:color="000000"/>
+              <w:start w:val="single" w:sz="4" w:space="0" w:color="000000"/>
+              <w:bottom w:val="single" w:sz="4" w:space="0" w:color="000000"/>
+              <w:end w:val="single" w:sz="4" w:space="0" w:color="000000"/>
+            </w:tcBorders>
+          </w:tcPr>
+          <w:p>
+            <w:pPr>
+              <w:keepNext/>
+              <w:spacing w:before="0" w:after="0"/>
+              <w:jc w:val="left"/>
+            </w:pPr>
+            <w:r>
+              <w:rPr>
+                <w:rFonts w:ascii="Times New Roman" w:hAnsi="Times New Roman"/>
+                <w:sz w:val="18"/>
+                <w:szCs w:val="18"/>
+              </w:rPr>
+              <w:t xml:space="preserve">two-stage union</w:t>
+            </w:r>
+          </w:p>
+        </w:tc>
+        <w:tc>
+          <w:tcPr>
+            <w:tcW w:w="1016" w:type="dxa"/>
+            <w:tcBorders>
+              <w:top w:val="single" w:sz="4" w:space="0" w:color="000000"/>
+              <w:start w:val="single" w:sz="4" w:space="0" w:color="000000"/>
+              <w:bottom w:val="single" w:sz="4" w:space="0" w:color="000000"/>
+              <w:end w:val="single" w:sz="4" w:space="0" w:color="000000"/>
+            </w:tcBorders>
+          </w:tcPr>
+          <w:p>
+            <w:pPr>
+              <w:keepNext/>
+              <w:spacing w:before="0" w:after="0"/>
+              <w:jc w:val="center"/>
+            </w:pPr>
+            <w:r>
+              <w:rPr>
+                <w:rFonts w:ascii="Times New Roman" w:hAnsi="Times New Roman"/>
+                <w:sz w:val="18"/>
+                <w:szCs w:val="18"/>
+              </w:rPr>
+              <w:t xml:space="preserve">0.270</w:t>
+            </w:r>
+          </w:p>
+        </w:tc>
+        <w:tc>
+          <w:tcPr>
+            <w:tcW w:w="1016" w:type="dxa"/>
+            <w:tcBorders>
+              <w:top w:val="single" w:sz="4" w:space="0" w:color="000000"/>
+              <w:start w:val="single" w:sz="4" w:space="0" w:color="000000"/>
+              <w:bottom w:val="single" w:sz="4" w:space="0" w:color="000000"/>
+              <w:end w:val="single" w:sz="4" w:space="0" w:color="000000"/>
+            </w:tcBorders>
+          </w:tcPr>
+          <w:p>
+            <w:pPr>
+              <w:keepNext/>
+              <w:spacing w:before="0" w:after="0"/>
+              <w:jc w:val="center"/>
+            </w:pPr>
+            <w:r>
+              <w:rPr>
+                <w:rFonts w:ascii="Times New Roman" w:hAnsi="Times New Roman"/>
+                <w:sz w:val="18"/>
+                <w:szCs w:val="18"/>
+              </w:rPr>
+              <w:t xml:space="preserve">0.350</w:t>
+            </w:r>
+          </w:p>
+        </w:tc>
+        <w:tc>
+          <w:tcPr>
+            <w:tcW w:w="1312" w:type="dxa"/>
+            <w:tcBorders>
+              <w:top w:val="single" w:sz="4" w:space="0" w:color="000000"/>
+              <w:start w:val="single" w:sz="4" w:space="0" w:color="000000"/>
+              <w:bottom w:val="single" w:sz="4" w:space="0" w:color="000000"/>
+              <w:end w:val="single" w:sz="4" w:space="0" w:color="000000"/>
+            </w:tcBorders>
+          </w:tcPr>
+          <w:p>
+            <w:pPr>
+              <w:keepNext/>
+              <w:spacing w:before="0" w:after="0"/>
+              <w:jc w:val="center"/>
+            </w:pPr>
+            <w:r>
+              <w:rPr>
+                <w:rFonts w:ascii="Times New Roman" w:hAnsi="Times New Roman"/>
+                <w:sz w:val="18"/>
+                <w:szCs w:val="18"/>
+              </w:rPr>
+              <w:t xml:space="preserve">0.299</w:t>
+            </w:r>
+          </w:p>
+        </w:tc>
+        <w:tc>
+          <w:tcPr>
+            <w:tcW w:w="720" w:type="dxa"/>
+            <w:tcBorders>
+              <w:top w:val="single" w:sz="4" w:space="0" w:color="000000"/>
+              <w:start w:val="single" w:sz="4" w:space="0" w:color="000000"/>
+              <w:bottom w:val="single" w:sz="4" w:space="0" w:color="000000"/>
+              <w:end w:val="single" w:sz="4" w:space="0" w:color="000000"/>
+            </w:tcBorders>
+          </w:tcPr>
+          <w:p>
+            <w:pPr>
+              <w:keepNext/>
+              <w:spacing w:before="0" w:after="0"/>
+              <w:jc w:val="center"/>
+            </w:pPr>
+            <w:r>
+              <w:rPr>
+                <w:rFonts w:ascii="Times New Roman" w:hAnsi="Times New Roman"/>
+                <w:sz w:val="18"/>
+                <w:szCs w:val="18"/>
+              </w:rPr>
+              <w:t xml:space="preserve">0.524</w:t>
+            </w:r>
+          </w:p>
+        </w:tc>
+        <w:tc>
+          <w:tcPr>
+            <w:tcW w:w="720" w:type="dxa"/>
+            <w:tcBorders>
+              <w:top w:val="single" w:sz="4" w:space="0" w:color="000000"/>
+              <w:start w:val="single" w:sz="4" w:space="0" w:color="000000"/>
+              <w:bottom w:val="single" w:sz="4" w:space="0" w:color="000000"/>
+              <w:end w:val="single" w:sz="4" w:space="0" w:color="000000"/>
+            </w:tcBorders>
+          </w:tcPr>
+          <w:p>
+            <w:pPr>
+              <w:keepNext/>
+              <w:spacing w:before="0" w:after="0"/>
+              <w:jc w:val="center"/>
+            </w:pPr>
+            <w:r>
+              <w:rPr>
+                <w:rFonts w:ascii="Times New Roman" w:hAnsi="Times New Roman"/>
+                <w:sz w:val="18"/>
+                <w:szCs w:val="18"/>
+              </w:rPr>
+              <w:t xml:space="preserve">0.612</w:t>
+            </w:r>
+          </w:p>
+        </w:tc>
+        <w:tc>
+          <w:tcPr>
+            <w:tcW w:w="1016" w:type="dxa"/>
+            <w:tcBorders>
+              <w:top w:val="single" w:sz="4" w:space="0" w:color="000000"/>
+              <w:start w:val="single" w:sz="4" w:space="0" w:color="000000"/>
+              <w:bottom w:val="single" w:sz="4" w:space="0" w:color="000000"/>
+              <w:end w:val="single" w:sz="4" w:space="0" w:color="000000"/>
+            </w:tcBorders>
+          </w:tcPr>
+          <w:p>
+            <w:pPr>
+              <w:keepNext/>
+              <w:spacing w:before="0" w:after="0"/>
+              <w:jc w:val="center"/>
+            </w:pPr>
+            <w:r>
+              <w:rPr>
+                <w:rFonts w:ascii="Times New Roman" w:hAnsi="Times New Roman"/>
+                <w:sz w:val="18"/>
+                <w:szCs w:val="18"/>
+              </w:rPr>
+              <w:t xml:space="preserve">0.557</w:t>
+            </w:r>
+          </w:p>
+        </w:tc>
+      </w:tr>
+      <w:tr>
+        <w:trPr>
+          <w:cantSplit/>
+        </w:trPr>
+        <w:tc>
+          <w:tcPr>
+            <w:tcW w:w="2704" w:type="dxa"/>
+            <w:tcBorders>
+              <w:top w:val="single" w:sz="4" w:space="0" w:color="000000"/>
+              <w:start w:val="single" w:sz="4" w:space="0" w:color="000000"/>
+              <w:bottom w:val="single" w:sz="4" w:space="0" w:color="000000"/>
+              <w:end w:val="single" w:sz="4" w:space="0" w:color="000000"/>
+            </w:tcBorders>
+          </w:tcPr>
+          <w:p>
+            <w:pPr>
+              <w:keepNext/>
+              <w:spacing w:before="0" w:after="0"/>
+              <w:jc w:val="left"/>
+            </w:pPr>
+            <w:r>
+              <w:rPr>
+                <w:rFonts w:ascii="Times New Roman" w:hAnsi="Times New Roman"/>
+                <w:sz w:val="18"/>
+                <w:szCs w:val="18"/>
+              </w:rPr>
+              <w:t xml:space="preserve">two-stage primary</w:t>
+            </w:r>
+          </w:p>
+        </w:tc>
+        <w:tc>
+          <w:tcPr>
+            <w:tcW w:w="1016" w:type="dxa"/>
+            <w:tcBorders>
+              <w:top w:val="single" w:sz="4" w:space="0" w:color="000000"/>
+              <w:start w:val="single" w:sz="4" w:space="0" w:color="000000"/>
+              <w:bottom w:val="single" w:sz="4" w:space="0" w:color="000000"/>
+              <w:end w:val="single" w:sz="4" w:space="0" w:color="000000"/>
+            </w:tcBorders>
+          </w:tcPr>
+          <w:p>
+            <w:pPr>
+              <w:keepNext/>
+              <w:spacing w:before="0" w:after="0"/>
+              <w:jc w:val="center"/>
+            </w:pPr>
+            <w:r>
+              <w:rPr>
+                <w:rFonts w:ascii="Times New Roman" w:hAnsi="Times New Roman"/>
+                <w:sz w:val="18"/>
+                <w:szCs w:val="18"/>
+              </w:rPr>
+              <w:t xml:space="preserve">0.357</w:t>
+            </w:r>
+          </w:p>
+        </w:tc>
+        <w:tc>
+          <w:tcPr>
+            <w:tcW w:w="1016" w:type="dxa"/>
+            <w:tcBorders>
+              <w:top w:val="single" w:sz="4" w:space="0" w:color="000000"/>
+              <w:start w:val="single" w:sz="4" w:space="0" w:color="000000"/>
+              <w:bottom w:val="single" w:sz="4" w:space="0" w:color="000000"/>
+              <w:end w:val="single" w:sz="4" w:space="0" w:color="000000"/>
+            </w:tcBorders>
+          </w:tcPr>
+          <w:p>
+            <w:pPr>
+              <w:keepNext/>
+              <w:spacing w:before="0" w:after="0"/>
+              <w:jc w:val="center"/>
+            </w:pPr>
+            <w:r>
+              <w:rPr>
+                <w:rFonts w:ascii="Times New Roman" w:hAnsi="Times New Roman"/>
+                <w:sz w:val="18"/>
+                <w:szCs w:val="18"/>
+              </w:rPr>
+              <w:t xml:space="preserve">0.446</w:t>
+            </w:r>
+          </w:p>
+        </w:tc>
+        <w:tc>
+          <w:tcPr>
+            <w:tcW w:w="1312" w:type="dxa"/>
+            <w:tcBorders>
+              <w:top w:val="single" w:sz="4" w:space="0" w:color="000000"/>
+              <w:start w:val="single" w:sz="4" w:space="0" w:color="000000"/>
+              <w:bottom w:val="single" w:sz="4" w:space="0" w:color="000000"/>
+              <w:end w:val="single" w:sz="4" w:space="0" w:color="000000"/>
+            </w:tcBorders>
+          </w:tcPr>
+          <w:p>
+            <w:pPr>
+              <w:keepNext/>
+              <w:spacing w:before="0" w:after="0"/>
+              <w:jc w:val="center"/>
+            </w:pPr>
+            <w:r>
+              <w:rPr>
+                <w:rFonts w:ascii="Times New Roman" w:hAnsi="Times New Roman"/>
+                <w:sz w:val="18"/>
+                <w:szCs w:val="18"/>
+              </w:rPr>
+              <w:t xml:space="preserve">0.389</w:t>
+            </w:r>
+          </w:p>
+        </w:tc>
+        <w:tc>
+          <w:tcPr>
+            <w:tcW w:w="720" w:type="dxa"/>
+            <w:tcBorders>
+              <w:top w:val="single" w:sz="4" w:space="0" w:color="000000"/>
+              <w:start w:val="single" w:sz="4" w:space="0" w:color="000000"/>
+              <w:bottom w:val="single" w:sz="4" w:space="0" w:color="000000"/>
+              <w:end w:val="single" w:sz="4" w:space="0" w:color="000000"/>
+            </w:tcBorders>
+          </w:tcPr>
+          <w:p>
+            <w:pPr>
+              <w:keepNext/>
+              <w:spacing w:before="0" w:after="0"/>
+              <w:jc w:val="center"/>
+            </w:pPr>
+            <w:r>
+              <w:rPr>
+                <w:rFonts w:ascii="Times New Roman" w:hAnsi="Times New Roman"/>
+                <w:sz w:val="18"/>
+                <w:szCs w:val="18"/>
+              </w:rPr>
+              <w:t xml:space="preserve">0.624</w:t>
+            </w:r>
+          </w:p>
+        </w:tc>
+        <w:tc>
+          <w:tcPr>
+            <w:tcW w:w="720" w:type="dxa"/>
+            <w:tcBorders>
+              <w:top w:val="single" w:sz="4" w:space="0" w:color="000000"/>
+              <w:start w:val="single" w:sz="4" w:space="0" w:color="000000"/>
+              <w:bottom w:val="single" w:sz="4" w:space="0" w:color="000000"/>
+              <w:end w:val="single" w:sz="4" w:space="0" w:color="000000"/>
+            </w:tcBorders>
+          </w:tcPr>
+          <w:p>
+            <w:pPr>
+              <w:keepNext/>
+              <w:spacing w:before="0" w:after="0"/>
+              <w:jc w:val="center"/>
+            </w:pPr>
+            <w:r>
+              <w:rPr>
+                <w:rFonts w:ascii="Times New Roman" w:hAnsi="Times New Roman"/>
+                <w:sz w:val="18"/>
+                <w:szCs w:val="18"/>
+              </w:rPr>
+              <w:t xml:space="preserve">0.705</w:t>
+            </w:r>
+          </w:p>
+        </w:tc>
+        <w:tc>
+          <w:tcPr>
+            <w:tcW w:w="1016" w:type="dxa"/>
+            <w:tcBorders>
+              <w:top w:val="single" w:sz="4" w:space="0" w:color="000000"/>
+              <w:start w:val="single" w:sz="4" w:space="0" w:color="000000"/>
+              <w:bottom w:val="single" w:sz="4" w:space="0" w:color="000000"/>
+              <w:end w:val="single" w:sz="4" w:space="0" w:color="000000"/>
+            </w:tcBorders>
+          </w:tcPr>
+          <w:p>
+            <w:pPr>
+              <w:keepNext/>
+              <w:spacing w:before="0" w:after="0"/>
+              <w:jc w:val="center"/>
+            </w:pPr>
+            <w:r>
+              <w:rPr>
+                <w:rFonts w:ascii="Times New Roman" w:hAnsi="Times New Roman"/>
+                <w:sz w:val="18"/>
+                <w:szCs w:val="18"/>
+              </w:rPr>
+              <w:t xml:space="preserve">0.653</w:t>
+            </w:r>
+          </w:p>
+        </w:tc>
+      </w:tr>
+      <w:tr>
+        <w:trPr>
+          <w:cantSplit/>
+        </w:trPr>
+        <w:tc>
+          <w:tcPr>
+            <w:tcW w:w="2704" w:type="dxa"/>
+            <w:tcBorders>
+              <w:top w:val="single" w:sz="4" w:space="0" w:color="000000"/>
+              <w:start w:val="single" w:sz="4" w:space="0" w:color="000000"/>
+              <w:bottom w:val="single" w:sz="4" w:space="0" w:color="000000"/>
+              <w:end w:val="single" w:sz="4" w:space="0" w:color="000000"/>
+            </w:tcBorders>
+          </w:tcPr>
+          <w:p>
+            <w:pPr>
+              <w:spacing w:before="0" w:after="0"/>
+              <w:jc w:val="left"/>
+            </w:pPr>
+            <w:r>
+              <w:rPr>
+                <w:rFonts w:ascii="Times New Roman" w:hAnsi="Times New Roman"/>
+                <w:sz w:val="18"/>
+                <w:szCs w:val="18"/>
+              </w:rPr>
+              <w:t xml:space="preserve">oracle</w:t>
+            </w:r>
+          </w:p>
+        </w:tc>
+        <w:tc>
+          <w:tcPr>
+            <w:tcW w:w="1016" w:type="dxa"/>
+            <w:tcBorders>
+              <w:top w:val="single" w:sz="4" w:space="0" w:color="000000"/>
+              <w:start w:val="single" w:sz="4" w:space="0" w:color="000000"/>
+              <w:bottom w:val="single" w:sz="4" w:space="0" w:color="000000"/>
+              <w:end w:val="single" w:sz="4" w:space="0" w:color="000000"/>
+            </w:tcBorders>
+          </w:tcPr>
+          <w:p>
+            <w:pPr>
+              <w:spacing w:before="0" w:after="0"/>
+              <w:jc w:val="center"/>
+            </w:pPr>
+            <w:r>
+              <w:rPr>
+                <w:rFonts w:ascii="Times New Roman" w:hAnsi="Times New Roman"/>
+                <w:sz w:val="18"/>
+                <w:szCs w:val="18"/>
+              </w:rPr>
+              <w:t xml:space="preserve">0.469</w:t>
+            </w:r>
+          </w:p>
+        </w:tc>
+        <w:tc>
+          <w:tcPr>
+            <w:tcW w:w="1016" w:type="dxa"/>
+            <w:tcBorders>
+              <w:top w:val="single" w:sz="4" w:space="0" w:color="000000"/>
+              <w:start w:val="single" w:sz="4" w:space="0" w:color="000000"/>
+              <w:bottom w:val="single" w:sz="4" w:space="0" w:color="000000"/>
+              <w:end w:val="single" w:sz="4" w:space="0" w:color="000000"/>
+            </w:tcBorders>
+          </w:tcPr>
+          <w:p>
+            <w:pPr>
+              <w:spacing w:before="0" w:after="0"/>
+              <w:jc w:val="center"/>
+            </w:pPr>
+            <w:r>
+              <w:rPr>
+                <w:rFonts w:ascii="Times New Roman" w:hAnsi="Times New Roman"/>
+                <w:sz w:val="18"/>
+                <w:szCs w:val="18"/>
+              </w:rPr>
+              <w:t xml:space="preserve">0.596</w:t>
+            </w:r>
+          </w:p>
+        </w:tc>
+        <w:tc>
+          <w:tcPr>
+            <w:tcW w:w="1312" w:type="dxa"/>
+            <w:tcBorders>
+              <w:top w:val="single" w:sz="4" w:space="0" w:color="000000"/>
+              <w:start w:val="single" w:sz="4" w:space="0" w:color="000000"/>
+              <w:bottom w:val="single" w:sz="4" w:space="0" w:color="000000"/>
+              <w:end w:val="single" w:sz="4" w:space="0" w:color="000000"/>
+            </w:tcBorders>
+          </w:tcPr>
+          <w:p>
+            <w:pPr>
+              <w:spacing w:before="0" w:after="0"/>
+              <w:jc w:val="center"/>
+            </w:pPr>
+            <w:r>
+              <w:rPr>
+                <w:rFonts w:ascii="Times New Roman" w:hAnsi="Times New Roman"/>
+                <w:sz w:val="18"/>
+                <w:szCs w:val="18"/>
+              </w:rPr>
+              <w:t xml:space="preserve">0.514</w:t>
+            </w:r>
+          </w:p>
+        </w:tc>
+        <w:tc>
+          <w:tcPr>
+            <w:tcW w:w="720" w:type="dxa"/>
+            <w:tcBorders>
+              <w:top w:val="single" w:sz="4" w:space="0" w:color="000000"/>
+              <w:start w:val="single" w:sz="4" w:space="0" w:color="000000"/>
+              <w:bottom w:val="single" w:sz="4" w:space="0" w:color="000000"/>
+              <w:end w:val="single" w:sz="4" w:space="0" w:color="000000"/>
+            </w:tcBorders>
+          </w:tcPr>
+          <w:p>
+            <w:pPr>
+              <w:spacing w:before="0" w:after="0"/>
+              <w:jc w:val="center"/>
+            </w:pPr>
+            <w:r>
+              <w:rPr>
+                <w:rFonts w:ascii="Times New Roman" w:hAnsi="Times New Roman"/>
+                <w:sz w:val="18"/>
+                <w:szCs w:val="18"/>
+              </w:rPr>
+              <w:t xml:space="preserve">0.684</w:t>
+            </w:r>
+          </w:p>
+        </w:tc>
+        <w:tc>
+          <w:tcPr>
+            <w:tcW w:w="720" w:type="dxa"/>
+            <w:tcBorders>
+              <w:top w:val="single" w:sz="4" w:space="0" w:color="000000"/>
+              <w:start w:val="single" w:sz="4" w:space="0" w:color="000000"/>
+              <w:bottom w:val="single" w:sz="4" w:space="0" w:color="000000"/>
+              <w:end w:val="single" w:sz="4" w:space="0" w:color="000000"/>
+            </w:tcBorders>
+          </w:tcPr>
+          <w:p>
+            <w:pPr>
+              <w:spacing w:before="0" w:after="0"/>
+              <w:jc w:val="center"/>
+            </w:pPr>
+            <w:r>
+              <w:rPr>
+                <w:rFonts w:ascii="Times New Roman" w:hAnsi="Times New Roman"/>
+                <w:sz w:val="18"/>
+                <w:szCs w:val="18"/>
+              </w:rPr>
+              <w:t xml:space="preserve">0.792</w:t>
+            </w:r>
+          </w:p>
+        </w:tc>
+        <w:tc>
+          <w:tcPr>
+            <w:tcW w:w="1016" w:type="dxa"/>
+            <w:tcBorders>
+              <w:top w:val="single" w:sz="4" w:space="0" w:color="000000"/>
+              <w:start w:val="single" w:sz="4" w:space="0" w:color="000000"/>
+              <w:bottom w:val="single" w:sz="4" w:space="0" w:color="000000"/>
+              <w:end w:val="single" w:sz="4" w:space="0" w:color="000000"/>
+            </w:tcBorders>
+          </w:tcPr>
+          <w:p>
+            <w:pPr>
+              <w:spacing w:before="0" w:after="0"/>
+              <w:jc w:val="center"/>
+            </w:pPr>
+            <w:r>
+              <w:rPr>
+                <w:rFonts w:ascii="Times New Roman" w:hAnsi="Times New Roman"/>
+                <w:sz w:val="18"/>
+                <w:szCs w:val="18"/>
+              </w:rPr>
+              <w:t xml:space="preserve">0.724</w:t>
+            </w:r>
+          </w:p>
+        </w:tc>
+      </w:tr>
+    </w:tbl>
+    <w:p>
+      <w:pPr>
+        <w:pStyle w:val="Text"/>
+        <w:ind w:hanging="0" w:end="0"/>
+        <w:rPr>
+          <w:sz w:val="22"/>
+          <w:szCs w:val="22"/>
+          <w:lang w:val="id-ID"/>
+        </w:rPr>
+      </w:pPr>
+    </w:p>
+    <w:p>
+      <w:pPr>
+        <w:pStyle w:val="Text"/>
+        <w:ind w:hanging="0" w:end="0"/>
+        <w:rPr>
+          <w:sz w:val="22"/>
+          <w:szCs w:val="22"/>
+          <w:lang w:val="id-ID"/>
+        </w:rPr>
+      </w:pPr>
+      <w:r>
+        <w:rPr>
+          <w:sz w:val="22"/>
+          <w:szCs w:val="22"/>
+        </w:rPr>
+        <w:t xml:space="preserve">Restricting stage 2 to one resource is the effective ingredient. The union variant already halves the prompt, but its gain over llm-full is modest for Qwen (+6.8 points on dev41) and vanishes for GLM (+2.5 on dev41, −1.6 on confirm18), while the primary variant adds 7–10 points on top of union for both models. We distinguish three levels of evidence. Across model families, the development-set effect replicates: no design choice was made with GLM, and its effect (+12.7) is close to Qwen's (+13.7). On held-out systems, the effect is directionally consistent but not statistically confirmed: the pre-registered H1 has one-sided p = 0.069 (Holm-corrected 0.138), H2 has Holm-corrected p = 0.17, and the GLM gain is smaller (+7.9, p = 0.36). Thirteen of the 18 held-out tables are ties, because these schemas are smaller and less abbreviated (33% against 58% of columns). We therefore do not claim that the gain generalises across systems. A correspondence-level analysis gives the same ordering but no additional power (pooled +10.2 points, CI [1.4, 19.3], p = 0.029).</w:t>
+      </w:r>
+    </w:p>
+    <w:p>
+      <w:pPr>
+        <w:pStyle w:val="Text"/>
+        <w:ind w:firstLine="709" w:end="0"/>
+        <w:rPr>
+          <w:sz w:val="22"/>
+          <w:szCs w:val="22"/>
+          <w:lang w:val="id-ID"/>
+        </w:rPr>
+      </w:pPr>
+      <w:r>
+        <w:rPr>
+          <w:sz w:val="22"/>
+          <w:szCs w:val="22"/>
+          <w:lang w:val="id-ID"/>
+        </w:rPr>
+        <w:t xml:space="preserve">GLM is more accurate than Qwen in every configuration, by 21–29 points on dev41 and by 3–15 points on the easier confirm18. Table 7 shows why the primary variant works and where it fails. When stage 1 ranks the correct resource first, the primary variant reaches 0.728 (Qwen) and 0.833 (GLM), above the oracle on the same tables; when it does not, the primary variant scores 0 by construction. The oracle is therefore not an upper bound: its prompt lists bare element names (</w:t>
+      </w:r>
+      <w:r>
+        <w:rPr>
+          <w:sz w:val="22"/>
+          <w:szCs w:val="22"/>
+          <w:lang w:val="id-ID"/>
+        </w:rPr>
+        <w:t xml:space="preserve">identifier</w:t>
+      </w:r>
+      <w:r>
+        <w:rPr>
+          <w:sz w:val="22"/>
+          <w:szCs w:val="22"/>
+          <w:lang w:val="id-ID"/>
+        </w:rPr>
+        <w:t xml:space="preserve">), whereas the large-target prompts show </w:t>
+      </w:r>
+      <w:r>
+        <w:rPr>
+          <w:sz w:val="22"/>
+          <w:szCs w:val="22"/>
+          <w:lang w:val="id-ID"/>
+        </w:rPr>
+        <w:t xml:space="preserve">Resource.path</w:t>
+      </w:r>
+      <w:r>
+        <w:rPr>
+          <w:sz w:val="22"/>
+          <w:szCs w:val="22"/>
+          <w:lang w:val="id-ID"/>
+        </w:rPr>
+        <w:t xml:space="preserve"> (</w:t>
+      </w:r>
+      <w:r>
+        <w:rPr>
+          <w:sz w:val="22"/>
+          <w:szCs w:val="22"/>
+          <w:lang w:val="id-ID"/>
+        </w:rPr>
+        <w:t xml:space="preserve">MedicationRequest.identifier</w:t>
+      </w:r>
+      <w:r>
+        <w:rPr>
+          <w:sz w:val="22"/>
+          <w:szCs w:val="22"/>
+          <w:lang w:val="id-ID"/>
+        </w:rPr>
+        <w:t xml:space="preserve">), and the resource prefix appears to help the model. Wrong rank-1 choices are concentrated: Qwen ranks Patient first for four staff tables, and Encounter or DiagnosticReport first for all ten referral, order and Observation tables it misses; GLM's errors are mostly Encounter (7 of 10).</w:t>
+      </w:r>
+    </w:p>
+    <w:p>
+      <w:pPr>
+        <w:keepNext/>
+        <w:spacing w:before="160" w:after="40"/>
+        <w:pStyle w:val="Normal"/>
+        <w:rPr>
+          <w:sz w:val="22"/>
+          <w:szCs w:val="22"/>
+        </w:rPr>
+        <w:jc w:val="center"/>
+      </w:pPr>
+      <w:r>
+        <w:rPr>
+          <w:sz w:val="22"/>
+          <w:szCs w:val="22"/>
+          <w:lang w:val="id-ID"/>
+        </w:rPr>
+        <w:t xml:space="preserve">Table 7 Stage-1 selection and stage-2 accuracy conditioned on it (all 59 tables; R@|GT| of primary and oracle on the same tables)</w:t>
+      </w:r>
+    </w:p>
+    <w:tbl>
+      <w:tblPr>
+        <w:tblW w:w="8504" w:type="dxa"/>
+        <w:jc w:val="center"/>
+        <w:tblLayout w:type="fixed"/>
+        <w:tblCellMar>
+          <w:start w:w="80" w:type="dxa"/>
+          <w:end w:w="80" w:type="dxa"/>
+        </w:tblCellMar>
+      </w:tblPr>
+      <w:tblGrid>
+        <w:gridCol w:w="1520"/>
+        <w:gridCol w:w="930"/>
+        <w:gridCol w:w="1330"/>
+        <w:gridCol w:w="930"/>
+        <w:gridCol w:w="1931"/>
+        <w:gridCol w:w="1863"/>
+      </w:tblGrid>
+      <w:tr>
+        <w:trPr>
+          <w:cantSplit/>
+          <w:tblHeader/>
+        </w:trPr>
+        <w:tc>
+          <w:tcPr>
+            <w:tcW w:w="1520" w:type="dxa"/>
+            <w:tcBorders>
+              <w:top w:val="single" w:sz="4" w:space="0" w:color="000000"/>
+              <w:start w:val="single" w:sz="4" w:space="0" w:color="000000"/>
+              <w:bottom w:val="single" w:sz="4" w:space="0" w:color="000000"/>
+              <w:end w:val="single" w:sz="4" w:space="0" w:color="000000"/>
+            </w:tcBorders>
+          </w:tcPr>
+          <w:p>
+            <w:pPr>
+              <w:keepNext/>
+              <w:spacing w:before="0" w:after="0"/>
+              <w:jc w:val="left"/>
+            </w:pPr>
+            <w:r>
+              <w:rPr>
+                <w:rFonts w:ascii="Times New Roman" w:hAnsi="Times New Roman"/>
+                <w:sz w:val="18"/>
+                <w:szCs w:val="18"/>
+              </w:rPr>
+              <w:t xml:space="preserve">Model</w:t>
+            </w:r>
+          </w:p>
+        </w:tc>
+        <w:tc>
+          <w:tcPr>
+            <w:tcW w:w="930" w:type="dxa"/>
+            <w:tcBorders>
+              <w:top w:val="single" w:sz="4" w:space="0" w:color="000000"/>
+              <w:start w:val="single" w:sz="4" w:space="0" w:color="000000"/>
+              <w:bottom w:val="single" w:sz="4" w:space="0" w:color="000000"/>
+              <w:end w:val="single" w:sz="4" w:space="0" w:color="000000"/>
+            </w:tcBorders>
+          </w:tcPr>
+          <w:p>
+            <w:pPr>
+              <w:keepNext/>
+              <w:spacing w:before="0" w:after="0"/>
+              <w:jc w:val="center"/>
+            </w:pPr>
+            <w:r>
+              <w:rPr>
+                <w:rFonts w:ascii="Times New Roman" w:hAnsi="Times New Roman"/>
+                <w:sz w:val="18"/>
+                <w:szCs w:val="18"/>
+              </w:rPr>
+              <w:t xml:space="preserve">Top-1 dev41</w:t>
+            </w:r>
+          </w:p>
+        </w:tc>
+        <w:tc>
+          <w:tcPr>
+            <w:tcW w:w="1330" w:type="dxa"/>
+            <w:tcBorders>
+              <w:top w:val="single" w:sz="4" w:space="0" w:color="000000"/>
+              <w:start w:val="single" w:sz="4" w:space="0" w:color="000000"/>
+              <w:bottom w:val="single" w:sz="4" w:space="0" w:color="000000"/>
+              <w:end w:val="single" w:sz="4" w:space="0" w:color="000000"/>
+            </w:tcBorders>
+          </w:tcPr>
+          <w:p>
+            <w:pPr>
+              <w:keepNext/>
+              <w:spacing w:before="0" w:after="0"/>
+              <w:jc w:val="center"/>
+            </w:pPr>
+            <w:r>
+              <w:rPr>
+                <w:rFonts w:ascii="Times New Roman" w:hAnsi="Times New Roman"/>
+                <w:sz w:val="18"/>
+                <w:szCs w:val="18"/>
+              </w:rPr>
+              <w:t xml:space="preserve">Top-1 confirm18</w:t>
+            </w:r>
+          </w:p>
+        </w:tc>
+        <w:tc>
+          <w:tcPr>
+            <w:tcW w:w="930" w:type="dxa"/>
+            <w:tcBorders>
+              <w:top w:val="single" w:sz="4" w:space="0" w:color="000000"/>
+              <w:start w:val="single" w:sz="4" w:space="0" w:color="000000"/>
+              <w:bottom w:val="single" w:sz="4" w:space="0" w:color="000000"/>
+              <w:end w:val="single" w:sz="4" w:space="0" w:color="000000"/>
+            </w:tcBorders>
+          </w:tcPr>
+          <w:p>
+            <w:pPr>
+              <w:keepNext/>
+              <w:spacing w:before="0" w:after="0"/>
+              <w:jc w:val="center"/>
+            </w:pPr>
+            <w:r>
+              <w:rPr>
+                <w:rFonts w:ascii="Times New Roman" w:hAnsi="Times New Roman"/>
+                <w:sz w:val="18"/>
+                <w:szCs w:val="18"/>
+              </w:rPr>
+              <w:t xml:space="preserve">Top-3 (all)</w:t>
+            </w:r>
+          </w:p>
+        </w:tc>
+        <w:tc>
+          <w:tcPr>
+            <w:tcW w:w="1931" w:type="dxa"/>
+            <w:tcBorders>
+              <w:top w:val="single" w:sz="4" w:space="0" w:color="000000"/>
+              <w:start w:val="single" w:sz="4" w:space="0" w:color="000000"/>
+              <w:bottom w:val="single" w:sz="4" w:space="0" w:color="000000"/>
+              <w:end w:val="single" w:sz="4" w:space="0" w:color="000000"/>
+            </w:tcBorders>
+          </w:tcPr>
+          <w:p>
+            <w:pPr>
+              <w:keepNext/>
+              <w:spacing w:before="0" w:after="0"/>
+              <w:jc w:val="center"/>
+            </w:pPr>
+            <w:r>
+              <w:rPr>
+                <w:rFonts w:ascii="Times New Roman" w:hAnsi="Times New Roman"/>
+                <w:sz w:val="18"/>
+                <w:szCs w:val="18"/>
+              </w:rPr>
+              <w:t xml:space="preserve">Rank-1 correct: n, primary, oracle</w:t>
+            </w:r>
+          </w:p>
+        </w:tc>
+        <w:tc>
+          <w:tcPr>
+            <w:tcW w:w="1863" w:type="dxa"/>
+            <w:tcBorders>
+              <w:top w:val="single" w:sz="4" w:space="0" w:color="000000"/>
+              <w:start w:val="single" w:sz="4" w:space="0" w:color="000000"/>
+              <w:bottom w:val="single" w:sz="4" w:space="0" w:color="000000"/>
+              <w:end w:val="single" w:sz="4" w:space="0" w:color="000000"/>
+            </w:tcBorders>
+          </w:tcPr>
+          <w:p>
+            <w:pPr>
+              <w:keepNext/>
+              <w:spacing w:before="0" w:after="0"/>
+              <w:jc w:val="center"/>
+            </w:pPr>
+            <w:r>
+              <w:rPr>
+                <w:rFonts w:ascii="Times New Roman" w:hAnsi="Times New Roman"/>
+                <w:sz w:val="18"/>
+                <w:szCs w:val="18"/>
+              </w:rPr>
+              <w:t xml:space="preserve">Rank-1 wrong: n, primary, oracle</w:t>
+            </w:r>
+          </w:p>
+        </w:tc>
+      </w:tr>
+      <w:tr>
+        <w:trPr>
+          <w:cantSplit/>
+        </w:trPr>
+        <w:tc>
+          <w:tcPr>
+            <w:tcW w:w="1520" w:type="dxa"/>
+            <w:tcBorders>
+              <w:top w:val="single" w:sz="4" w:space="0" w:color="000000"/>
+              <w:start w:val="single" w:sz="4" w:space="0" w:color="000000"/>
+              <w:bottom w:val="single" w:sz="4" w:space="0" w:color="000000"/>
+              <w:end w:val="single" w:sz="4" w:space="0" w:color="000000"/>
+            </w:tcBorders>
+          </w:tcPr>
+          <w:p>
+            <w:pPr>
+              <w:keepNext/>
+              <w:spacing w:before="0" w:after="0"/>
+              <w:jc w:val="left"/>
+            </w:pPr>
+            <w:r>
+              <w:rPr>
+                <w:rFonts w:ascii="Times New Roman" w:hAnsi="Times New Roman"/>
+                <w:sz w:val="18"/>
+                <w:szCs w:val="18"/>
+              </w:rPr>
+              <w:t xml:space="preserve">Qwen3-8B</w:t>
+            </w:r>
+          </w:p>
+        </w:tc>
+        <w:tc>
+          <w:tcPr>
+            <w:tcW w:w="930" w:type="dxa"/>
+            <w:tcBorders>
+              <w:top w:val="single" w:sz="4" w:space="0" w:color="000000"/>
+              <w:start w:val="single" w:sz="4" w:space="0" w:color="000000"/>
+              <w:bottom w:val="single" w:sz="4" w:space="0" w:color="000000"/>
+              <w:end w:val="single" w:sz="4" w:space="0" w:color="000000"/>
+            </w:tcBorders>
+          </w:tcPr>
+          <w:p>
+            <w:pPr>
+              <w:keepNext/>
+              <w:spacing w:before="0" w:after="0"/>
+              <w:jc w:val="center"/>
+            </w:pPr>
+            <w:r>
+              <w:rPr>
+                <w:rFonts w:ascii="Times New Roman" w:hAnsi="Times New Roman"/>
+                <w:sz w:val="18"/>
+                <w:szCs w:val="18"/>
+              </w:rPr>
+              <w:t xml:space="preserve">26/41</w:t>
+            </w:r>
+          </w:p>
+        </w:tc>
+        <w:tc>
+          <w:tcPr>
+            <w:tcW w:w="1330" w:type="dxa"/>
+            <w:tcBorders>
+              <w:top w:val="single" w:sz="4" w:space="0" w:color="000000"/>
+              <w:start w:val="single" w:sz="4" w:space="0" w:color="000000"/>
+              <w:bottom w:val="single" w:sz="4" w:space="0" w:color="000000"/>
+              <w:end w:val="single" w:sz="4" w:space="0" w:color="000000"/>
+            </w:tcBorders>
+          </w:tcPr>
+          <w:p>
+            <w:pPr>
+              <w:keepNext/>
+              <w:spacing w:before="0" w:after="0"/>
+              <w:jc w:val="center"/>
+            </w:pPr>
+            <w:r>
+              <w:rPr>
+                <w:rFonts w:ascii="Times New Roman" w:hAnsi="Times New Roman"/>
+                <w:sz w:val="18"/>
+                <w:szCs w:val="18"/>
+              </w:rPr>
+              <w:t xml:space="preserve">12/18</w:t>
+            </w:r>
+          </w:p>
+        </w:tc>
+        <w:tc>
+          <w:tcPr>
+            <w:tcW w:w="930" w:type="dxa"/>
+            <w:tcBorders>
+              <w:top w:val="single" w:sz="4" w:space="0" w:color="000000"/>
+              <w:start w:val="single" w:sz="4" w:space="0" w:color="000000"/>
+              <w:bottom w:val="single" w:sz="4" w:space="0" w:color="000000"/>
+              <w:end w:val="single" w:sz="4" w:space="0" w:color="000000"/>
+            </w:tcBorders>
+          </w:tcPr>
+          <w:p>
+            <w:pPr>
+              <w:keepNext/>
+              <w:spacing w:before="0" w:after="0"/>
+              <w:jc w:val="center"/>
+            </w:pPr>
+            <w:r>
+              <w:rPr>
+                <w:rFonts w:ascii="Times New Roman" w:hAnsi="Times New Roman"/>
+                <w:sz w:val="18"/>
+                <w:szCs w:val="18"/>
+              </w:rPr>
+              <w:t xml:space="preserve">53/59</w:t>
+            </w:r>
+          </w:p>
+        </w:tc>
+        <w:tc>
+          <w:tcPr>
+            <w:tcW w:w="1931" w:type="dxa"/>
+            <w:tcBorders>
+              <w:top w:val="single" w:sz="4" w:space="0" w:color="000000"/>
+              <w:start w:val="single" w:sz="4" w:space="0" w:color="000000"/>
+              <w:bottom w:val="single" w:sz="4" w:space="0" w:color="000000"/>
+              <w:end w:val="single" w:sz="4" w:space="0" w:color="000000"/>
+            </w:tcBorders>
+          </w:tcPr>
+          <w:p>
+            <w:pPr>
+              <w:keepNext/>
+              <w:spacing w:before="0" w:after="0"/>
+              <w:jc w:val="center"/>
+            </w:pPr>
+            <w:r>
+              <w:rPr>
+                <w:rFonts w:ascii="Times New Roman" w:hAnsi="Times New Roman"/>
+                <w:sz w:val="18"/>
+                <w:szCs w:val="18"/>
+              </w:rPr>
+              <w:t xml:space="preserve">38, 0.728, 0.669</w:t>
+            </w:r>
+          </w:p>
+        </w:tc>
+        <w:tc>
+          <w:tcPr>
+            <w:tcW w:w="1863" w:type="dxa"/>
+            <w:tcBorders>
+              <w:top w:val="single" w:sz="4" w:space="0" w:color="000000"/>
+              <w:start w:val="single" w:sz="4" w:space="0" w:color="000000"/>
+              <w:bottom w:val="single" w:sz="4" w:space="0" w:color="000000"/>
+              <w:end w:val="single" w:sz="4" w:space="0" w:color="000000"/>
+            </w:tcBorders>
+          </w:tcPr>
+          <w:p>
+            <w:pPr>
+              <w:keepNext/>
+              <w:spacing w:before="0" w:after="0"/>
+              <w:jc w:val="center"/>
+            </w:pPr>
+            <w:r>
+              <w:rPr>
+                <w:rFonts w:ascii="Times New Roman" w:hAnsi="Times New Roman"/>
+                <w:sz w:val="18"/>
+                <w:szCs w:val="18"/>
+              </w:rPr>
+              <w:t xml:space="preserve">21, 0.000, 0.546</w:t>
+            </w:r>
+          </w:p>
+        </w:tc>
+      </w:tr>
+      <w:tr>
+        <w:trPr>
+          <w:cantSplit/>
+        </w:trPr>
+        <w:tc>
+          <w:tcPr>
+            <w:tcW w:w="1520" w:type="dxa"/>
+            <w:tcBorders>
+              <w:top w:val="single" w:sz="4" w:space="0" w:color="000000"/>
+              <w:start w:val="single" w:sz="4" w:space="0" w:color="000000"/>
+              <w:bottom w:val="single" w:sz="4" w:space="0" w:color="000000"/>
+              <w:end w:val="single" w:sz="4" w:space="0" w:color="000000"/>
+            </w:tcBorders>
+          </w:tcPr>
+          <w:p>
+            <w:pPr>
+              <w:spacing w:before="0" w:after="0"/>
+              <w:jc w:val="left"/>
+            </w:pPr>
+            <w:r>
+              <w:rPr>
+                <w:rFonts w:ascii="Times New Roman" w:hAnsi="Times New Roman"/>
+                <w:sz w:val="18"/>
+                <w:szCs w:val="18"/>
+              </w:rPr>
+              <w:t xml:space="preserve">GLM-5.3-Flash</w:t>
+            </w:r>
+          </w:p>
+        </w:tc>
+        <w:tc>
+          <w:tcPr>
+            <w:tcW w:w="930" w:type="dxa"/>
+            <w:tcBorders>
+              <w:top w:val="single" w:sz="4" w:space="0" w:color="000000"/>
+              <w:start w:val="single" w:sz="4" w:space="0" w:color="000000"/>
+              <w:bottom w:val="single" w:sz="4" w:space="0" w:color="000000"/>
+              <w:end w:val="single" w:sz="4" w:space="0" w:color="000000"/>
+            </w:tcBorders>
+          </w:tcPr>
+          <w:p>
+            <w:pPr>
+              <w:spacing w:before="0" w:after="0"/>
+              <w:jc w:val="center"/>
+            </w:pPr>
+            <w:r>
+              <w:rPr>
+                <w:rFonts w:ascii="Times New Roman" w:hAnsi="Times New Roman"/>
+                <w:sz w:val="18"/>
+                <w:szCs w:val="18"/>
+              </w:rPr>
+              <w:t xml:space="preserve">34/41</w:t>
+            </w:r>
+          </w:p>
+        </w:tc>
+        <w:tc>
+          <w:tcPr>
+            <w:tcW w:w="1330" w:type="dxa"/>
+            <w:tcBorders>
+              <w:top w:val="single" w:sz="4" w:space="0" w:color="000000"/>
+              <w:start w:val="single" w:sz="4" w:space="0" w:color="000000"/>
+              <w:bottom w:val="single" w:sz="4" w:space="0" w:color="000000"/>
+              <w:end w:val="single" w:sz="4" w:space="0" w:color="000000"/>
+            </w:tcBorders>
+          </w:tcPr>
+          <w:p>
+            <w:pPr>
+              <w:spacing w:before="0" w:after="0"/>
+              <w:jc w:val="center"/>
+            </w:pPr>
+            <w:r>
+              <w:rPr>
+                <w:rFonts w:ascii="Times New Roman" w:hAnsi="Times New Roman"/>
+                <w:sz w:val="18"/>
+                <w:szCs w:val="18"/>
+              </w:rPr>
+              <w:t xml:space="preserve">15/18</w:t>
+            </w:r>
+          </w:p>
+        </w:tc>
+        <w:tc>
+          <w:tcPr>
+            <w:tcW w:w="930" w:type="dxa"/>
+            <w:tcBorders>
+              <w:top w:val="single" w:sz="4" w:space="0" w:color="000000"/>
+              <w:start w:val="single" w:sz="4" w:space="0" w:color="000000"/>
+              <w:bottom w:val="single" w:sz="4" w:space="0" w:color="000000"/>
+              <w:end w:val="single" w:sz="4" w:space="0" w:color="000000"/>
+            </w:tcBorders>
+          </w:tcPr>
+          <w:p>
+            <w:pPr>
+              <w:spacing w:before="0" w:after="0"/>
+              <w:jc w:val="center"/>
+            </w:pPr>
+            <w:r>
+              <w:rPr>
+                <w:rFonts w:ascii="Times New Roman" w:hAnsi="Times New Roman"/>
+                <w:sz w:val="18"/>
+                <w:szCs w:val="18"/>
+              </w:rPr>
+              <w:t xml:space="preserve">54/59</w:t>
+            </w:r>
+          </w:p>
+        </w:tc>
+        <w:tc>
+          <w:tcPr>
+            <w:tcW w:w="1931" w:type="dxa"/>
+            <w:tcBorders>
+              <w:top w:val="single" w:sz="4" w:space="0" w:color="000000"/>
+              <w:start w:val="single" w:sz="4" w:space="0" w:color="000000"/>
+              <w:bottom w:val="single" w:sz="4" w:space="0" w:color="000000"/>
+              <w:end w:val="single" w:sz="4" w:space="0" w:color="000000"/>
+            </w:tcBorders>
+          </w:tcPr>
+          <w:p>
+            <w:pPr>
+              <w:spacing w:before="0" w:after="0"/>
+              <w:jc w:val="center"/>
+            </w:pPr>
+            <w:r>
+              <w:rPr>
+                <w:rFonts w:ascii="Times New Roman" w:hAnsi="Times New Roman"/>
+                <w:sz w:val="18"/>
+                <w:szCs w:val="18"/>
+              </w:rPr>
+              <w:t xml:space="preserve">49, 0.833, 0.809</w:t>
+            </w:r>
+          </w:p>
+        </w:tc>
+        <w:tc>
+          <w:tcPr>
+            <w:tcW w:w="1863" w:type="dxa"/>
+            <w:tcBorders>
+              <w:top w:val="single" w:sz="4" w:space="0" w:color="000000"/>
+              <w:start w:val="single" w:sz="4" w:space="0" w:color="000000"/>
+              <w:bottom w:val="single" w:sz="4" w:space="0" w:color="000000"/>
+              <w:end w:val="single" w:sz="4" w:space="0" w:color="000000"/>
+            </w:tcBorders>
+          </w:tcPr>
+          <w:p>
+            <w:pPr>
+              <w:spacing w:before="0" w:after="0"/>
+              <w:jc w:val="center"/>
+            </w:pPr>
+            <w:r>
+              <w:rPr>
+                <w:rFonts w:ascii="Times New Roman" w:hAnsi="Times New Roman"/>
+                <w:sz w:val="18"/>
+                <w:szCs w:val="18"/>
+              </w:rPr>
+              <w:t xml:space="preserve">10, 0.000, 0.650</w:t>
+            </w:r>
+          </w:p>
+        </w:tc>
+      </w:tr>
+    </w:tbl>
+    <w:p>
+      <w:pPr>
+        <w:pStyle w:val="Text"/>
+        <w:ind w:hanging="0" w:end="0"/>
+        <w:rPr>
+          <w:sz w:val="22"/>
+          <w:szCs w:val="22"/>
+          <w:lang w:val="id-ID"/>
+        </w:rPr>
+      </w:pPr>
+    </w:p>
+    <w:p>
+      <w:pPr>
+        <w:pStyle w:val="Text"/>
+        <w:ind w:hanging="0" w:end="0"/>
+        <w:rPr>
+          <w:sz w:val="22"/>
+          <w:szCs w:val="22"/>
+          <w:lang w:val="id-ID"/>
+        </w:rPr>
+      </w:pPr>
+      <w:r>
+        <w:rPr>
+          <w:sz w:val="22"/>
+          <w:szCs w:val="22"/>
+        </w:rPr>
+        <w:t xml:space="preserve">The gain is also not uniform across resources (Table 8). It is largest for MedicationRequest, Organization and, for GLM, ServiceRequest, and negative where the rank-1 choice is often wrong, such as Practitioner for Qwen. Higher primary than oracle scores, e.g. Qwen on Condition, follow from the prompt difference explained above and from small n.</w:t>
+      </w:r>
+    </w:p>
+    <w:p>
+      <w:pPr>
+        <w:keepNext/>
+        <w:spacing w:before="160" w:after="40"/>
+        <w:pStyle w:val="Normal"/>
+        <w:rPr>
+          <w:sz w:val="22"/>
+          <w:szCs w:val="22"/>
+        </w:rPr>
+        <w:jc w:val="center"/>
+      </w:pPr>
+      <w:r>
+        <w:rPr>
+          <w:sz w:val="22"/>
+          <w:szCs w:val="22"/>
+          <w:lang w:val="id-ID"/>
+        </w:rPr>
+        <w:t xml:space="preserve">Table 8 R@|GT| per FHIR resource on all 59 tables (n = tables)</w:t>
       </w:r>
     </w:p>
     <w:tbl>
@@ -9635,51 +11430,26 @@
           <w:sz w:val="22"/>
           <w:szCs w:val="22"/>
         </w:rPr>
-        <w:t xml:space="preserve">The effect also replicates across model families: no design choice was made with GLM, so its dev41 result is an independent replication, and its size (+12.7) is almost identical to Qwen's (+13.7). The primary variant uses 48–55% of the prompt tokens of llm-full, about 690 for stage 1 plus one small matching prompt, and on the local model it is also faster (median 12–16 s against 16–19 s per table). GLM is 16–24 points more accurate than Qwen in every configuration (all p &lt; 0.001), and its stage 1 ranks the correct resource first for 83% of tables against 63–67%, which shrinks the gap between primary and oracle from 14.6 to 8.2 points on dev41.</w:t>
-      </w:r>
-    </w:p>
-    <w:p>
-      <w:pPr>
-        <w:pStyle w:val="Text"/>
-        <w:ind w:firstLine="709" w:end="0"/>
-        <w:rPr>
-          <w:sz w:val="22"/>
-          <w:szCs w:val="22"/>
-          <w:lang w:val="id-ID"/>
-        </w:rPr>
-      </w:pPr>
-      <w:r>
-        <w:rPr>
-          <w:sz w:val="22"/>
-          <w:szCs w:val="22"/>
-          <w:lang w:val="id-ID"/>
-        </w:rPr>
-        <w:t xml:space="preserve">On confirm18 the effect has the same size as on dev41 (+12.2 against +13.7), but the pre-registered hypothesis that primary outperforms llm-full is not confirmed at α = 0.05 (one-sided p = 0.069, Holm-corrected p = 0.138). By the pre-registered criteria the outcome is "direction consistent, not significant": the confidence interval overlaps that of dev41. Thirteen of the 18 held-out tables are ties, because these schemas are smaller and less abbreviated (33% against 58% of columns) and all methods score alike on them. The second hypothesis (primary outperforms union) shows the same pattern (+6.5, Holm-corrected p = 0.17). A correspondence-level analysis with tables as clusters gives the same ordering in all sets but no additional power: the dev41 effect is +9.3 points (cluster-permutation p = 0.12) and the pooled effect +10.2 (CI [1.4, 19.3], p = 0.029), smaller because large tables, on which all methods are similar, carry more weight.</w:t>
-      </w:r>
-    </w:p>
-    <w:p>
-      <w:pPr>
-        <w:pStyle w:val="Text"/>
-        <w:ind w:firstLine="709" w:end="0"/>
-        <w:rPr>
-          <w:sz w:val="22"/>
-          <w:szCs w:val="22"/>
-          <w:lang w:val="id-ID"/>
-        </w:rPr>
-      </w:pPr>
-      <w:r>
-        <w:rPr>
-          <w:sz w:val="22"/>
-          <w:szCs w:val="22"/>
-          <w:lang w:val="id-ID"/>
-        </w:rPr>
-        <w:t xml:space="preserve">Design ablations on dev41 with Qwen did not change the configuration except for the catalogue. Replacing the one-line </w:t>
-      </w:r>
-      <w:r>
-        <w:rPr>
-          <w:sz w:val="22"/>
-          <w:szCs w:val="22"/>
-          <w:lang w:val="id-ID"/>
+        <w:t xml:space="preserve">Design ablations on dev41 with Qwen did not change the configuration except for the catalogue: the </w:t>
+      </w:r>
+      <w:r>
+        <w:rPr>
+          <w:sz w:val="22"/>
+          <w:szCs w:val="22"/>
+        </w:rPr>
+        <w:t xml:space="preserve">definition</w:t>
+      </w:r>
+      <w:r>
+        <w:rPr>
+          <w:sz w:val="22"/>
+          <w:szCs w:val="22"/>
+        </w:rPr>
+        <w:t xml:space="preserve"> text instead of the one-line </w:t>
+      </w:r>
+      <w:r>
+        <w:rPr>
+          <w:sz w:val="22"/>
+          <w:szCs w:val="22"/>
         </w:rPr>
         <w:t xml:space="preserve">short</w:t>
       </w:r>
@@ -9687,25 +11457,8 @@
         <w:rPr>
           <w:sz w:val="22"/>
           <w:szCs w:val="22"/>
-          <w:lang w:val="id-ID"/>
-        </w:rPr>
-        <w:t xml:space="preserve"> text with the </w:t>
-      </w:r>
-      <w:r>
-        <w:rPr>
-          <w:sz w:val="22"/>
-          <w:szCs w:val="22"/>
-          <w:lang w:val="id-ID"/>
-        </w:rPr>
-        <w:t xml:space="preserve">definition</w:t>
-      </w:r>
-      <w:r>
-        <w:rPr>
-          <w:sz w:val="22"/>
-          <w:szCs w:val="22"/>
-          <w:lang w:val="id-ID"/>
-        </w:rPr>
-        <w:t xml:space="preserve"> text gave +1.5 points (not significant) and raised stage-1 hits on the seven hardest tables from 0/7 to 3/7. The full "Scope and Usage" text, 13–23 times longer, gave −0.1 to −2.1 points at two to three times the latency. Matching every selected resource separately and keeping the one with the highest summed LLM confidence or coverage was 10.2–12.9 points worse than rank 1, because the model is confident in any resource it is given. On the first 15 tables, adding the source table name changed results by less than 2 points, and an Indonesian–English glossary hurt llm-full by 10–11 points (p = 0.03) without changing any stage-1 decision.</w:t>
+        </w:rPr>
+        <w:t xml:space="preserve"> text gave +1.5 points and raised stage-1 hits on the seven hardest tables from 0/7 to 3/7, whereas the full "Scope and Usage" text gave −0.1 to −2.1 points. Choosing among separately matched resources by summed LLM confidence was 10.2 points worse than rank 1, and an Indonesian–English glossary hurt llm-full by 10–11 points (p = 0.03).</w:t>
       </w:r>
     </w:p>
     <w:p>
@@ -9759,7 +11512,7 @@
           <w:sz w:val="22"/>
           <w:szCs w:val="22"/>
         </w:rPr>
-        <w:t xml:space="preserve">, so stage 1 includes Encounter for 24 of 41 tables. When Encounter is part of the union target, the model maps the table onto Encounter instead of the resource that the table describes (Table 7). Tables that include Encounter are intrinsically harder (oracle 0.41 against 0.73), but the gap to the oracle still doubles. For the referral table </w:t>
+        <w:t xml:space="preserve">, so stage 1 often includes Encounter, and in the union target the model then maps the table onto Encounter instead of the resource the table describes (Table 9). With GLM, the tables that include Encounter are not intrinsically harder (oracle 0.75 against 0.83), yet union recall drops from 0.82 to 0.32. For the referral table </w:t>
       </w:r>
       <w:r>
         <w:rPr>
@@ -9773,7 +11526,7 @@
           <w:sz w:val="22"/>
           <w:szCs w:val="22"/>
         </w:rPr>
-        <w:t xml:space="preserve">, with ServiceRequest correctly selected, the model predicted </w:t>
+        <w:t xml:space="preserve">, with ServiceRequest selected, Qwen predicted </w:t>
       </w:r>
       <w:r>
         <w:rPr>
@@ -9829,7 +11582,7 @@
           <w:sz w:val="22"/>
           <w:szCs w:val="22"/>
         </w:rPr>
-        <w:t xml:space="preserve"> and scored 0 against an oracle of 0.62. Under the annotation convention every correspondence lies in one resource, and a foreign key such as </w:t>
+        <w:t xml:space="preserve"> and scored 0 against an oracle of 0.62. Under the single-resource convention a foreign key such as </w:t>
       </w:r>
       <w:r>
         <w:rPr>
@@ -9857,7 +11610,7 @@
           <w:sz w:val="22"/>
           <w:szCs w:val="22"/>
         </w:rPr>
-        <w:t xml:space="preserve">, which is why the primary variant works. The same absorption appears in confirm18 and persists with GLM, whose union variant gains nothing over llm-full.</w:t>
+        <w:t xml:space="preserve">, which is why the primary variant works.</w:t>
       </w:r>
     </w:p>
     <w:p>
@@ -9877,7 +11630,7 @@
           <w:szCs w:val="22"/>
           <w:lang w:val="id-ID"/>
         </w:rPr>
-        <w:t xml:space="preserve">Table 7 Effect of Encounter in the union target (31 dev41 tables whose correct resource is not Encounter but was selected)</w:t>
+        <w:t xml:space="preserve">Table 9 Encounter absorption in the union target: dev41 tables whose gold resource is not Encounter and is among the stage-1 picks, split by whether Encounter is also picked</w:t>
       </w:r>
     </w:p>
     <w:tbl>
@@ -9891,15 +11644,14 @@
         </w:tblCellMar>
       </w:tblPr>
       <w:tblGrid>
-        <w:gridCol w:w="1250"/>
+        <w:gridCol w:w="1520"/>
+        <w:gridCol w:w="1513"/>
         <w:gridCol w:w="820"/>
-        <w:gridCol w:w="1566"/>
-        <w:gridCol w:w="1667"/>
+        <w:gridCol w:w="2172"/>
+        <w:gridCol w:w="818"/>
         <w:gridCol w:w="620"/>
-        <w:gridCol w:w="620"/>
-        <w:gridCol w:w="620"/>
-        <w:gridCol w:w="820"/>
-        <w:gridCol w:w="521"/>
+        <w:gridCol w:w="220"/>
+        <w:gridCol w:w="821"/>
       </w:tblGrid>
       <w:tr>
         <w:trPr>
@@ -9908,7 +11660,7 @@
         </w:trPr>
         <w:tc>
           <w:tcPr>
-            <w:tcW w:w="1250" w:type="dxa"/>
+            <w:tcW w:w="1520" w:type="dxa"/>
             <w:tcBorders>
               <w:top w:val="single" w:sz="4" w:space="0" w:color="000000"/>
               <w:start w:val="single" w:sz="4" w:space="0" w:color="000000"/>
@@ -9928,7 +11680,33 @@
                 <w:sz w:val="18"/>
                 <w:szCs w:val="18"/>
               </w:rPr>
-              <w:t xml:space="preserve">Encounter selected</w:t>
+              <w:t xml:space="preserve">Model</w:t>
+            </w:r>
+          </w:p>
+        </w:tc>
+        <w:tc>
+          <w:tcPr>
+            <w:tcW w:w="1513" w:type="dxa"/>
+            <w:tcBorders>
+              <w:top w:val="single" w:sz="4" w:space="0" w:color="000000"/>
+              <w:start w:val="single" w:sz="4" w:space="0" w:color="000000"/>
+              <w:bottom w:val="single" w:sz="4" w:space="0" w:color="000000"/>
+              <w:end w:val="single" w:sz="4" w:space="0" w:color="000000"/>
+            </w:tcBorders>
+          </w:tcPr>
+          <w:p>
+            <w:pPr>
+              <w:keepNext/>
+              <w:spacing w:before="0" w:after="0"/>
+              <w:jc w:val="center"/>
+            </w:pPr>
+            <w:r>
+              <w:rPr>
+                <w:rFonts w:ascii="Times New Roman" w:hAnsi="Times New Roman"/>
+                <w:sz w:val="18"/>
+                <w:szCs w:val="18"/>
+              </w:rPr>
+              <w:t xml:space="preserve">Encounter also picked</w:t>
             </w:r>
           </w:p>
         </w:tc>
@@ -9960,53 +11738,53 @@
         </w:tc>
         <w:tc>
           <w:tcPr>
-            <w:tcW w:w="1566" w:type="dxa"/>
-            <w:tcBorders>
-              <w:top w:val="single" w:sz="4" w:space="0" w:color="000000"/>
-              <w:start w:val="single" w:sz="4" w:space="0" w:color="000000"/>
-              <w:bottom w:val="single" w:sz="4" w:space="0" w:color="000000"/>
-              <w:end w:val="single" w:sz="4" w:space="0" w:color="000000"/>
-            </w:tcBorders>
-          </w:tcPr>
-          <w:p>
-            <w:pPr>
-              <w:keepNext/>
-              <w:spacing w:before="0" w:after="0"/>
-              <w:jc w:val="center"/>
-            </w:pPr>
-            <w:r>
-              <w:rPr>
-                <w:rFonts w:ascii="Times New Roman" w:hAnsi="Times New Roman"/>
-                <w:sz w:val="18"/>
-                <w:szCs w:val="18"/>
-              </w:rPr>
-              <w:t xml:space="preserve">Top predictions to Encounter</w:t>
-            </w:r>
-          </w:p>
-        </w:tc>
-        <w:tc>
-          <w:tcPr>
-            <w:tcW w:w="1667" w:type="dxa"/>
-            <w:tcBorders>
-              <w:top w:val="single" w:sz="4" w:space="0" w:color="000000"/>
-              <w:start w:val="single" w:sz="4" w:space="0" w:color="000000"/>
-              <w:bottom w:val="single" w:sz="4" w:space="0" w:color="000000"/>
-              <w:end w:val="single" w:sz="4" w:space="0" w:color="000000"/>
-            </w:tcBorders>
-          </w:tcPr>
-          <w:p>
-            <w:pPr>
-              <w:keepNext/>
-              <w:spacing w:before="0" w:after="0"/>
-              <w:jc w:val="center"/>
-            </w:pPr>
-            <w:r>
-              <w:rPr>
-                <w:rFonts w:ascii="Times New Roman" w:hAnsi="Times New Roman"/>
-                <w:sz w:val="18"/>
-                <w:szCs w:val="18"/>
-              </w:rPr>
-              <w:t xml:space="preserve">Top predictions to correct resource</w:t>
+            <w:tcW w:w="2172" w:type="dxa"/>
+            <w:tcBorders>
+              <w:top w:val="single" w:sz="4" w:space="0" w:color="000000"/>
+              <w:start w:val="single" w:sz="4" w:space="0" w:color="000000"/>
+              <w:bottom w:val="single" w:sz="4" w:space="0" w:color="000000"/>
+              <w:end w:val="single" w:sz="4" w:space="0" w:color="000000"/>
+            </w:tcBorders>
+          </w:tcPr>
+          <w:p>
+            <w:pPr>
+              <w:keepNext/>
+              <w:spacing w:before="0" w:after="0"/>
+              <w:jc w:val="center"/>
+            </w:pPr>
+            <w:r>
+              <w:rPr>
+                <w:rFonts w:ascii="Times New Roman" w:hAnsi="Times New Roman"/>
+                <w:sz w:val="18"/>
+                <w:szCs w:val="18"/>
+              </w:rPr>
+              <w:t xml:space="preserve">Share of top predictions in Encounter</w:t>
+            </w:r>
+          </w:p>
+        </w:tc>
+        <w:tc>
+          <w:tcPr>
+            <w:tcW w:w="818" w:type="dxa"/>
+            <w:tcBorders>
+              <w:top w:val="single" w:sz="4" w:space="0" w:color="000000"/>
+              <w:start w:val="single" w:sz="4" w:space="0" w:color="000000"/>
+              <w:bottom w:val="single" w:sz="4" w:space="0" w:color="000000"/>
+              <w:end w:val="single" w:sz="4" w:space="0" w:color="000000"/>
+            </w:tcBorders>
+          </w:tcPr>
+          <w:p>
+            <w:pPr>
+              <w:keepNext/>
+              <w:spacing w:before="0" w:after="0"/>
+              <w:jc w:val="center"/>
+            </w:pPr>
+            <w:r>
+              <w:rPr>
+                <w:rFonts w:ascii="Times New Roman" w:hAnsi="Times New Roman"/>
+                <w:sz w:val="18"/>
+                <w:szCs w:val="18"/>
+              </w:rPr>
+              <w:t xml:space="preserve">Union R@</w:t>
             </w:r>
           </w:p>
         </w:tc>
@@ -10032,57 +11810,31 @@
                 <w:sz w:val="18"/>
                 <w:szCs w:val="18"/>
               </w:rPr>
-              <w:t xml:space="preserve">R@</w:t>
-            </w:r>
-          </w:p>
-        </w:tc>
-        <w:tc>
-          <w:tcPr>
-            <w:tcW w:w="620" w:type="dxa"/>
-            <w:tcBorders>
-              <w:top w:val="single" w:sz="4" w:space="0" w:color="000000"/>
-              <w:start w:val="single" w:sz="4" w:space="0" w:color="000000"/>
-              <w:bottom w:val="single" w:sz="4" w:space="0" w:color="000000"/>
-              <w:end w:val="single" w:sz="4" w:space="0" w:color="000000"/>
-            </w:tcBorders>
-          </w:tcPr>
-          <w:p>
-            <w:pPr>
-              <w:keepNext/>
-              <w:spacing w:before="0" w:after="0"/>
-              <w:jc w:val="center"/>
-            </w:pPr>
-            <w:r>
-              <w:rPr>
-                <w:rFonts w:ascii="Times New Roman" w:hAnsi="Times New Roman"/>
-                <w:sz w:val="18"/>
-                <w:szCs w:val="18"/>
-              </w:rPr>
               <w:t xml:space="preserve">GT</w:t>
             </w:r>
           </w:p>
         </w:tc>
         <w:tc>
           <w:tcPr>
-            <w:tcW w:w="620" w:type="dxa"/>
-            <w:tcBorders>
-              <w:top w:val="single" w:sz="4" w:space="0" w:color="000000"/>
-              <w:start w:val="single" w:sz="4" w:space="0" w:color="000000"/>
-              <w:bottom w:val="single" w:sz="4" w:space="0" w:color="000000"/>
-              <w:end w:val="single" w:sz="4" w:space="0" w:color="000000"/>
-            </w:tcBorders>
-          </w:tcPr>
-          <w:p>
-            <w:pPr>
-              <w:keepNext/>
-              <w:spacing w:before="0" w:after="0"/>
-              <w:jc w:val="center"/>
-            </w:pPr>
-          </w:p>
-        </w:tc>
-        <w:tc>
-          <w:tcPr>
-            <w:tcW w:w="820" w:type="dxa"/>
+            <w:tcW w:w="220" w:type="dxa"/>
+            <w:tcBorders>
+              <w:top w:val="single" w:sz="4" w:space="0" w:color="000000"/>
+              <w:start w:val="single" w:sz="4" w:space="0" w:color="000000"/>
+              <w:bottom w:val="single" w:sz="4" w:space="0" w:color="000000"/>
+              <w:end w:val="single" w:sz="4" w:space="0" w:color="000000"/>
+            </w:tcBorders>
+          </w:tcPr>
+          <w:p>
+            <w:pPr>
+              <w:keepNext/>
+              <w:spacing w:before="0" w:after="0"/>
+              <w:jc w:val="center"/>
+            </w:pPr>
+          </w:p>
+        </w:tc>
+        <w:tc>
+          <w:tcPr>
+            <w:tcW w:w="821" w:type="dxa"/>
             <w:tcBorders>
               <w:top w:val="single" w:sz="4" w:space="0" w:color="000000"/>
               <w:start w:val="single" w:sz="4" w:space="0" w:color="000000"/>
@@ -10103,32 +11855,6 @@
                 <w:szCs w:val="18"/>
               </w:rPr>
               <w:t xml:space="preserve">Oracle</w:t>
-            </w:r>
-          </w:p>
-        </w:tc>
-        <w:tc>
-          <w:tcPr>
-            <w:tcW w:w="521" w:type="dxa"/>
-            <w:tcBorders>
-              <w:top w:val="single" w:sz="4" w:space="0" w:color="000000"/>
-              <w:start w:val="single" w:sz="4" w:space="0" w:color="000000"/>
-              <w:bottom w:val="single" w:sz="4" w:space="0" w:color="000000"/>
-              <w:end w:val="single" w:sz="4" w:space="0" w:color="000000"/>
-            </w:tcBorders>
-          </w:tcPr>
-          <w:p>
-            <w:pPr>
-              <w:keepNext/>
-              <w:spacing w:before="0" w:after="0"/>
-              <w:jc w:val="center"/>
-            </w:pPr>
-            <w:r>
-              <w:rPr>
-                <w:rFonts w:ascii="Times New Roman" w:hAnsi="Times New Roman"/>
-                <w:sz w:val="18"/>
-                <w:szCs w:val="18"/>
-              </w:rPr>
-              <w:t xml:space="preserve">Gap</w:t>
             </w:r>
           </w:p>
         </w:tc>
@@ -10139,7 +11865,7 @@
         </w:trPr>
         <w:tc>
           <w:tcPr>
-            <w:tcW w:w="1250" w:type="dxa"/>
+            <w:tcW w:w="1520" w:type="dxa"/>
             <w:tcBorders>
               <w:top w:val="single" w:sz="4" w:space="0" w:color="000000"/>
               <w:start w:val="single" w:sz="4" w:space="0" w:color="000000"/>
@@ -10159,6 +11885,32 @@
                 <w:sz w:val="18"/>
                 <w:szCs w:val="18"/>
               </w:rPr>
+              <w:t xml:space="preserve">Qwen3-8B</w:t>
+            </w:r>
+          </w:p>
+        </w:tc>
+        <w:tc>
+          <w:tcPr>
+            <w:tcW w:w="1513" w:type="dxa"/>
+            <w:tcBorders>
+              <w:top w:val="single" w:sz="4" w:space="0" w:color="000000"/>
+              <w:start w:val="single" w:sz="4" w:space="0" w:color="000000"/>
+              <w:bottom w:val="single" w:sz="4" w:space="0" w:color="000000"/>
+              <w:end w:val="single" w:sz="4" w:space="0" w:color="000000"/>
+            </w:tcBorders>
+          </w:tcPr>
+          <w:p>
+            <w:pPr>
+              <w:keepNext/>
+              <w:spacing w:before="0" w:after="0"/>
+              <w:jc w:val="center"/>
+            </w:pPr>
+            <w:r>
+              <w:rPr>
+                <w:rFonts w:ascii="Times New Roman" w:hAnsi="Times New Roman"/>
+                <w:sz w:val="18"/>
+                <w:szCs w:val="18"/>
+              </w:rPr>
               <w:t xml:space="preserve">no</w:t>
             </w:r>
           </w:p>
@@ -10185,13 +11937,13 @@
                 <w:sz w:val="18"/>
                 <w:szCs w:val="18"/>
               </w:rPr>
-              <w:t xml:space="preserve">17</w:t>
-            </w:r>
-          </w:p>
-        </w:tc>
-        <w:tc>
-          <w:tcPr>
-            <w:tcW w:w="1566" w:type="dxa"/>
+              <w:t xml:space="preserve">18</w:t>
+            </w:r>
+          </w:p>
+        </w:tc>
+        <w:tc>
+          <w:tcPr>
+            <w:tcW w:w="2172" w:type="dxa"/>
             <w:tcBorders>
               <w:top w:val="single" w:sz="4" w:space="0" w:color="000000"/>
               <w:start w:val="single" w:sz="4" w:space="0" w:color="000000"/>
@@ -10217,27 +11969,27 @@
         </w:tc>
         <w:tc>
           <w:tcPr>
-            <w:tcW w:w="1667" w:type="dxa"/>
-            <w:tcBorders>
-              <w:top w:val="single" w:sz="4" w:space="0" w:color="000000"/>
-              <w:start w:val="single" w:sz="4" w:space="0" w:color="000000"/>
-              <w:bottom w:val="single" w:sz="4" w:space="0" w:color="000000"/>
-              <w:end w:val="single" w:sz="4" w:space="0" w:color="000000"/>
-            </w:tcBorders>
-          </w:tcPr>
-          <w:p>
-            <w:pPr>
-              <w:keepNext/>
-              <w:spacing w:before="0" w:after="0"/>
-              <w:jc w:val="center"/>
-            </w:pPr>
-            <w:r>
-              <w:rPr>
-                <w:rFonts w:ascii="Times New Roman" w:hAnsi="Times New Roman"/>
-                <w:sz w:val="18"/>
-                <w:szCs w:val="18"/>
-              </w:rPr>
-              <w:t xml:space="preserve">76%</w:t>
+            <w:tcW w:w="818" w:type="dxa"/>
+            <w:tcBorders>
+              <w:top w:val="single" w:sz="4" w:space="0" w:color="000000"/>
+              <w:start w:val="single" w:sz="4" w:space="0" w:color="000000"/>
+              <w:bottom w:val="single" w:sz="4" w:space="0" w:color="000000"/>
+              <w:end w:val="single" w:sz="4" w:space="0" w:color="000000"/>
+            </w:tcBorders>
+          </w:tcPr>
+          <w:p>
+            <w:pPr>
+              <w:keepNext/>
+              <w:spacing w:before="0" w:after="0"/>
+              <w:jc w:val="center"/>
+            </w:pPr>
+            <w:r>
+              <w:rPr>
+                <w:rFonts w:ascii="Times New Roman" w:hAnsi="Times New Roman"/>
+                <w:sz w:val="18"/>
+                <w:szCs w:val="18"/>
+              </w:rPr>
+              <w:t xml:space="preserve">0.61</w:t>
             </w:r>
           </w:p>
         </w:tc>
@@ -10263,83 +12015,31 @@
                 <w:sz w:val="18"/>
                 <w:szCs w:val="18"/>
               </w:rPr>
-              <w:t xml:space="preserve">0.60</w:t>
-            </w:r>
-          </w:p>
-        </w:tc>
-        <w:tc>
-          <w:tcPr>
-            <w:tcW w:w="620" w:type="dxa"/>
-            <w:tcBorders>
-              <w:top w:val="single" w:sz="4" w:space="0" w:color="000000"/>
-              <w:start w:val="single" w:sz="4" w:space="0" w:color="000000"/>
-              <w:bottom w:val="single" w:sz="4" w:space="0" w:color="000000"/>
-              <w:end w:val="single" w:sz="4" w:space="0" w:color="000000"/>
-            </w:tcBorders>
-          </w:tcPr>
-          <w:p>
-            <w:pPr>
-              <w:keepNext/>
-              <w:spacing w:before="0" w:after="0"/>
-              <w:jc w:val="center"/>
-            </w:pPr>
-            <w:r>
-              <w:rPr>
-                <w:rFonts w:ascii="Times New Roman" w:hAnsi="Times New Roman"/>
-                <w:sz w:val="18"/>
-                <w:szCs w:val="18"/>
-              </w:rPr>
-              <w:t xml:space="preserve">0.73</w:t>
-            </w:r>
-          </w:p>
-        </w:tc>
-        <w:tc>
-          <w:tcPr>
-            <w:tcW w:w="620" w:type="dxa"/>
-            <w:tcBorders>
-              <w:top w:val="single" w:sz="4" w:space="0" w:color="000000"/>
-              <w:start w:val="single" w:sz="4" w:space="0" w:color="000000"/>
-              <w:bottom w:val="single" w:sz="4" w:space="0" w:color="000000"/>
-              <w:end w:val="single" w:sz="4" w:space="0" w:color="000000"/>
-            </w:tcBorders>
-          </w:tcPr>
-          <w:p>
-            <w:pPr>
-              <w:keepNext/>
-              <w:spacing w:before="0" w:after="0"/>
-              <w:jc w:val="center"/>
-            </w:pPr>
-            <w:r>
-              <w:rPr>
-                <w:rFonts w:ascii="Times New Roman" w:hAnsi="Times New Roman"/>
-                <w:sz w:val="18"/>
-                <w:szCs w:val="18"/>
-              </w:rPr>
-              <w:t xml:space="preserve">0.13</w:t>
-            </w:r>
-          </w:p>
-        </w:tc>
-        <w:tc>
-          <w:tcPr>
-            <w:tcW w:w="820" w:type="dxa"/>
-            <w:tcBorders>
-              <w:top w:val="single" w:sz="4" w:space="0" w:color="000000"/>
-              <w:start w:val="single" w:sz="4" w:space="0" w:color="000000"/>
-              <w:bottom w:val="single" w:sz="4" w:space="0" w:color="000000"/>
-              <w:end w:val="single" w:sz="4" w:space="0" w:color="000000"/>
-            </w:tcBorders>
-          </w:tcPr>
-          <w:p>
-            <w:pPr>
-              <w:keepNext/>
-              <w:spacing w:before="0" w:after="0"/>
-              <w:jc w:val="center"/>
-            </w:pPr>
-          </w:p>
-        </w:tc>
-        <w:tc>
-          <w:tcPr>
-            <w:tcW w:w="521" w:type="dxa"/>
+              <w:t xml:space="preserve">0.68</w:t>
+            </w:r>
+          </w:p>
+        </w:tc>
+        <w:tc>
+          <w:tcPr>
+            <w:tcW w:w="220" w:type="dxa"/>
+            <w:tcBorders>
+              <w:top w:val="single" w:sz="4" w:space="0" w:color="000000"/>
+              <w:start w:val="single" w:sz="4" w:space="0" w:color="000000"/>
+              <w:bottom w:val="single" w:sz="4" w:space="0" w:color="000000"/>
+              <w:end w:val="single" w:sz="4" w:space="0" w:color="000000"/>
+            </w:tcBorders>
+          </w:tcPr>
+          <w:p>
+            <w:pPr>
+              <w:keepNext/>
+              <w:spacing w:before="0" w:after="0"/>
+              <w:jc w:val="center"/>
+            </w:pPr>
+          </w:p>
+        </w:tc>
+        <w:tc>
+          <w:tcPr>
+            <w:tcW w:w="821" w:type="dxa"/>
             <w:tcBorders>
               <w:top w:val="single" w:sz="4" w:space="0" w:color="000000"/>
               <w:start w:val="single" w:sz="4" w:space="0" w:color="000000"/>
@@ -10362,16 +12062,17 @@
         </w:trPr>
         <w:tc>
           <w:tcPr>
-            <w:tcW w:w="1250" w:type="dxa"/>
-            <w:tcBorders>
-              <w:top w:val="single" w:sz="4" w:space="0" w:color="000000"/>
-              <w:start w:val="single" w:sz="4" w:space="0" w:color="000000"/>
-              <w:bottom w:val="single" w:sz="4" w:space="0" w:color="000000"/>
-              <w:end w:val="single" w:sz="4" w:space="0" w:color="000000"/>
-            </w:tcBorders>
-          </w:tcPr>
-          <w:p>
-            <w:pPr>
+            <w:tcW w:w="1520" w:type="dxa"/>
+            <w:tcBorders>
+              <w:top w:val="single" w:sz="4" w:space="0" w:color="000000"/>
+              <w:start w:val="single" w:sz="4" w:space="0" w:color="000000"/>
+              <w:bottom w:val="single" w:sz="4" w:space="0" w:color="000000"/>
+              <w:end w:val="single" w:sz="4" w:space="0" w:color="000000"/>
+            </w:tcBorders>
+          </w:tcPr>
+          <w:p>
+            <w:pPr>
+              <w:keepNext/>
               <w:spacing w:before="0" w:after="0"/>
               <w:jc w:val="left"/>
             </w:pPr>
@@ -10381,6 +12082,32 @@
                 <w:sz w:val="18"/>
                 <w:szCs w:val="18"/>
               </w:rPr>
+              <w:t xml:space="preserve">Qwen3-8B</w:t>
+            </w:r>
+          </w:p>
+        </w:tc>
+        <w:tc>
+          <w:tcPr>
+            <w:tcW w:w="1513" w:type="dxa"/>
+            <w:tcBorders>
+              <w:top w:val="single" w:sz="4" w:space="0" w:color="000000"/>
+              <w:start w:val="single" w:sz="4" w:space="0" w:color="000000"/>
+              <w:bottom w:val="single" w:sz="4" w:space="0" w:color="000000"/>
+              <w:end w:val="single" w:sz="4" w:space="0" w:color="000000"/>
+            </w:tcBorders>
+          </w:tcPr>
+          <w:p>
+            <w:pPr>
+              <w:keepNext/>
+              <w:spacing w:before="0" w:after="0"/>
+              <w:jc w:val="center"/>
+            </w:pPr>
+            <w:r>
+              <w:rPr>
+                <w:rFonts w:ascii="Times New Roman" w:hAnsi="Times New Roman"/>
+                <w:sz w:val="18"/>
+                <w:szCs w:val="18"/>
+              </w:rPr>
               <w:t xml:space="preserve">yes</w:t>
             </w:r>
           </w:p>
@@ -10397,66 +12124,69 @@
           </w:tcPr>
           <w:p>
             <w:pPr>
-              <w:spacing w:before="0" w:after="0"/>
-              <w:jc w:val="center"/>
-            </w:pPr>
-            <w:r>
-              <w:rPr>
-                <w:rFonts w:ascii="Times New Roman" w:hAnsi="Times New Roman"/>
-                <w:sz w:val="18"/>
-                <w:szCs w:val="18"/>
-              </w:rPr>
-              <w:t xml:space="preserve">14</w:t>
-            </w:r>
-          </w:p>
-        </w:tc>
-        <w:tc>
-          <w:tcPr>
-            <w:tcW w:w="1566" w:type="dxa"/>
-            <w:tcBorders>
-              <w:top w:val="single" w:sz="4" w:space="0" w:color="000000"/>
-              <w:start w:val="single" w:sz="4" w:space="0" w:color="000000"/>
-              <w:bottom w:val="single" w:sz="4" w:space="0" w:color="000000"/>
-              <w:end w:val="single" w:sz="4" w:space="0" w:color="000000"/>
-            </w:tcBorders>
-          </w:tcPr>
-          <w:p>
-            <w:pPr>
-              <w:spacing w:before="0" w:after="0"/>
-              <w:jc w:val="center"/>
-            </w:pPr>
-            <w:r>
-              <w:rPr>
-                <w:rFonts w:ascii="Times New Roman" w:hAnsi="Times New Roman"/>
-                <w:sz w:val="18"/>
-                <w:szCs w:val="18"/>
-              </w:rPr>
-              <w:t xml:space="preserve">63%</w:t>
-            </w:r>
-          </w:p>
-        </w:tc>
-        <w:tc>
-          <w:tcPr>
-            <w:tcW w:w="1667" w:type="dxa"/>
-            <w:tcBorders>
-              <w:top w:val="single" w:sz="4" w:space="0" w:color="000000"/>
-              <w:start w:val="single" w:sz="4" w:space="0" w:color="000000"/>
-              <w:bottom w:val="single" w:sz="4" w:space="0" w:color="000000"/>
-              <w:end w:val="single" w:sz="4" w:space="0" w:color="000000"/>
-            </w:tcBorders>
-          </w:tcPr>
-          <w:p>
-            <w:pPr>
-              <w:spacing w:before="0" w:after="0"/>
-              <w:jc w:val="center"/>
-            </w:pPr>
-            <w:r>
-              <w:rPr>
-                <w:rFonts w:ascii="Times New Roman" w:hAnsi="Times New Roman"/>
-                <w:sz w:val="18"/>
-                <w:szCs w:val="18"/>
-              </w:rPr>
-              <w:t xml:space="preserve">30%</w:t>
+              <w:keepNext/>
+              <w:spacing w:before="0" w:after="0"/>
+              <w:jc w:val="center"/>
+            </w:pPr>
+            <w:r>
+              <w:rPr>
+                <w:rFonts w:ascii="Times New Roman" w:hAnsi="Times New Roman"/>
+                <w:sz w:val="18"/>
+                <w:szCs w:val="18"/>
+              </w:rPr>
+              <w:t xml:space="preserve">15</w:t>
+            </w:r>
+          </w:p>
+        </w:tc>
+        <w:tc>
+          <w:tcPr>
+            <w:tcW w:w="2172" w:type="dxa"/>
+            <w:tcBorders>
+              <w:top w:val="single" w:sz="4" w:space="0" w:color="000000"/>
+              <w:start w:val="single" w:sz="4" w:space="0" w:color="000000"/>
+              <w:bottom w:val="single" w:sz="4" w:space="0" w:color="000000"/>
+              <w:end w:val="single" w:sz="4" w:space="0" w:color="000000"/>
+            </w:tcBorders>
+          </w:tcPr>
+          <w:p>
+            <w:pPr>
+              <w:keepNext/>
+              <w:spacing w:before="0" w:after="0"/>
+              <w:jc w:val="center"/>
+            </w:pPr>
+            <w:r>
+              <w:rPr>
+                <w:rFonts w:ascii="Times New Roman" w:hAnsi="Times New Roman"/>
+                <w:sz w:val="18"/>
+                <w:szCs w:val="18"/>
+              </w:rPr>
+              <w:t xml:space="preserve">60%</w:t>
+            </w:r>
+          </w:p>
+        </w:tc>
+        <w:tc>
+          <w:tcPr>
+            <w:tcW w:w="818" w:type="dxa"/>
+            <w:tcBorders>
+              <w:top w:val="single" w:sz="4" w:space="0" w:color="000000"/>
+              <w:start w:val="single" w:sz="4" w:space="0" w:color="000000"/>
+              <w:bottom w:val="single" w:sz="4" w:space="0" w:color="000000"/>
+              <w:end w:val="single" w:sz="4" w:space="0" w:color="000000"/>
+            </w:tcBorders>
+          </w:tcPr>
+          <w:p>
+            <w:pPr>
+              <w:keepNext/>
+              <w:spacing w:before="0" w:after="0"/>
+              <w:jc w:val="center"/>
+            </w:pPr>
+            <w:r>
+              <w:rPr>
+                <w:rFonts w:ascii="Times New Roman" w:hAnsi="Times New Roman"/>
+                <w:sz w:val="18"/>
+                <w:szCs w:val="18"/>
+              </w:rPr>
+              <w:t xml:space="preserve">0.13</w:t>
             </w:r>
           </w:p>
         </w:tc>
@@ -10472,16 +12202,188 @@
           </w:tcPr>
           <w:p>
             <w:pPr>
-              <w:spacing w:before="0" w:after="0"/>
-              <w:jc w:val="center"/>
-            </w:pPr>
-            <w:r>
-              <w:rPr>
-                <w:rFonts w:ascii="Times New Roman" w:hAnsi="Times New Roman"/>
-                <w:sz w:val="18"/>
-                <w:szCs w:val="18"/>
-              </w:rPr>
-              <w:t xml:space="preserve">0.13</w:t>
+              <w:keepNext/>
+              <w:spacing w:before="0" w:after="0"/>
+              <w:jc w:val="center"/>
+            </w:pPr>
+            <w:r>
+              <w:rPr>
+                <w:rFonts w:ascii="Times New Roman" w:hAnsi="Times New Roman"/>
+                <w:sz w:val="18"/>
+                <w:szCs w:val="18"/>
+              </w:rPr>
+              <w:t xml:space="preserve">0.41</w:t>
+            </w:r>
+          </w:p>
+        </w:tc>
+        <w:tc>
+          <w:tcPr>
+            <w:tcW w:w="220" w:type="dxa"/>
+            <w:tcBorders>
+              <w:top w:val="single" w:sz="4" w:space="0" w:color="000000"/>
+              <w:start w:val="single" w:sz="4" w:space="0" w:color="000000"/>
+              <w:bottom w:val="single" w:sz="4" w:space="0" w:color="000000"/>
+              <w:end w:val="single" w:sz="4" w:space="0" w:color="000000"/>
+            </w:tcBorders>
+          </w:tcPr>
+          <w:p>
+            <w:pPr>
+              <w:keepNext/>
+              <w:spacing w:before="0" w:after="0"/>
+              <w:jc w:val="center"/>
+            </w:pPr>
+          </w:p>
+        </w:tc>
+        <w:tc>
+          <w:tcPr>
+            <w:tcW w:w="821" w:type="dxa"/>
+            <w:tcBorders>
+              <w:top w:val="single" w:sz="4" w:space="0" w:color="000000"/>
+              <w:start w:val="single" w:sz="4" w:space="0" w:color="000000"/>
+              <w:bottom w:val="single" w:sz="4" w:space="0" w:color="000000"/>
+              <w:end w:val="single" w:sz="4" w:space="0" w:color="000000"/>
+            </w:tcBorders>
+          </w:tcPr>
+          <w:p>
+            <w:pPr>
+              <w:keepNext/>
+              <w:spacing w:before="0" w:after="0"/>
+              <w:jc w:val="center"/>
+            </w:pPr>
+          </w:p>
+        </w:tc>
+      </w:tr>
+      <w:tr>
+        <w:trPr>
+          <w:cantSplit/>
+        </w:trPr>
+        <w:tc>
+          <w:tcPr>
+            <w:tcW w:w="1520" w:type="dxa"/>
+            <w:tcBorders>
+              <w:top w:val="single" w:sz="4" w:space="0" w:color="000000"/>
+              <w:start w:val="single" w:sz="4" w:space="0" w:color="000000"/>
+              <w:bottom w:val="single" w:sz="4" w:space="0" w:color="000000"/>
+              <w:end w:val="single" w:sz="4" w:space="0" w:color="000000"/>
+            </w:tcBorders>
+          </w:tcPr>
+          <w:p>
+            <w:pPr>
+              <w:keepNext/>
+              <w:spacing w:before="0" w:after="0"/>
+              <w:jc w:val="left"/>
+            </w:pPr>
+            <w:r>
+              <w:rPr>
+                <w:rFonts w:ascii="Times New Roman" w:hAnsi="Times New Roman"/>
+                <w:sz w:val="18"/>
+                <w:szCs w:val="18"/>
+              </w:rPr>
+              <w:t xml:space="preserve">GLM-5.3-Flash</w:t>
+            </w:r>
+          </w:p>
+        </w:tc>
+        <w:tc>
+          <w:tcPr>
+            <w:tcW w:w="1513" w:type="dxa"/>
+            <w:tcBorders>
+              <w:top w:val="single" w:sz="4" w:space="0" w:color="000000"/>
+              <w:start w:val="single" w:sz="4" w:space="0" w:color="000000"/>
+              <w:bottom w:val="single" w:sz="4" w:space="0" w:color="000000"/>
+              <w:end w:val="single" w:sz="4" w:space="0" w:color="000000"/>
+            </w:tcBorders>
+          </w:tcPr>
+          <w:p>
+            <w:pPr>
+              <w:keepNext/>
+              <w:spacing w:before="0" w:after="0"/>
+              <w:jc w:val="center"/>
+            </w:pPr>
+            <w:r>
+              <w:rPr>
+                <w:rFonts w:ascii="Times New Roman" w:hAnsi="Times New Roman"/>
+                <w:sz w:val="18"/>
+                <w:szCs w:val="18"/>
+              </w:rPr>
+              <w:t xml:space="preserve">no</w:t>
+            </w:r>
+          </w:p>
+        </w:tc>
+        <w:tc>
+          <w:tcPr>
+            <w:tcW w:w="820" w:type="dxa"/>
+            <w:tcBorders>
+              <w:top w:val="single" w:sz="4" w:space="0" w:color="000000"/>
+              <w:start w:val="single" w:sz="4" w:space="0" w:color="000000"/>
+              <w:bottom w:val="single" w:sz="4" w:space="0" w:color="000000"/>
+              <w:end w:val="single" w:sz="4" w:space="0" w:color="000000"/>
+            </w:tcBorders>
+          </w:tcPr>
+          <w:p>
+            <w:pPr>
+              <w:keepNext/>
+              <w:spacing w:before="0" w:after="0"/>
+              <w:jc w:val="center"/>
+            </w:pPr>
+            <w:r>
+              <w:rPr>
+                <w:rFonts w:ascii="Times New Roman" w:hAnsi="Times New Roman"/>
+                <w:sz w:val="18"/>
+                <w:szCs w:val="18"/>
+              </w:rPr>
+              <w:t xml:space="preserve">22</w:t>
+            </w:r>
+          </w:p>
+        </w:tc>
+        <w:tc>
+          <w:tcPr>
+            <w:tcW w:w="2172" w:type="dxa"/>
+            <w:tcBorders>
+              <w:top w:val="single" w:sz="4" w:space="0" w:color="000000"/>
+              <w:start w:val="single" w:sz="4" w:space="0" w:color="000000"/>
+              <w:bottom w:val="single" w:sz="4" w:space="0" w:color="000000"/>
+              <w:end w:val="single" w:sz="4" w:space="0" w:color="000000"/>
+            </w:tcBorders>
+          </w:tcPr>
+          <w:p>
+            <w:pPr>
+              <w:keepNext/>
+              <w:spacing w:before="0" w:after="0"/>
+              <w:jc w:val="center"/>
+            </w:pPr>
+            <w:r>
+              <w:rPr>
+                <w:rFonts w:ascii="Times New Roman" w:hAnsi="Times New Roman"/>
+                <w:sz w:val="18"/>
+                <w:szCs w:val="18"/>
+              </w:rPr>
+              <w:t xml:space="preserve">0%</w:t>
+            </w:r>
+          </w:p>
+        </w:tc>
+        <w:tc>
+          <w:tcPr>
+            <w:tcW w:w="818" w:type="dxa"/>
+            <w:tcBorders>
+              <w:top w:val="single" w:sz="4" w:space="0" w:color="000000"/>
+              <w:start w:val="single" w:sz="4" w:space="0" w:color="000000"/>
+              <w:bottom w:val="single" w:sz="4" w:space="0" w:color="000000"/>
+              <w:end w:val="single" w:sz="4" w:space="0" w:color="000000"/>
+            </w:tcBorders>
+          </w:tcPr>
+          <w:p>
+            <w:pPr>
+              <w:keepNext/>
+              <w:spacing w:before="0" w:after="0"/>
+              <w:jc w:val="center"/>
+            </w:pPr>
+            <w:r>
+              <w:rPr>
+                <w:rFonts w:ascii="Times New Roman" w:hAnsi="Times New Roman"/>
+                <w:sz w:val="18"/>
+                <w:szCs w:val="18"/>
+              </w:rPr>
+              <w:t xml:space="preserve">0.82</w:t>
             </w:r>
           </w:p>
         </w:tc>
@@ -10497,16 +12399,183 @@
           </w:tcPr>
           <w:p>
             <w:pPr>
-              <w:spacing w:before="0" w:after="0"/>
-              <w:jc w:val="center"/>
-            </w:pPr>
-            <w:r>
-              <w:rPr>
-                <w:rFonts w:ascii="Times New Roman" w:hAnsi="Times New Roman"/>
-                <w:sz w:val="18"/>
-                <w:szCs w:val="18"/>
-              </w:rPr>
-              <w:t xml:space="preserve">0.41</w:t>
+              <w:keepNext/>
+              <w:spacing w:before="0" w:after="0"/>
+              <w:jc w:val="center"/>
+            </w:pPr>
+            <w:r>
+              <w:rPr>
+                <w:rFonts w:ascii="Times New Roman" w:hAnsi="Times New Roman"/>
+                <w:sz w:val="18"/>
+                <w:szCs w:val="18"/>
+              </w:rPr>
+              <w:t xml:space="preserve">0.83</w:t>
+            </w:r>
+          </w:p>
+        </w:tc>
+        <w:tc>
+          <w:tcPr>
+            <w:tcW w:w="220" w:type="dxa"/>
+            <w:tcBorders>
+              <w:top w:val="single" w:sz="4" w:space="0" w:color="000000"/>
+              <w:start w:val="single" w:sz="4" w:space="0" w:color="000000"/>
+              <w:bottom w:val="single" w:sz="4" w:space="0" w:color="000000"/>
+              <w:end w:val="single" w:sz="4" w:space="0" w:color="000000"/>
+            </w:tcBorders>
+          </w:tcPr>
+          <w:p>
+            <w:pPr>
+              <w:keepNext/>
+              <w:spacing w:before="0" w:after="0"/>
+              <w:jc w:val="center"/>
+            </w:pPr>
+          </w:p>
+        </w:tc>
+        <w:tc>
+          <w:tcPr>
+            <w:tcW w:w="821" w:type="dxa"/>
+            <w:tcBorders>
+              <w:top w:val="single" w:sz="4" w:space="0" w:color="000000"/>
+              <w:start w:val="single" w:sz="4" w:space="0" w:color="000000"/>
+              <w:bottom w:val="single" w:sz="4" w:space="0" w:color="000000"/>
+              <w:end w:val="single" w:sz="4" w:space="0" w:color="000000"/>
+            </w:tcBorders>
+          </w:tcPr>
+          <w:p>
+            <w:pPr>
+              <w:keepNext/>
+              <w:spacing w:before="0" w:after="0"/>
+              <w:jc w:val="center"/>
+            </w:pPr>
+          </w:p>
+        </w:tc>
+      </w:tr>
+      <w:tr>
+        <w:trPr>
+          <w:cantSplit/>
+        </w:trPr>
+        <w:tc>
+          <w:tcPr>
+            <w:tcW w:w="1520" w:type="dxa"/>
+            <w:tcBorders>
+              <w:top w:val="single" w:sz="4" w:space="0" w:color="000000"/>
+              <w:start w:val="single" w:sz="4" w:space="0" w:color="000000"/>
+              <w:bottom w:val="single" w:sz="4" w:space="0" w:color="000000"/>
+              <w:end w:val="single" w:sz="4" w:space="0" w:color="000000"/>
+            </w:tcBorders>
+          </w:tcPr>
+          <w:p>
+            <w:pPr>
+              <w:spacing w:before="0" w:after="0"/>
+              <w:jc w:val="left"/>
+            </w:pPr>
+            <w:r>
+              <w:rPr>
+                <w:rFonts w:ascii="Times New Roman" w:hAnsi="Times New Roman"/>
+                <w:sz w:val="18"/>
+                <w:szCs w:val="18"/>
+              </w:rPr>
+              <w:t xml:space="preserve">GLM-5.3-Flash</w:t>
+            </w:r>
+          </w:p>
+        </w:tc>
+        <w:tc>
+          <w:tcPr>
+            <w:tcW w:w="1513" w:type="dxa"/>
+            <w:tcBorders>
+              <w:top w:val="single" w:sz="4" w:space="0" w:color="000000"/>
+              <w:start w:val="single" w:sz="4" w:space="0" w:color="000000"/>
+              <w:bottom w:val="single" w:sz="4" w:space="0" w:color="000000"/>
+              <w:end w:val="single" w:sz="4" w:space="0" w:color="000000"/>
+            </w:tcBorders>
+          </w:tcPr>
+          <w:p>
+            <w:pPr>
+              <w:spacing w:before="0" w:after="0"/>
+              <w:jc w:val="center"/>
+            </w:pPr>
+            <w:r>
+              <w:rPr>
+                <w:rFonts w:ascii="Times New Roman" w:hAnsi="Times New Roman"/>
+                <w:sz w:val="18"/>
+                <w:szCs w:val="18"/>
+              </w:rPr>
+              <w:t xml:space="preserve">yes</w:t>
+            </w:r>
+          </w:p>
+        </w:tc>
+        <w:tc>
+          <w:tcPr>
+            <w:tcW w:w="820" w:type="dxa"/>
+            <w:tcBorders>
+              <w:top w:val="single" w:sz="4" w:space="0" w:color="000000"/>
+              <w:start w:val="single" w:sz="4" w:space="0" w:color="000000"/>
+              <w:bottom w:val="single" w:sz="4" w:space="0" w:color="000000"/>
+              <w:end w:val="single" w:sz="4" w:space="0" w:color="000000"/>
+            </w:tcBorders>
+          </w:tcPr>
+          <w:p>
+            <w:pPr>
+              <w:spacing w:before="0" w:after="0"/>
+              <w:jc w:val="center"/>
+            </w:pPr>
+            <w:r>
+              <w:rPr>
+                <w:rFonts w:ascii="Times New Roman" w:hAnsi="Times New Roman"/>
+                <w:sz w:val="18"/>
+                <w:szCs w:val="18"/>
+              </w:rPr>
+              <w:t xml:space="preserve">13</w:t>
+            </w:r>
+          </w:p>
+        </w:tc>
+        <w:tc>
+          <w:tcPr>
+            <w:tcW w:w="2172" w:type="dxa"/>
+            <w:tcBorders>
+              <w:top w:val="single" w:sz="4" w:space="0" w:color="000000"/>
+              <w:start w:val="single" w:sz="4" w:space="0" w:color="000000"/>
+              <w:bottom w:val="single" w:sz="4" w:space="0" w:color="000000"/>
+              <w:end w:val="single" w:sz="4" w:space="0" w:color="000000"/>
+            </w:tcBorders>
+          </w:tcPr>
+          <w:p>
+            <w:pPr>
+              <w:spacing w:before="0" w:after="0"/>
+              <w:jc w:val="center"/>
+            </w:pPr>
+            <w:r>
+              <w:rPr>
+                <w:rFonts w:ascii="Times New Roman" w:hAnsi="Times New Roman"/>
+                <w:sz w:val="18"/>
+                <w:szCs w:val="18"/>
+              </w:rPr>
+              <w:t xml:space="preserve">43%</w:t>
+            </w:r>
+          </w:p>
+        </w:tc>
+        <w:tc>
+          <w:tcPr>
+            <w:tcW w:w="818" w:type="dxa"/>
+            <w:tcBorders>
+              <w:top w:val="single" w:sz="4" w:space="0" w:color="000000"/>
+              <w:start w:val="single" w:sz="4" w:space="0" w:color="000000"/>
+              <w:bottom w:val="single" w:sz="4" w:space="0" w:color="000000"/>
+              <w:end w:val="single" w:sz="4" w:space="0" w:color="000000"/>
+            </w:tcBorders>
+          </w:tcPr>
+          <w:p>
+            <w:pPr>
+              <w:spacing w:before="0" w:after="0"/>
+              <w:jc w:val="center"/>
+            </w:pPr>
+            <w:r>
+              <w:rPr>
+                <w:rFonts w:ascii="Times New Roman" w:hAnsi="Times New Roman"/>
+                <w:sz w:val="18"/>
+                <w:szCs w:val="18"/>
+              </w:rPr>
+              <w:t xml:space="preserve">0.32</w:t>
             </w:r>
           </w:p>
         </w:tc>
@@ -10531,30 +12600,30 @@
                 <w:sz w:val="18"/>
                 <w:szCs w:val="18"/>
               </w:rPr>
-              <w:t xml:space="preserve">0.28</w:t>
-            </w:r>
-          </w:p>
-        </w:tc>
-        <w:tc>
-          <w:tcPr>
-            <w:tcW w:w="820" w:type="dxa"/>
-            <w:tcBorders>
-              <w:top w:val="single" w:sz="4" w:space="0" w:color="000000"/>
-              <w:start w:val="single" w:sz="4" w:space="0" w:color="000000"/>
-              <w:bottom w:val="single" w:sz="4" w:space="0" w:color="000000"/>
-              <w:end w:val="single" w:sz="4" w:space="0" w:color="000000"/>
-            </w:tcBorders>
-          </w:tcPr>
-          <w:p>
-            <w:pPr>
-              <w:spacing w:before="0" w:after="0"/>
-              <w:jc w:val="center"/>
-            </w:pPr>
-          </w:p>
-        </w:tc>
-        <w:tc>
-          <w:tcPr>
-            <w:tcW w:w="521" w:type="dxa"/>
+              <w:t xml:space="preserve">0.75</w:t>
+            </w:r>
+          </w:p>
+        </w:tc>
+        <w:tc>
+          <w:tcPr>
+            <w:tcW w:w="220" w:type="dxa"/>
+            <w:tcBorders>
+              <w:top w:val="single" w:sz="4" w:space="0" w:color="000000"/>
+              <w:start w:val="single" w:sz="4" w:space="0" w:color="000000"/>
+              <w:bottom w:val="single" w:sz="4" w:space="0" w:color="000000"/>
+              <w:end w:val="single" w:sz="4" w:space="0" w:color="000000"/>
+            </w:tcBorders>
+          </w:tcPr>
+          <w:p>
+            <w:pPr>
+              <w:spacing w:before="0" w:after="0"/>
+              <w:jc w:val="center"/>
+            </w:pPr>
+          </w:p>
+        </w:tc>
+        <w:tc>
+          <w:tcPr>
+            <w:tcW w:w="821" w:type="dxa"/>
             <w:tcBorders>
               <w:top w:val="single" w:sz="4" w:space="0" w:color="000000"/>
               <w:start w:val="single" w:sz="4" w:space="0" w:color="000000"/>
@@ -10597,14 +12666,28 @@
           <w:sz w:val="22"/>
           <w:szCs w:val="22"/>
         </w:rPr>
-        <w:t xml:space="preserve">A second failure concerns FHIR modelling knowledge. Referral and order tables (</w:t>
-      </w:r>
-      <w:r>
-        <w:rPr>
-          <w:sz w:val="22"/>
-          <w:szCs w:val="22"/>
-        </w:rPr>
-        <w:t xml:space="preserve">rujuk</w:t>
+        <w:t xml:space="preserve">A second failure concerns FHIR modelling knowledge. With the one-line catalogue, Qwen never assigned the five referral and order tables to ServiceRequest. A glossary that labelled the column </w:t>
+      </w:r>
+      <w:r>
+        <w:rPr>
+          <w:sz w:val="22"/>
+          <w:szCs w:val="22"/>
+        </w:rPr>
+        <w:t xml:space="preserve">rujuk_ke (EN: refer to)</w:t>
+      </w:r>
+      <w:r>
+        <w:rPr>
+          <w:sz w:val="22"/>
+          <w:szCs w:val="22"/>
+        </w:rPr>
+        <w:t xml:space="preserve"> left every stage-1 decision unchanged, so the model understands the Indonesian term but not the convention that a referral is a ServiceRequest. Longer specification text did not help, consistent with reports that both too little and too much context hurt LLM matching [11] and with long-context degradation [27]. Third, a negative instruction not to rank first a resource that the table only references, naming Encounter, Patient and Practitioner as examples, raised wrong rank-1 choices of Encounter from 7 to 14 of 41 tables, in line with known weaknesses of language models on negated prompts [28]. Finally, one held-out system uses generic column names (</w:t>
+      </w:r>
+      <w:r>
+        <w:rPr>
+          <w:sz w:val="22"/>
+          <w:szCs w:val="22"/>
+        </w:rPr>
+        <w:t xml:space="preserve">id</w:t>
       </w:r>
       <w:r>
         <w:rPr>
@@ -10618,7 +12701,7 @@
           <w:sz w:val="22"/>
           <w:szCs w:val="22"/>
         </w:rPr>
-        <w:t xml:space="preserve">rujuk_masuk</w:t>
+        <w:t xml:space="preserve">nama</w:t>
       </w:r>
       <w:r>
         <w:rPr>
@@ -10632,84 +12715,14 @@
           <w:sz w:val="22"/>
           <w:szCs w:val="22"/>
         </w:rPr>
-        <w:t xml:space="preserve">rujukan_internal_poli</w:t>
-      </w:r>
-      <w:r>
-        <w:rPr>
-          <w:sz w:val="22"/>
-          <w:szCs w:val="22"/>
-        </w:rPr>
-        <w:t xml:space="preserve">, </w:t>
-      </w:r>
-      <w:r>
-        <w:rPr>
-          <w:sz w:val="22"/>
-          <w:szCs w:val="22"/>
-        </w:rPr>
-        <w:t xml:space="preserve">permintaan_lab</w:t>
-      </w:r>
-      <w:r>
-        <w:rPr>
-          <w:sz w:val="22"/>
-          <w:szCs w:val="22"/>
-        </w:rPr>
-        <w:t xml:space="preserve">, </w:t>
-      </w:r>
-      <w:r>
-        <w:rPr>
-          <w:sz w:val="22"/>
-          <w:szCs w:val="22"/>
-        </w:rPr>
-        <w:t xml:space="preserve">permintaan_radiologi</w:t>
-      </w:r>
-      <w:r>
-        <w:rPr>
-          <w:sz w:val="22"/>
-          <w:szCs w:val="22"/>
-        </w:rPr>
-        <w:t xml:space="preserve">) were never assigned to ServiceRequest by Qwen's stage 1 with the </w:t>
-      </w:r>
-      <w:r>
-        <w:rPr>
-          <w:sz w:val="22"/>
-          <w:szCs w:val="22"/>
-        </w:rPr>
-        <w:t xml:space="preserve">short</w:t>
-      </w:r>
-      <w:r>
-        <w:rPr>
-          <w:sz w:val="22"/>
-          <w:szCs w:val="22"/>
-        </w:rPr>
-        <w:t xml:space="preserve"> catalogue (0/5). A glossary that labelled the column </w:t>
-      </w:r>
-      <w:r>
-        <w:rPr>
-          <w:sz w:val="22"/>
-          <w:szCs w:val="22"/>
-        </w:rPr>
-        <w:t xml:space="preserve">rujuk_ke (EN: refer to)</w:t>
-      </w:r>
-      <w:r>
-        <w:rPr>
-          <w:sz w:val="22"/>
-          <w:szCs w:val="22"/>
-        </w:rPr>
-        <w:t xml:space="preserve"> left every stage-1 decision unchanged, so the model understands the Indonesian term but not the convention that a referral is a FHIR ServiceRequest. The </w:t>
-      </w:r>
-      <w:r>
-        <w:rPr>
-          <w:sz w:val="22"/>
-          <w:szCs w:val="22"/>
-        </w:rPr>
-        <w:t xml:space="preserve">definition</w:t>
-      </w:r>
-      <w:r>
-        <w:rPr>
-          <w:sz w:val="22"/>
-          <w:szCs w:val="22"/>
-        </w:rPr>
-        <w:t xml:space="preserve"> text, which mentions referrals, recovered three of the seven hardest tables, while the longer specification text did not help further. This is consistent with reports that both too little and too much context hurt LLM matching [11] and with long-context degradation [27]. The section on ServiceRequest states that a request leads to a DiagnosticReport or Observation, and the 8B model then selected those resources; laboratory and radiology orders went to DiagnosticReport in every variant.</w:t>
+        <w:t xml:space="preserve">no_telepon</w:t>
+      </w:r>
+      <w:r>
+        <w:rPr>
+          <w:sz w:val="22"/>
+          <w:szCs w:val="22"/>
+        </w:rPr>
+        <w:t xml:space="preserve">) that cannot be told apart without the table name; Qwen scores 0 there in every non-oracle configuration against an oracle of 0.89.</w:t>
       </w:r>
     </w:p>
     <w:p>
@@ -10728,108 +12741,7 @@
           <w:szCs w:val="22"/>
           <w:lang w:val="id-ID"/>
         </w:rPr>
-        <w:t xml:space="preserve">Third, a negative instruction that named the failure backfired. An instruction telling stage 1 not to rank first a resource that the table only references, which named Encounter, Patient and Practitioner as examples, raised wrong rank-1 choices of Encounter from 7 to 14 of 41 tables and lowered rank-1 accuracy from 26/41 to 23/41. Naming the resource to avoid made the model more likely to choose it, in line with known weaknesses of language models on negated prompts [28]. Finally, one held-out system uses generic column names (</w:t>
-      </w:r>
-      <w:r>
-        <w:rPr>
-          <w:sz w:val="22"/>
-          <w:szCs w:val="22"/>
-          <w:lang w:val="id-ID"/>
-        </w:rPr>
-        <w:t xml:space="preserve">id</w:t>
-      </w:r>
-      <w:r>
-        <w:rPr>
-          <w:sz w:val="22"/>
-          <w:szCs w:val="22"/>
-          <w:lang w:val="id-ID"/>
-        </w:rPr>
-        <w:t xml:space="preserve">, </w:t>
-      </w:r>
-      <w:r>
-        <w:rPr>
-          <w:sz w:val="22"/>
-          <w:szCs w:val="22"/>
-          <w:lang w:val="id-ID"/>
-        </w:rPr>
-        <w:t xml:space="preserve">nama</w:t>
-      </w:r>
-      <w:r>
-        <w:rPr>
-          <w:sz w:val="22"/>
-          <w:szCs w:val="22"/>
-          <w:lang w:val="id-ID"/>
-        </w:rPr>
-        <w:t xml:space="preserve">, </w:t>
-      </w:r>
-      <w:r>
-        <w:rPr>
-          <w:sz w:val="22"/>
-          <w:szCs w:val="22"/>
-          <w:lang w:val="id-ID"/>
-        </w:rPr>
-        <w:t xml:space="preserve">no_telepon</w:t>
-      </w:r>
-      <w:r>
-        <w:rPr>
-          <w:sz w:val="22"/>
-          <w:szCs w:val="22"/>
-          <w:lang w:val="id-ID"/>
-        </w:rPr>
-        <w:t xml:space="preserve">). Its tables cannot be told apart without the table name, and Qwen scores 0 in every non-oracle configuration against an oracle of 0.89; for such schemas the table name is likely decisive. With a perfect choice among the stage-1 candidates, dev41 would reach 0.508, only 4.4 points below the oracle, so the remaining gap is almost entirely a resource-selection problem.</w:t>
-      </w:r>
-    </w:p>
-    <w:p>
-      <w:pPr>
-        <w:pStyle w:val="Text"/>
-        <w:ind w:firstLine="709" w:end="0"/>
-        <w:rPr>
-          <w:sz w:val="22"/>
-          <w:szCs w:val="22"/>
-          <w:lang w:val="id-ID"/>
-        </w:rPr>
-      </w:pPr>
-      <w:r>
-        <w:rPr>
-          <w:sz w:val="22"/>
-          <w:szCs w:val="22"/>
-          <w:lang w:val="id-ID"/>
-        </w:rPr>
-        <w:t xml:space="preserve">These findings refine earlier observations in the literature. Parciak et al. reported that LLM matching quality suffers from both too little and too much context [11]; our stage-1 results show the same trade-off for resource descriptions, where one definition paragraph helps and full specification sections do not. Retrieve-and-rerank designs [12,13] select candidate </w:t>
-      </w:r>
-      <w:r>
-        <w:rPr>
-          <w:sz w:val="22"/>
-          <w:szCs w:val="22"/>
-          <w:lang w:val="id-ID"/>
-          <w:i/>
-        </w:rPr>
-        <w:t xml:space="preserve">elements</w:t>
-      </w:r>
-      <w:r>
-        <w:rPr>
-          <w:sz w:val="22"/>
-          <w:szCs w:val="22"/>
-          <w:lang w:val="id-ID"/>
-        </w:rPr>
-        <w:t xml:space="preserve"> per column, and in our setting their ceiling is set by an off-the-shelf retriever that cannot read abbreviated Indonesian names (recall@10 0.40 on the large target); selecting the </w:t>
-      </w:r>
-      <w:r>
-        <w:rPr>
-          <w:sz w:val="22"/>
-          <w:szCs w:val="22"/>
-          <w:lang w:val="id-ID"/>
-          <w:i/>
-        </w:rPr>
-        <w:t xml:space="preserve">resource</w:t>
-      </w:r>
-      <w:r>
-        <w:rPr>
-          <w:sz w:val="22"/>
-          <w:szCs w:val="22"/>
-          <w:lang w:val="id-ID"/>
-        </w:rPr>
-        <w:t xml:space="preserve"> first uses the structure of the standard instead and avoids this ceiling. Finally, our result that a mined dictionary helps retrieval but not a capable LLM is consistent with the motivation of LLM-based expansion work [19,20], which treats expansion as a pre-processing step for weaker downstream components.</w:t>
+        <w:t xml:space="preserve">Retrieve-and-rerank designs [12,13] select candidate elements per column, and here their ceiling is set by a retriever that cannot read abbreviated Indonesian names; selecting the resource first uses the structure of the standard instead. That the mined dictionary helps retrieval but not a capable LLM is consistent with work that treats abbreviation expansion as pre-processing for weaker components [19,20].</w:t>
       </w:r>
     </w:p>
     <w:p>
@@ -10851,7 +12763,7 @@
           <w:szCs w:val="22"/>
           <w:lang w:val="id-ID"/>
         </w:rPr>
-        <w:t xml:space="preserve">3.4 Efficiency and practical use</w:t>
+        <w:t xml:space="preserve">3.4 Efficiency, practical use and limitations</w:t>
       </w:r>
     </w:p>
     <w:p>
@@ -10869,7 +12781,7 @@
           <w:sz w:val="22"/>
           <w:szCs w:val="22"/>
         </w:rPr>
-        <w:t xml:space="preserve">Table 8 reports the cost per table on all 59 tables. Compared with llm-full, the primary variant needs 47% fewer prompt tokens and 5–20% fewer output tokens with both models. On the local 8B model, which processes prompts slowly, this also shortens the median time per table from 19.4 to 16.1 seconds. Through the API the situation is reversed: each call is fast, so the second sequential call dominates, and the primary variant takes 3.2 seconds against 2.0 for llm-full. The choice therefore depends on the deployment. A facility that runs a local model on modest hardware gains both accuracy and time, whereas an API user trades about one second per table for 11–13 points of recall and roughly half the token cost.</w:t>
+        <w:t xml:space="preserve">Table 10 reports the cost per table. The primary variant needs 47% fewer prompt tokens and 5–20% fewer output tokens than llm-full with both models. On the local model this shortens the median time from 19.4 to 16.1 seconds per table; through the API the second sequential call dominates and the primary variant is slower (3.2 against 2.0 seconds). In practice, the selected resource is a single decision that an engineer can confirm before column matching, which removes the zero-score cases of Table 7.</w:t>
       </w:r>
     </w:p>
     <w:p>
@@ -10889,7 +12801,7 @@
           <w:szCs w:val="22"/>
           <w:lang w:val="id-ID"/>
         </w:rPr>
-        <w:t xml:space="preserve">Table 8 Mean prompt and output tokens and median seconds per table (59 tables)</w:t>
+        <w:t xml:space="preserve">Table 10 Mean prompt and output tokens and median seconds per table (59 tables)</w:t>
       </w:r>
     </w:p>
     <w:tbl>
@@ -11867,75 +13779,7 @@
           <w:sz w:val="22"/>
           <w:szCs w:val="22"/>
         </w:rPr>
-        <w:t xml:space="preserve">For integration practice, three observations follow from the results. First, the selected resource is a single, easily verified decision; asking an engineer to confirm or correct it before column matching removes most of the remaining gap at almost no cost, since the oracle is 8–18 points above the primary variant. Second, the matcher only sees names and types, so schemas with generic names such as </w:t>
-      </w:r>
-      <w:r>
-        <w:rPr>
-          <w:sz w:val="22"/>
-          <w:szCs w:val="22"/>
-        </w:rPr>
-        <w:t xml:space="preserve">id</w:t>
-      </w:r>
-      <w:r>
-        <w:rPr>
-          <w:sz w:val="22"/>
-          <w:szCs w:val="22"/>
-        </w:rPr>
-        <w:t xml:space="preserve"> and </w:t>
-      </w:r>
-      <w:r>
-        <w:rPr>
-          <w:sz w:val="22"/>
-          <w:szCs w:val="22"/>
-        </w:rPr>
-        <w:t xml:space="preserve">nama</w:t>
-      </w:r>
-      <w:r>
-        <w:rPr>
-          <w:sz w:val="22"/>
-          <w:szCs w:val="22"/>
-        </w:rPr>
-        <w:t xml:space="preserve"> should be matched together with the table name or a short table description. Third, an 8B model on a laptop is enough to produce a useful first draft of a mapping without sending any schema to an external service, which matters for hospitals whose policies restrict data transfer even for metadata.</w:t>
-      </w:r>
-    </w:p>
-    <w:p>
-      <w:pPr>
-        <w:pStyle w:val="Heading2"/>
-        <w:ind w:hanging="0" w:start="0"/>
-        <w:rPr>
-          <w:rFonts w:ascii="Times New Roman" w:hAnsi="Times New Roman" w:cs="Times New Roman"/>
-          <w:b w:val="false"/>
-          <w:sz w:val="22"/>
-          <w:szCs w:val="22"/>
-          <w:lang w:val="id-ID"/>
-        </w:rPr>
-      </w:pPr>
-      <w:r>
-        <w:rPr>
-          <w:rFonts w:cs="Times New Roman" w:ascii="Times New Roman" w:hAnsi="Times New Roman"/>
-          <w:sz w:val="22"/>
-          <w:szCs w:val="22"/>
-          <w:lang w:val="id-ID"/>
-        </w:rPr>
-        <w:t xml:space="preserve">3.5 Limitations</w:t>
-      </w:r>
-    </w:p>
-    <w:p>
-      <w:pPr>
-        <w:pStyle w:val="Text"/>
-        <w:ind w:hanging="0" w:end="0"/>
-        <w:rPr>
-          <w:sz w:val="22"/>
-          <w:szCs w:val="22"/>
-          <w:lang w:val="id-ID"/>
-        </w:rPr>
-      </w:pPr>
-      <w:r>
-        <w:rPr>
-          <w:sz w:val="22"/>
-          <w:szCs w:val="22"/>
-        </w:rPr>
-        <w:t xml:space="preserve">The gold standard was drafted by one annotator, and the conventions are design choices that another team could make differently [TBD: report agreement after adjudication]. The one-resource-per-table convention favours the primary variant; tables that genuinely populate several resources, such as a registration table that creates both a Patient and an Encounter, would be under-served, and the benchmark does not measure this. Per-pair differences have a standard deviation of about 0.28, so effects of 10 points need 120–200 tables for 80% power; the pre-registered test was underpowered. Each configuration was run once, and API decoding at temperature 0 is not guaranteed to be deterministic. The benchmark covers 11 of about 145 FHIR resources, uses names and types only, and is dominated by one system in the development set, and the held-out set has now been used. All source schemas and the FHIR specification are public and may appear in training data, although our annotations do not [29].</w:t>
+        <w:t xml:space="preserve">The study has limits. Its scope is single-resource matching: the conventions place all gold correspondences of a table in one resource, which the primary variant exploits. Tables that genuinely populate several resources, such as a registration table that creates both a Patient and an Encounter, are not measured. As a sensitivity check, we judged 30 random llm-full predictions that fell outside the gold resource on development tables; 6 (20%) were defensible under a multi-resource reading, mostly foreign keys pointing at the referenced resource, so the single-resource gold standard understates cross-resource credit by a modest amount. Per-table differences have a standard deviation of about 0.28, so effects of 10 points need 120–200 tables for 80% power, and the pre-registered test was underpowered. Each configuration was run once, and API decoding at temperature 0 is not guaranteed to be deterministic. The benchmark covers 11 of about 145 FHIR resources, uses names and types only, is dominated by one system in the development set, and its held-out set has now been used. All source schemas and the FHIR specification are public and may appear in training data, although our annotations do not [29].</w:t>
       </w:r>
     </w:p>
     <w:p>
@@ -11974,7 +13818,7 @@
           <w:sz w:val="22"/>
           <w:szCs w:val="22"/>
         </w:rPr>
-        <w:t xml:space="preserve">Mapping the database of an Indonesian hospital or community health centre onto FHIR is hard for classic matchers and far from solved for LLMs. When the whole standard is the target, accuracy roughly halves, and most errors put the right attribute into the wrong resource. Choosing the resource first from the standard's own definitions and then matching only against that resource improves recall by 12.7–13.7 points at about half the prompt tokens, consistently for two open model families; on a pre-registered held-out set the improvement has the same size but is not statistically confirmed. The remaining errors concern how FHIR models a hospital, for example that a referral is a ServiceRequest and that a visit number is a reference, rather than Indonesian vocabulary or abbreviations. Resource selection is now the main bottleneck, and a single human confirmation of the selected resource is a cheap safeguard in practice.</w:t>
+        <w:t xml:space="preserve">Mapping the database of an Indonesian hospital, clinic or community health centre onto FHIR is hard for classic matchers and far from solved for LLMs. When the whole standard is the target, recall drops sharply, and most errors put the right attribute into the wrong resource. In the single-resource setting, choosing the resource first from the standard's own definitions and then matching only against that resource improves recall by 12.7–13.7 points on development tables at about half the prompt tokens, for two open model families; on held-out systems the improvement is directionally consistent but not statistically confirmed. When the resource is chosen correctly, column matching is close to or above the oracle, so resource selection is the bottleneck, and a single human confirmation of the selected resource is a cheap safeguard in practice.</w:t>
       </w:r>
     </w:p>
     <w:p>
@@ -12013,7 +13857,7 @@
           <w:sz w:val="22"/>
           <w:szCs w:val="22"/>
         </w:rPr>
-        <w:t xml:space="preserve">Future work will enlarge the held-out set with more systems to reach adequate statistical power, measure the conditional effect of table names on schemas with generic columns, compare the mined dictionary with LLM-based abbreviation expansion [20], and run the same tables in Indonesian, English and mixed variants to isolate the effect of language.</w:t>
+        <w:t xml:space="preserve">Future work will enlarge the held-out set with more systems to reach adequate statistical power, extend the benchmark to tables that populate several resources, measure the effect of table names on schemas with generic columns, compare the mined dictionary with LLM-based abbreviation expansion [20], and run the same tables in Indonesian, English and mixed variants to isolate the effect of language.</w:t>
       </w:r>
     </w:p>
     <w:p>
@@ -12671,7 +14515,7 @@
           <w:sz w:val="22"/>
           <w:szCs w:val="22"/>
         </w:rPr>
-        <w:t xml:space="preserve">E. van Miltenburg, C. van der Lee, and E. Krahmer, "Preregistering NLP research," in Proc. Conf. North American Chapter of the Assoc. for Computational Linguistics (NAACL-HLT), 2021. [Online]. Available: https://doi.org/10.18653/v1/2021.naacl-main.51</w:t>
+        <w:t xml:space="preserve">J. Chen, S. Xiao, P. Zhang, K. Luo, D. Lian, and Z. Liu, "M3-Embedding: Multi-linguality, multi-functionality, multi-granularity text embeddings through self-knowledge distillation," in Findings of the Assoc. for Computational Linguistics: ACL, 2024. [Online]. Available: https://doi.org/10.18653/v1/2024.findings-acl.137</w:t>
       </w:r>
     </w:p>
     <w:p>
@@ -12697,7 +14541,7 @@
           <w:sz w:val="22"/>
           <w:szCs w:val="22"/>
         </w:rPr>
-        <w:t xml:space="preserve">J. Chen, S. Xiao, P. Zhang, K. Luo, D. Lian, and Z. Liu, "M3-Embedding: Multi-linguality, multi-functionality, multi-granularity text embeddings through self-knowledge distillation," in Findings of the Assoc. for Computational Linguistics: ACL, 2024. [Online]. Available: https://doi.org/10.18653/v1/2024.findings-acl.137</w:t>
+        <w:t xml:space="preserve">A. Yang et al., "Qwen3 technical report," arXiv:2505.09388, 2025. [Online]. Available: https://doi.org/10.48550/arXiv.2505.09388</w:t>
       </w:r>
     </w:p>
     <w:p>
@@ -12723,7 +14567,7 @@
           <w:sz w:val="22"/>
           <w:szCs w:val="22"/>
         </w:rPr>
-        <w:t xml:space="preserve">A. Yang et al., "Qwen3 technical report," arXiv:2505.09388, 2025. [Online]. Available: https://doi.org/10.48550/arXiv.2505.09388</w:t>
+        <w:t xml:space="preserve">Z.ai, "GLM-5.3-Flash," model card, 2026. [Online]. Available: https://huggingface.co/zai-org/GLM-5.3-Flash</w:t>
       </w:r>
     </w:p>
     <w:p>
@@ -12749,7 +14593,7 @@
           <w:sz w:val="22"/>
           <w:szCs w:val="22"/>
         </w:rPr>
-        <w:t xml:space="preserve">Z.ai, "GLM-5.3-Flash," model card, 2026. [Online]. Available: https://huggingface.co/zai-org/GLM-5.3-Flash</w:t>
+        <w:t xml:space="preserve">E. van Miltenburg, C. van der Lee, and E. Krahmer, "Preregistering NLP research," in Proc. Conf. North American Chapter of the Assoc. for Computational Linguistics (NAACL-HLT), 2021. [Online]. Available: https://doi.org/10.18653/v1/2021.naacl-main.51</w:t>
       </w:r>
     </w:p>
     <w:p>
@@ -12966,7 +14810,7 @@
         <w:sz w:val="22"/>
         <w:szCs w:val="22"/>
       </w:rPr>
-      <w:t>Single-Resource Two-Stage LLM Matching of Indonesian Hospital Schemas to FHIR (First Author)</w:t>
+      <w:t>Single-Resource LLM Schema Matching of Indonesian Health Systems to FHIR (First Author)</w:t>
     </w:r>
   </w:p>
 </w:ftr>

</xml_diff>

<commit_message>
docs: third-round revision of IJCCS manuscript
Redesigns the second annotation as two phases so resource agreement is
measured between independent choices (phase 1 hides the assigned resource),
and reports four agreement measures. Adds a formal definition of the three
evaluation policies, labels the GLM deployment-strict confirm18 result as
exploratory, softens the human-confirmation conclusion, limits the embedding
claim to the classifiers tested, states exact model versions (Ollama digests,
API model id and access date), adds a dated post-review addendum to the
pre-registration, and keeps "R@|GT|" from wrapping in tables and captions.

Co-Authored-By: Claude Opus 5.5 <noreply@anthropic.com>
</commit_message>
<xml_diff>
--- a/paper/ijccs/IJCCS_manuscript.docx
+++ b/paper/ijccs/IJCCS_manuscript.docx
@@ -207,7 +207,7 @@
           <w:szCs w:val="22"/>
           <w:shd w:fill="FFFFFF" w:val="clear"/>
         </w:rPr>
-        <w:t xml:space="preserve">Fasilitas kesehatan di Indonesia wajib mengirim rekam medis elektronik ke platform SATUSEHAT dalam format HL7 FHIR R4, sehingga integrasi data menjadi masalah pencocokan skema antara skema basis data berbahasa Indonesia yang bersingkatan dan standar berbahasa Inggris. Kami membangun benchmark berisi 59 tabel dari tujuh sistem informasi kesehatan open-source Indonesia dengan 274 korespondensi beranotasi ke 289 elemen FHIR, di mana setiap tabel dipetakan ke satu resource FHIR, dibagi menjadi set pengembangan dan set uji yang dipra-registrasi. Pencocok klasik gagal pada skema ini (COMA R@|GT| 0,15 dibanding 0,53 untuk LLM 8B), dan ketika seluruh standar menjadi target, recall satu prompt LLM turun dari 0,55 ke 0,35 pada tabel pengembangan. Kami mengusulkan pencocok dua tahap yang memilih resource FHIR dari definisi resminya lalu mencocokkan kolom hanya ke resource peringkat pertama. Pada set pengembangan, recall naik 13,7 dan 12,7 poin untuk Qwen3-8B dan GLM-5.3-Flash dengan sekitar separuh token prompt; pada sistem uji, kenaikannya (12,2 dan 7,9 poin) searah tetapi belum terkonfirmasi secara statistik. Analisis galat menunjukkan bahwa hambatan utamanya adalah pemilihan resource, bukan pencocokan kolom, dan bahwa resource yang dirujuk lewat foreign key menyerap prediksi.</w:t>
+        <w:t xml:space="preserve">Fasilitas kesehatan di Indonesia wajib mengirim rekam medis elektronik ke platform SATUSEHAT dalam format HL7 FHIR R4, sehingga integrasi data menjadi masalah pencocokan skema antara skema basis data berbahasa Indonesia yang bersingkatan dan standar berbahasa Inggris. Kami membangun benchmark berisi 59 tabel dari tujuh sistem informasi kesehatan open-source Indonesia dengan 274 korespondensi beranotasi ke 289 elemen FHIR, di mana setiap tabel dipetakan ke satu resource FHIR, dibagi menjadi set pengembangan dan set uji yang dipra-registrasi. Pencocok klasik gagal pada skema ini (COMA R@⁠|⁠GT⁠| 0,15 dibanding 0,53 untuk LLM 8B), dan ketika seluruh standar menjadi target, recall satu prompt LLM turun dari 0,55 ke 0,35 pada tabel pengembangan. Kami mengusulkan pencocok dua tahap yang memilih resource FHIR dari definisi resminya lalu mencocokkan kolom hanya ke resource peringkat pertama. Pada set pengembangan, recall naik 13,7 dan 12,7 poin untuk Qwen3-8B dan GLM-5.3-Flash dengan sekitar separuh token prompt; pada sistem uji, kenaikannya (12,2 dan 7,9 poin) searah tetapi belum terkonfirmasi secara statistik. Analisis galat menunjukkan bahwa hambatan utamanya adalah pemilihan resource, bukan pencocokan kolom, dan bahwa resource yang dirujuk lewat foreign key menyerap prediksi.</w:t>
       </w:r>
     </w:p>
     <w:p>
@@ -274,7 +274,7 @@
           <w:sz w:val="22"/>
           <w:szCs w:val="22"/>
         </w:rPr>
-        <w:t xml:space="preserve">Indonesian health facilities must report electronic medical records to the national SATUSEHAT platform in HL7 FHIR R4, which turns data integration into a schema-matching problem between abbreviated Indonesian database schemas and an English standard. We build a benchmark of 59 tables from seven open-source Indonesian health information systems with 274 annotated correspondences into 289 FHIR elements, in which each table maps to a single FHIR resource, split into a development set and a pre-registered held-out set. Classic matchers fail on these schemas (COMA R@|GT| 0.15 vs. 0.53 for an 8B LLM), and when the whole standard is the target, the recall of a single LLM prompt drops from 0.55 to 0.35 on development tables. We propose a two-stage matcher that selects the FHIR resource from its official definition and then matches columns only against the top-ranked resource. On the development set it improves recall by 13.7 and 12.7 points for Qwen3-8B and GLM-5.3-Flash at about half the prompt tokens; on held-out systems the gains (12.2 and 7.9 points) are directionally consistent but not statistically confirmed. Error analysis shows that resource selection, not column matching, is the bottleneck, and that resources referenced through foreign keys absorb predictions.</w:t>
+        <w:t xml:space="preserve">Indonesian health facilities must report electronic medical records to the national SATUSEHAT platform in HL7 FHIR R4, which turns data integration into a schema-matching problem between abbreviated Indonesian database schemas and an English standard. We build a benchmark of 59 tables from seven open-source Indonesian health information systems with 274 annotated correspondences into 289 FHIR elements, in which each table maps to a single FHIR resource, split into a development set and a pre-registered held-out set. Classic matchers fail on these schemas (COMA R@⁠|⁠GT⁠| 0.15 vs. 0.53 for an 8B LLM), and when the whole standard is the target, the recall of a single LLM prompt drops from 0.55 to 0.35 on development tables. We propose a two-stage matcher that selects the FHIR resource from its official definition and then matches columns only against the top-ranked resource. On the development set it improves recall by 13.7 and 12.7 points for Qwen3-8B and GLM-5.3-Flash at about half the prompt tokens; on held-out systems the gains (12.2 and 7.9 points) are directionally consistent but not statistically confirmed. Error analysis shows that resource selection, not column matching, is the bottleneck, and that resources referenced through foreign keys absorb predictions.</w:t>
       </w:r>
     </w:p>
     <w:p>
@@ -527,7 +527,7 @@
           <w:sz w:val="22"/>
           <w:szCs w:val="22"/>
         </w:rPr>
-        <w:t xml:space="preserve">A pilot with column headers from 18 Indonesian open-data portals showed that published open-data tables are an easy matching problem: only 6% of headers contained abbreviations, and COMA reached R@|GT| 0.93 on cross-portal pairs, on par with an LLM (0.90). Abbreviated naming lives in operational system schemas, so the benchmark is built from the DDL of open-source Indonesian information systems.</w:t>
+        <w:t xml:space="preserve">A pilot with column headers from 18 Indonesian open-data portals showed that published open-data tables are an easy matching problem: only 6% of headers contained abbreviations, and COMA reached R@⁠|⁠GT⁠| 0.93 on cross-portal pairs, on par with an LLM (0.90). Abbreviated naming lives in operational system schemas, so the benchmark is built from the DDL of open-source Indonesian information systems.</w:t>
       </w:r>
     </w:p>
     <w:p>
@@ -4243,7 +4243,7 @@
           <w:sz w:val="22"/>
           <w:szCs w:val="22"/>
         </w:rPr>
-        <w:t xml:space="preserve">The gold standard was drafted by the first annotator. A second annotator, blind to the draft, labelled all 713 columns with the same four labels and judged, for each table, whether the assigned resource is correct. Agreement is reported at the resource level (share of tables whose resource is accepted) and at the element level (Cohen's κ over per-column labels, excluding columns that either annotator marked ambiguous, and F1 between the two sets of 1:1 links). Disagreements were resolved by discussion, and the adjudicated labels form the gold standard [TBD: resource agreement, κ, 1:1-link F1, number of changed labels, and two examples of disagreements that changed the gold standard].</w:t>
+        <w:t xml:space="preserve">The gold standard was drafted by the first annotator and checked by a second annotator, blind to the draft, in two phases. In phase 1, the second annotator chose the FHIR resource of each table independently, from table and column names only; in phase 2, they labelled all 713 columns with the same four labels against the assigned resource. We report four agreement measures: resource selection (raw agreement and Cohen's κ over the 11 resources), annotation category (κ over the four labels), target element (κ over per-column elements, excluding columns that either annotator marked ambiguous), and exact (source column, FHIR element) pairs (F1 between the two sets of 1:1 links). Disagreements were resolved by discussion, and the adjudicated labels form the gold standard [TBD: the four agreement values, the number of labels changed by adjudication, and two examples of disagreements that changed the gold standard].</w:t>
       </w:r>
     </w:p>
     <w:p>
@@ -4658,7 +4658,63 @@
           <w:sz w:val="22"/>
           <w:szCs w:val="22"/>
         </w:rPr>
-        <w:t xml:space="preserve">Qwen3-8B [24] runs locally with Ollama on a laptop (Apple M3 Pro, 18 GB) at temperature 0, seed 0, JSON mode and thinking disabled. GLM-5.3-Flash [25] is an open-weight model accessed through an OpenAI-compatible API at temperature 0, seed 0, JSON mode and the minimum reasoning effort. Prompts are byte-identical across models, configurations were developed on Qwen only, and every response is cached.</w:t>
+        <w:t xml:space="preserve">Qwen3-8B [24] runs locally with Ollama 0.40.4 on a laptop (Apple M3 Pro, 18 GB), tag </w:t>
+      </w:r>
+      <w:r>
+        <w:rPr>
+          <w:sz w:val="22"/>
+          <w:szCs w:val="22"/>
+        </w:rPr>
+        <w:t xml:space="preserve">qwen3:8b</w:t>
+      </w:r>
+      <w:r>
+        <w:rPr>
+          <w:sz w:val="22"/>
+          <w:szCs w:val="22"/>
+        </w:rPr>
+        <w:t xml:space="preserve">, digest 500a1f067a9f (Q4_K_M quantisation), at temperature 0, seed 0, JSON mode and thinking disabled; embeddings use </w:t>
+      </w:r>
+      <w:r>
+        <w:rPr>
+          <w:sz w:val="22"/>
+          <w:szCs w:val="22"/>
+        </w:rPr>
+        <w:t xml:space="preserve">bge-m3</w:t>
+      </w:r>
+      <w:r>
+        <w:rPr>
+          <w:sz w:val="22"/>
+          <w:szCs w:val="22"/>
+        </w:rPr>
+        <w:t xml:space="preserve">, digest 790764642607 (F16). GLM-5.3-Flash [25] (open weights </w:t>
+      </w:r>
+      <w:r>
+        <w:rPr>
+          <w:sz w:val="22"/>
+          <w:szCs w:val="22"/>
+        </w:rPr>
+        <w:t xml:space="preserve">zai-org/GLM-5.3-Flash</w:t>
+      </w:r>
+      <w:r>
+        <w:rPr>
+          <w:sz w:val="22"/>
+          <w:szCs w:val="22"/>
+        </w:rPr>
+        <w:t xml:space="preserve">) is accessed through the Neuralwatt OpenAI-compatible API, model id </w:t>
+      </w:r>
+      <w:r>
+        <w:rPr>
+          <w:sz w:val="22"/>
+          <w:szCs w:val="22"/>
+        </w:rPr>
+        <w:t xml:space="preserve">glm-5.3-flash</w:t>
+      </w:r>
+      <w:r>
+        <w:rPr>
+          <w:sz w:val="22"/>
+          <w:szCs w:val="22"/>
+        </w:rPr>
+        <w:t xml:space="preserve">, on 28 October 2026, at temperature 0, seed 0, JSON mode and the minimum reasoning effort; the provider does not pin a checkpoint, so API results are reproducible from the released response cache rather than by re-querying. Prompts are byte-identical across models, configurations were developed on Qwen only, and every response is cached.</w:t>
       </w:r>
     </w:p>
     <w:p>
@@ -4677,7 +4733,7 @@
           <w:szCs w:val="22"/>
           <w:lang w:val="id-ID"/>
         </w:rPr>
-        <w:t xml:space="preserve">Evaluation of one table proceeds in four steps. (1) Parse the model's JSON into (source, target, confidence) triples. (2) R@|GT|: rank the predictions by confidence (ties keep the model's output order), take the top |GT|, and divide the number of gold 1:1 pairs among them by |GT|. (3) Decisions: assign greedily one-to-one by confidence over all predictions with confidence above 0, without using |GT|, and compute precision, recall and F1 against the gold 1:1 pairs. (4) Treat gold n:1 and ambiguous pairs under one of three policies. </w:t>
+        <w:t xml:space="preserve">Evaluation of one table proceeds in four steps. (1) Parse the model's JSON into (source, target, confidence) triples. (2) R@⁠|⁠GT⁠|: rank the predictions by confidence (ties keep the model's output order), take the top |GT|, and divide the number of gold 1:1 pairs among them by |GT|. (3) Decisions: assign greedily one-to-one by confidence over all predictions with confidence above 0, without using |GT|, and compute precision, recall and F1 against the gold 1:1 pairs. (4) Treat gold n:1 and ambiguous pairs under one of three policies. </w:t>
       </w:r>
       <w:r>
         <w:rPr>
@@ -4728,7 +4784,7 @@
           <w:szCs w:val="22"/>
           <w:lang w:val="id-ID"/>
         </w:rPr>
-        <w:t xml:space="preserve"> counts assigned n:1 and ambiguous pairs as correct in precision, an upper reference. Annotation-neutral R@|GT| is the pre-registered metric; the deployment policies were added after the first review and fixed before they were computed. Precision, recall and F1 are computed per table and macro-averaged, so the reported F1 is the mean of per-table F1, not the harmonic mean of mean precision and recall. For example, for </w:t>
+        <w:t xml:space="preserve"> counts assigned n:1 and ambiguous pairs as correct in precision, an upper reference. Formally, let G be the gold 1:1 pairs of a table, X its gold n:1 and ambiguous pairs, and A the greedy one-to-one assignment, computed once over all predictions for both deployment policies and over the predictions outside X for the annotation-neutral policy. Then P = |A ∩ G| / |A| under the strict and neutral policies and P = |A ∩ (G ∪ X)| / |A| under the lenient policy; for every policy R = |A ∩ G| / |G| and F1 = 2PR / (P + R) per table. Because the neutral assignment is computed without the predictions in X, an element they would have taken can go to a gold pair instead, so neutral F1 can exceed lenient F1. Annotation-neutral R@⁠|⁠GT⁠| is the pre-registered metric; the deployment policies were added after the first review and fixed before they were computed. Precision, recall and F1 are computed per table and macro-averaged, so the reported F1 is the mean of per-table F1, not the harmonic mean of mean precision and recall. For example, for </w:t>
       </w:r>
       <w:r>
         <w:rPr>
@@ -4792,7 +4848,7 @@
           <w:szCs w:val="22"/>
           <w:lang w:val="id-ID"/>
         </w:rPr>
-        <w:t xml:space="preserve">) first, then two gold pairs, then two wrong date columns, so R@|GT| is 2/5 = 0.40. The greedy assignment keeps six pairs, of which three are gold, because </w:t>
+        <w:t xml:space="preserve">) first, then two gold pairs, then two wrong date columns, so R@⁠|⁠GT⁠| is 2/5 = 0.40. The greedy assignment keeps six pairs, of which three are gold, because </w:t>
       </w:r>
       <w:r>
         <w:rPr>
@@ -4875,7 +4931,7 @@
           <w:szCs w:val="22"/>
           <w:lang w:val="id-ID"/>
         </w:rPr>
-        <w:t xml:space="preserve">The table pair is the unit of analysis. Differences are computed from unrounded per-table values and reported with 95% bootstrap confidence intervals (10,000 resamples) and Wilcoxon signed-rank tests. The confirmatory analysis is limited to the pre-registered family of two hypotheses on confirm18 with Qwen3-8B and R@|GT|: H1, primary &gt; llm-full, and H2, primary &gt; union, tested one-sided with Holm correction. All other tests, including every GLM result, pooled sets and the correspondence-level analysis (cluster bootstrap and cluster sign-flip permutation over tables), are exploratory and uncorrected.</w:t>
+        <w:t xml:space="preserve">The table pair is the unit of analysis. Differences are computed from unrounded per-table values and reported with 95% bootstrap confidence intervals (10,000 resamples) and Wilcoxon signed-rank tests. The confirmatory analysis is limited to the pre-registered family of two hypotheses on confirm18 with Qwen3-8B and R@⁠|⁠GT⁠|: H1, primary &gt; llm-full, and H2, primary &gt; union, tested one-sided with Holm correction. All other tests, including every GLM result, pooled sets and the correspondence-level analysis (cluster bootstrap and cluster sign-flip permutation over tables), are exploratory and uncorrected.</w:t>
       </w:r>
     </w:p>
     <w:p>
@@ -4894,7 +4950,7 @@
           <w:szCs w:val="22"/>
           <w:lang w:val="id-ID"/>
         </w:rPr>
-        <w:t xml:space="preserve">The pre-registration (configurations, hypotheses, metric, tests and the SHA-256 hashes of the confirm18 gold files) was written on 27 October 2026 before any matcher was run on confirm18, and the run script refuses to execute if the hashes differ. It was not deposited with an external registry, so its timing cannot be verified independently; we follow the practice recommended in [26] and release it with the code. Data and code availability: table and column names with types, gold annotations, guidelines, prompts, parser, cached model responses, pre-registration and statistics scripts are available at [repository URL, commit hash]; source dumps are not redistributed.</w:t>
+        <w:t xml:space="preserve">The pre-registration (configurations, hypotheses, metric, tests and the SHA-256 hashes of the confirm18 gold files) was written on 27 October 2026 before any matcher was run on confirm18, and the run script refuses to execute if the hashes differ. Analyses added after the first and second reviews (the deployment policies, oracle-B and the embedding baseline) are recorded in a dated addendum to the same file and are exploratory. It was not deposited with an external registry, so its timing cannot be verified independently; we follow the practice recommended in [26] and release it with the code. Data and code availability: table and column names with types, gold annotations, guidelines, prompts, parser, cached model responses, pre-registration and statistics scripts are available at [repository URL, commit hash]; source dumps are not redistributed.</w:t>
       </w:r>
     </w:p>
     <w:p>
@@ -4975,7 +5031,7 @@
           <w:szCs w:val="22"/>
           <w:lang w:val="id-ID"/>
         </w:rPr>
-        <w:t xml:space="preserve">Table 3 Schema-only baseline, R@|GT| on the small target (25 of the 28 baseline pairs; the three single-pair groups OpenSID→FHIR, SLiMS→Feeder and Khanza→Feeder are omitted)</w:t>
+        <w:t xml:space="preserve">Table 3 Schema-only baseline, R@⁠|⁠GT⁠| on the small target (25 of the 28 baseline pairs; the three single-pair groups OpenSID→FHIR, SLiMS→Feeder and Khanza→Feeder are omitted)</w:t>
       </w:r>
     </w:p>
     <w:tbl>
@@ -6044,7 +6100,7 @@
           <w:szCs w:val="22"/>
           <w:lang w:val="id-ID"/>
         </w:rPr>
-        <w:t xml:space="preserve">Table 4 Large target (289 elements), R@|GT| with F1 in parentheses, and mean prompt tokens per table</w:t>
+        <w:t xml:space="preserve">Table 4 Large target (289 elements), R@⁠|⁠GT⁠| with F1 in parentheses, and mean prompt tokens per table</w:t>
       </w:r>
     </w:p>
     <w:tbl>
@@ -6894,7 +6950,7 @@
           <w:szCs w:val="22"/>
           <w:lang w:val="id-ID"/>
         </w:rPr>
-        <w:t xml:space="preserve">Table 5 Primary minus llm-full in points [95% CI] from unrounded values, with Wilcoxon p; only the Qwen confirm18 R@|GT| test is confirmatory (one-sided, Holm-corrected), all others are exploratory</w:t>
+        <w:t xml:space="preserve">Table 5 Primary minus llm-full in points [95% CI] from unrounded values, with Wilcoxon p; only the Qwen confirm18 R@⁠|⁠GT⁠| test is confirmatory (one-sided, Holm-corrected), all others are exploratory</w:t>
       </w:r>
     </w:p>
     <w:tbl>
@@ -7049,7 +7105,7 @@
                 <w:sz w:val="18"/>
                 <w:szCs w:val="18"/>
               </w:rPr>
-              <w:t xml:space="preserve">Qwen3-8B, R@|GT| (neutral)</w:t>
+              <w:t xml:space="preserve">Qwen3-8B, R@⁠|⁠GT⁠| (neutral)</w:t>
             </w:r>
           </w:p>
         </w:tc>
@@ -7267,7 +7323,7 @@
                 <w:sz w:val="18"/>
                 <w:szCs w:val="18"/>
               </w:rPr>
-              <w:t xml:space="preserve">GLM-5.3-Flash, R@|GT| (neutral)</w:t>
+              <w:t xml:space="preserve">GLM-5.3-Flash, R@⁠|⁠GT⁠| (neutral)</w:t>
             </w:r>
           </w:p>
         </w:tc>
@@ -9228,7 +9284,7 @@
           <w:sz w:val="22"/>
           <w:szCs w:val="22"/>
         </w:rPr>
-        <w:t xml:space="preserve">Restricting stage 2 to one resource is the effective ingredient. The union variant already halves the prompt, but its gain over llm-full is modest for Qwen (+6.8 points on dev41) and vanishes for GLM (+2.5 on dev41, −1.6 on confirm18), while the primary variant adds 7–10 points on top of union for both models. We distinguish three levels of evidence. Across model families, the development-set effect replicates: no design choice was made with GLM, and its effect (+12.7) is close to Qwen's (+13.7). On held-out systems, the effect is directionally consistent but not statistically confirmed: the pre-registered H1 has one-sided p = 0.069 (Holm-corrected 0.138), H2 has Holm-corrected p = 0.17, and the GLM gain is smaller (+7.9, p = 0.36). Thirteen of the 18 held-out tables are ties, because these schemas are smaller and less abbreviated (33% against 58% of columns). We therefore do not claim that the gain generalises across systems. A correspondence-level analysis gives the same ordering but no additional power (pooled +10.2 points, CI [1.4, 19.3], p = 0.029).</w:t>
+        <w:t xml:space="preserve">Restricting stage 2 to one resource is the effective ingredient. The union variant already halves the prompt, but its gain over llm-full is modest for Qwen (+6.8 points on dev41) and vanishes for GLM (+2.5 on dev41, −1.6 on confirm18), while the primary variant adds 7–10 points on top of union for both models. We distinguish three levels of evidence. Across model families, the development-set effect replicates: no design choice was made with GLM, and its effect (+12.7) is close to Qwen's (+13.7). On held-out systems, the effect is directionally consistent but not statistically confirmed: the pre-registered H1 has one-sided p = 0.069 (Holm-corrected 0.138), H2 has Holm-corrected p = 0.17, and the GLM gain is smaller (+7.9, p = 0.36). Thirteen of the 18 held-out tables are ties, because these schemas are smaller and less abbreviated (33% against 58% of columns). We therefore do not claim that the gain generalises across systems. Under the deployment-strict policy the GLM gain on confirm18 is +12.0 points (CI [0.5, 24.2], p = 0.037); this is exploratory evidence from an analysis added after the pre-registration and not corrected for multiplicity, not an independent confirmation of H1. A correspondence-level analysis gives the same ordering but no additional power (pooled +10.2 points, CI [1.4, 19.3], p = 0.029).</w:t>
       </w:r>
     </w:p>
     <w:p>
@@ -9333,7 +9389,7 @@
           <w:szCs w:val="22"/>
           <w:lang w:val="id-ID"/>
         </w:rPr>
-        <w:t xml:space="preserve">Table 7 Stage-1 selection and stage-2 accuracy conditioned on it (all 59 tables; R@|GT| of primary and oracle-A on the same tables)</w:t>
+        <w:t xml:space="preserve">Table 7 Stage-1 selection and stage-2 accuracy conditioned on it (all 59 tables; R@⁠|⁠GT⁠| of primary and oracle-A on the same tables)</w:t>
       </w:r>
     </w:p>
     <w:tbl>
@@ -9859,7 +9915,7 @@
           <w:sz w:val="22"/>
           <w:szCs w:val="22"/>
         </w:rPr>
-        <w:t xml:space="preserve">Table 8 isolates the two components. Oracle-B exceeds oracle-A by 5.0 R@|GT| points for Qwen (CI [0.5, 9.5], p = 0.026) and by 2.1 for GLM (CI [−1.9, 6.3], p = 0.35; both exploratory), so the prefixed presentation helps the smaller model and has little measurable effect on the larger one. Replacing the LLM in stage 1 by an embedding classifier, which ranks resources by bge-m3 similarity between the expanded column names and each resource's definition, ranks the gold resource first for only 27% of tables; with the same stage-2 LLM it falls below llm-full (Qwen −11.9 points, GLM −36.0). The gain of the two-stage matcher therefore comes from using the LLM to select the resource, not from having a resource-classification step as such.</w:t>
+        <w:t xml:space="preserve">Table 8 isolates the two components. Oracle-B exceeds oracle-A by 5.0 R@⁠|⁠GT⁠| points for Qwen (CI [0.5, 9.5], p = 0.026) and by 2.1 for GLM (CI [−1.9, 6.3], p = 0.35; both exploratory), so the prefixed presentation helps the smaller model and has little measurable effect on the larger one. Replacing the LLM in stage 1 by an embedding classifier, which ranks resources by bge-m3 similarity between the expanded column names and each resource's definition, ranks the gold resource first for only 27% of tables; with the same stage-2 LLM it falls below llm-full (Qwen −11.9 points, GLM −36.0). LLM resource selection is therefore more effective than the two simple embedding classifiers we tested; this does not show that no non-LLM classifier could work.</w:t>
       </w:r>
     </w:p>
     <w:p>
@@ -9879,7 +9935,7 @@
           <w:szCs w:val="22"/>
           <w:lang w:val="id-ID"/>
         </w:rPr>
-        <w:t xml:space="preserve">Table 8 Target-format ablation and embedding-based resource selection on all 59 tables (R@|GT| annotation-neutral, F1 deployment-strict)</w:t>
+        <w:t xml:space="preserve">Table 8 Target-format ablation and embedding-based resource selection on all 59 tables (R@⁠|⁠GT⁠| annotation-neutral, F1 deployment-strict)</w:t>
       </w:r>
     </w:p>
     <w:tbl>
@@ -9980,7 +10036,7 @@
                 <w:sz w:val="18"/>
                 <w:szCs w:val="18"/>
               </w:rPr>
-              <w:t xml:space="preserve">Qwen R@|GT|</w:t>
+              <w:t xml:space="preserve">Qwen R@⁠|⁠GT⁠|</w:t>
             </w:r>
           </w:p>
         </w:tc>
@@ -10058,7 +10114,7 @@
                 <w:sz w:val="18"/>
                 <w:szCs w:val="18"/>
               </w:rPr>
-              <w:t xml:space="preserve">GLM R@|GT|</w:t>
+              <w:t xml:space="preserve">GLM R@⁠|⁠GT⁠|</w:t>
             </w:r>
           </w:p>
         </w:tc>
@@ -11251,7 +11307,7 @@
           <w:szCs w:val="22"/>
           <w:lang w:val="id-ID"/>
         </w:rPr>
-        <w:t xml:space="preserve">Table 9 R@|GT| per FHIR resource on all 59 tables (n = tables)</w:t>
+        <w:t xml:space="preserve">Table 9 R@⁠|⁠GT⁠| per FHIR resource on all 59 tables (n = tables)</w:t>
       </w:r>
     </w:p>
     <w:tbl>
@@ -13850,7 +13906,7 @@
           <w:sz w:val="22"/>
           <w:szCs w:val="22"/>
         </w:rPr>
-        <w:t xml:space="preserve">Design ablations on dev41 with Qwen did not change the configuration except for the catalogue: the </w:t>
+        <w:t xml:space="preserve">Other design ablations on dev41 with Qwen did not change the configuration: the </w:t>
       </w:r>
       <w:r>
         <w:rPr>
@@ -13864,7 +13920,7 @@
           <w:sz w:val="22"/>
           <w:szCs w:val="22"/>
         </w:rPr>
-        <w:t xml:space="preserve"> text instead of the one-line </w:t>
+        <w:t xml:space="preserve"> catalogue instead of the one-line </w:t>
       </w:r>
       <w:r>
         <w:rPr>
@@ -13878,7 +13934,7 @@
           <w:sz w:val="22"/>
           <w:szCs w:val="22"/>
         </w:rPr>
-        <w:t xml:space="preserve"> text gave +1.5 points and raised stage-1 hits on the seven hardest tables from 0/7 to 3/7, whereas the full "Scope and Usage" text gave −0.1 to −2.1 points. Choosing among separately matched resources by summed LLM confidence was 10.2 points worse than rank 1, and an Indonesian–English glossary hurt llm-full by 10–11 points (p = 0.03).</w:t>
+        <w:t xml:space="preserve"> text gave +1.5 points, the full "Scope and Usage" text −0.1 to −2.1, choosing among separately matched resources by summed LLM confidence −10.2, and an Indonesian–English glossary hurt llm-full by 10–11 points (p = 0.03).</w:t>
       </w:r>
     </w:p>
     <w:p>
@@ -14202,7 +14258,7 @@
                 <w:sz w:val="18"/>
                 <w:szCs w:val="18"/>
               </w:rPr>
-              <w:t xml:space="preserve">Union R@|GT|</w:t>
+              <w:t xml:space="preserve">Union R@⁠|⁠GT⁠|</w:t>
             </w:r>
           </w:p>
         </w:tc>
@@ -14912,7 +14968,21 @@
           <w:sz w:val="22"/>
           <w:szCs w:val="22"/>
         </w:rPr>
-        <w:t xml:space="preserve"> left every stage-1 decision unchanged, so the model understands the Indonesian term but not the convention that a referral is a ServiceRequest. Longer specification text did not help, consistent with reports that both too little and too much context hurt LLM matching [11] and with long-context degradation [27]. Third, a negative instruction not to rank first a resource that the table only references, naming Encounter, Patient and Practitioner as examples, raised wrong rank-1 choices of Encounter from 7 to 14 of 41 tables, in line with known weaknesses of language models on negated prompts [28]. Finally, one held-out system uses generic column names (</w:t>
+        <w:t xml:space="preserve"> left every stage-1 decision unchanged, so the model understands the Indonesian term but not the convention that a referral is a ServiceRequest. The </w:t>
+      </w:r>
+      <w:r>
+        <w:rPr>
+          <w:sz w:val="22"/>
+          <w:szCs w:val="22"/>
+        </w:rPr>
+        <w:t xml:space="preserve">definition</w:t>
+      </w:r>
+      <w:r>
+        <w:rPr>
+          <w:sz w:val="22"/>
+          <w:szCs w:val="22"/>
+        </w:rPr>
+        <w:t xml:space="preserve"> catalogue, which mentions referrals, recovered three of the seven tables that the one-line catalogue missed, but longer specification text did not help further, consistent with reports that both too little and too much context hurt LLM matching [11] and with long-context degradation [27]. Third, a negative instruction not to rank first a resource that the table only references, naming Encounter, Patient and Practitioner as examples, raised wrong rank-1 choices of Encounter from 7 to 14 of 41 tables, in line with known weaknesses of language models on negated prompts [28]. Finally, one held-out system uses generic column names (</w:t>
       </w:r>
       <w:r>
         <w:rPr>
@@ -14955,25 +15025,6 @@
           <w:szCs w:val="22"/>
         </w:rPr>
         <w:t xml:space="preserve">) that cannot be told apart without the table name; Qwen scores 0 there in every non-oracle configuration against an oracle of 0.89.</w:t>
-      </w:r>
-    </w:p>
-    <w:p>
-      <w:pPr>
-        <w:pStyle w:val="Text"/>
-        <w:ind w:firstLine="709" w:end="0"/>
-        <w:rPr>
-          <w:sz w:val="22"/>
-          <w:szCs w:val="22"/>
-          <w:lang w:val="id-ID"/>
-        </w:rPr>
-      </w:pPr>
-      <w:r>
-        <w:rPr>
-          <w:sz w:val="22"/>
-          <w:szCs w:val="22"/>
-          <w:lang w:val="id-ID"/>
-        </w:rPr>
-        <w:t xml:space="preserve">Retrieve-and-rerank designs [12,13] select candidate elements per column, and here their ceiling is set by a retriever that cannot read abbreviated Indonesian names; selecting the resource first uses the structure of the standard instead. That the mined dictionary helps retrieval but not a capable LLM is consistent with work that treats abbreviation expansion as pre-processing for weaker components [19,20].</w:t>
       </w:r>
     </w:p>
     <w:p>
@@ -16011,7 +16062,7 @@
           <w:sz w:val="22"/>
           <w:szCs w:val="22"/>
         </w:rPr>
-        <w:t xml:space="preserve">The study has limits. Its scope is single-resource matching: the conventions place all gold correspondences of a table in one resource, which the primary variant exploits. Tables that genuinely populate several resources, such as a registration table that creates both a Patient and an Encounter, are not measured. As a qualitative, exploratory check, we judged 30 random llm-full predictions that fell outside the gold resource on development tables; 6 were defensible under a multi-resource reading, mostly foreign keys pointing at the referenced resource. This sample is too small, and not an adjudicated alternative gold standard, to estimate how much the single-resource convention changes R@|GT| or F1. Per-table differences have a standard deviation of about 0.28, so effects of 10 points need 120–200 tables for 80% power, and the pre-registered test was underpowered. Each configuration was run once, and API decoding at temperature 0 is not guaranteed to be deterministic. The benchmark covers 11 of about 145 FHIR resources, uses names and types only, is dominated by one system in the development set, and its held-out set has now been used. All source schemas and the FHIR specification are public and may appear in training data, although our annotations do not [29].</w:t>
+        <w:t xml:space="preserve">The study has limits. Its scope is single-resource matching: the conventions place all gold correspondences of a table in one resource, which the primary variant exploits. Tables that genuinely populate several resources, such as a registration table that creates both a Patient and an Encounter, are not measured. As a qualitative, exploratory check, we judged 30 random llm-full predictions that fell outside the gold resource on development tables; 6 were defensible under a multi-resource reading, mostly foreign keys pointing at the referenced resource. This sample is too small, and not an adjudicated alternative gold standard, to estimate how much the single-resource convention changes R@⁠|⁠GT⁠| or F1. Per-table differences have a standard deviation of about 0.28, so effects of 10 points need 120–200 tables for 80% power, and the pre-registered test was underpowered. Each configuration was run once, and API decoding at temperature 0 is not guaranteed to be deterministic. The benchmark covers 11 of about 145 FHIR resources, uses names and types only, is dominated by one system in the development set, and its held-out set has now been used. All source schemas and the FHIR specification are public and may appear in training data, although our annotations do not [29].</w:t>
       </w:r>
     </w:p>
     <w:p>
@@ -16050,7 +16101,7 @@
           <w:sz w:val="22"/>
           <w:szCs w:val="22"/>
         </w:rPr>
-        <w:t xml:space="preserve">Mapping the database of an Indonesian hospital, clinic or community health centre onto FHIR is hard for classic matchers and far from solved for LLMs. When the whole standard is the target, recall drops sharply, and most errors put the right attribute into the wrong resource. In the single-resource setting, choosing the resource first from the standard's own definitions and then matching only against that resource improves recall by 12.7–13.7 points on development tables at about half the prompt tokens, for two open model families; on held-out systems the improvement is directionally consistent but not statistically confirmed. When the resource is chosen correctly, column matching is close to or above the oracle, so resource selection is the bottleneck, and a single human confirmation of the selected resource is a cheap safeguard in practice.</w:t>
+        <w:t xml:space="preserve">Mapping the database of an Indonesian hospital, clinic or community health centre onto FHIR is hard for classic matchers and far from solved for LLMs. When the whole standard is the target, recall drops sharply, and most errors put the right attribute into the wrong resource. In the single-resource setting, choosing the resource first from the standard's own definitions and then matching only against that resource improves recall by 12.7–13.7 points on development tables at about half the prompt tokens, for two open model families; on held-out systems the improvement is directionally consistent but not statistically confirmed. When the resource is chosen correctly, column matching is close to or above the oracle, so resource selection is the bottleneck. Human confirmation of the selected resource is a promising safeguard, although its practical cost and effectiveness remain to be evaluated.</w:t>
       </w:r>
     </w:p>
     <w:p>

</xml_diff>

<commit_message>
docs: address review round 4 (evaluator tests, mapped-column agreement, wording)
- tests/test_evaluation.py: 8 plain-assert tests for the evaluator, incl. a check
  over 826 result rows that strict and lenient share one assignment
- annotation_kit.py: element agreement over columns mapped by >=1 annotator;
  exact-link F1 named as the primary agreement measure
- manuscript: "internally pre-registered" wording, annotator-vs-model information
  note, per-resource caution sentence, tests in data availability; trims to keep
  12 pages (Table 2 excerpt, Tables 8/11 rows moved to text)
- tanggapan_reviewer.md: round-4 responses

Co-Authored-By: Claude Opus 5.5 <noreply@anthropic.com>
</commit_message>
<xml_diff>
--- a/paper/ijccs/IJCCS_manuscript.docx
+++ b/paper/ijccs/IJCCS_manuscript.docx
@@ -207,7 +207,7 @@
           <w:szCs w:val="22"/>
           <w:shd w:fill="FFFFFF" w:val="clear"/>
         </w:rPr>
-        <w:t xml:space="preserve">Fasilitas kesehatan di Indonesia wajib mengirim rekam medis elektronik ke platform SATUSEHAT dalam format HL7 FHIR R4, sehingga integrasi data menjadi masalah pencocokan skema antara skema basis data berbahasa Indonesia yang bersingkatan dan standar berbahasa Inggris. Kami membangun benchmark berisi 59 tabel dari tujuh sistem informasi kesehatan open-source Indonesia dengan 274 korespondensi beranotasi ke 289 elemen FHIR, di mana setiap tabel dipetakan ke satu resource FHIR, dibagi menjadi set pengembangan dan set uji yang dipra-registrasi. Pencocok klasik gagal pada skema ini (COMA R@⁠|⁠GT⁠| 0,15 dibanding 0,53 untuk LLM 8B), dan ketika seluruh standar menjadi target, recall satu prompt LLM turun dari 0,55 ke 0,35 pada tabel pengembangan. Kami mengusulkan pencocok dua tahap yang memilih resource FHIR dari definisi resminya lalu mencocokkan kolom hanya ke resource peringkat pertama. Pada set pengembangan, recall naik 13,7 dan 12,7 poin untuk Qwen3-8B dan GLM-5.3-Flash dengan sekitar separuh token prompt; pada sistem uji, kenaikannya (12,2 dan 7,9 poin) searah tetapi belum terkonfirmasi secara statistik. Analisis galat menunjukkan bahwa hambatan utamanya adalah pemilihan resource, bukan pencocokan kolom, dan bahwa resource yang dirujuk lewat foreign key menyerap prediksi.</w:t>
+        <w:t xml:space="preserve">Fasilitas kesehatan di Indonesia wajib mengirim rekam medis elektronik ke platform SATUSEHAT dalam format HL7 FHIR R4, sehingga integrasi data menjadi masalah pencocokan skema antara skema basis data berbahasa Indonesia yang bersingkatan dan standar berbahasa Inggris. Kami membangun benchmark berisi 59 tabel dari tujuh sistem informasi kesehatan open-source Indonesia dengan 274 korespondensi beranotasi ke 289 elemen FHIR, di mana setiap tabel dipetakan ke satu resource FHIR, dibagi menjadi set pengembangan dan set uji yang dipra-registrasi secara internal. Pencocok klasik gagal pada skema ini (COMA R@⁠|⁠GT⁠| 0,15 dibanding 0,53 untuk LLM 8B), dan ketika seluruh standar menjadi target, recall satu prompt LLM turun dari 0,55 ke 0,35 pada tabel pengembangan. Kami mengusulkan pencocok dua tahap yang memilih resource FHIR dari definisi resminya lalu mencocokkan kolom hanya ke resource peringkat pertama. Pada set pengembangan, recall naik 13,7 dan 12,7 poin untuk Qwen3-8B dan GLM-5.3-Flash dengan sekitar separuh token prompt; pada sistem uji, kenaikannya (12,2 dan 7,9 poin) searah tetapi belum terkonfirmasi secara statistik. Analisis galat menunjukkan bahwa hambatan utamanya adalah pemilihan resource, bukan pencocokan kolom, dan bahwa resource yang dirujuk lewat foreign key menyerap prediksi.</w:t>
       </w:r>
     </w:p>
     <w:p>
@@ -274,7 +274,7 @@
           <w:sz w:val="22"/>
           <w:szCs w:val="22"/>
         </w:rPr>
-        <w:t xml:space="preserve">Indonesian health facilities must report electronic medical records to the national SATUSEHAT platform in HL7 FHIR R4, which turns data integration into a schema-matching problem between abbreviated Indonesian database schemas and an English standard. We build a benchmark of 59 tables from seven open-source Indonesian health information systems with 274 annotated correspondences into 289 FHIR elements, in which each table maps to a single FHIR resource, split into a development set and a pre-registered held-out set. Classic matchers fail on these schemas (COMA R@⁠|⁠GT⁠| 0.15 vs. 0.53 for an 8B LLM), and when the whole standard is the target, the recall of a single LLM prompt drops from 0.55 to 0.35 on development tables. We propose a two-stage matcher that selects the FHIR resource from its official definition and then matches columns only against the top-ranked resource. On the development set it improves recall by 13.7 and 12.7 points for Qwen3-8B and GLM-5.3-Flash at about half the prompt tokens; on held-out systems the gains (12.2 and 7.9 points) are directionally consistent but not statistically confirmed. Error analysis shows that resource selection, not column matching, is the bottleneck, and that resources referenced through foreign keys absorb predictions.</w:t>
+        <w:t xml:space="preserve">Indonesian health facilities must report electronic medical records to the national SATUSEHAT platform in HL7 FHIR R4, which turns data integration into a schema-matching problem between abbreviated Indonesian database schemas and an English standard. We build a benchmark of 59 tables from seven open-source Indonesian health information systems with 274 annotated correspondences into 289 FHIR elements, in which each table maps to a single FHIR resource, split into a development set and an internally pre-registered held-out set. Classic matchers fail on these schemas (COMA R@⁠|⁠GT⁠| 0.15 vs. 0.53 for an 8B LLM), and when the whole standard is the target, the recall of a single LLM prompt drops from 0.55 to 0.35 on development tables. We propose a two-stage matcher that selects the FHIR resource from its official definition and then matches columns only against the top-ranked resource. On the development set it improves recall by 13.7 and 12.7 points for Qwen3-8B and GLM-5.3-Flash at about half the prompt tokens; on held-out systems the gains (12.2 and 7.9 points) are directionally consistent but not statistically confirmed. Error analysis shows that resource selection, not column matching, is the bottleneck, and that resources referenced through foreign keys absorb predictions.</w:t>
       </w:r>
     </w:p>
     <w:p>
@@ -466,7 +466,7 @@
           <w:szCs w:val="22"/>
           <w:lang w:val="id-ID"/>
         </w:rPr>
-        <w:t xml:space="preserve"> case, in which every table is exported as one FHIR resource plus references, in a zero-training, schema-only setting: no labelled pairs, no data values. Its contributions are: (i) a benchmark of 59 tables from seven open-source Indonesian systems mapped to FHIR R4, with annotation conventions, a development/held-out split and a pre-registered confirmation protocol; (ii) a two-stage matcher that first selects the target resource and then matches columns against that resource only, evaluated with two open model families; and (iii) an analysis that separates resource-selection errors from column-matching errors. We do not claim superiority over trained matchers, which we do not evaluate.</w:t>
+        <w:t xml:space="preserve"> case, in which every table is exported as one FHIR resource plus references, in a zero-training, schema-only setting: no labelled pairs, no data values. Its contributions are: (i) a benchmark of 59 tables from seven open-source Indonesian systems mapped to FHIR R4, with annotation conventions, a development/held-out split and an internally pre-registered confirmation protocol; (ii) a two-stage matcher that first selects the target resource and then matches columns against that resource only, evaluated with two open model families; and (iii) an analysis that separates resource-selection errors from column-matching errors. We do not claim superiority over trained matchers, which we do not evaluate.</w:t>
       </w:r>
     </w:p>
     <w:p>
@@ -2985,7 +2985,7 @@
           <w:szCs w:val="22"/>
           <w:lang w:val="id-ID"/>
         </w:rPr>
-        <w:t xml:space="preserve">Table 2 Annotation example: Khanza </w:t>
+        <w:t xml:space="preserve">Table 2 Annotation excerpt: Khanza </w:t>
       </w:r>
       <w:r>
         <w:rPr>
@@ -3001,7 +3001,7 @@
           <w:szCs w:val="22"/>
           <w:lang w:val="id-ID"/>
         </w:rPr>
-        <w:t xml:space="preserve"> (outpatient registration) → FHIR Encounter</w:t>
+        <w:t xml:space="preserve"> (outpatient registration) → FHIR Encounter; 4 of 7 gold 1:1 pairs, the n:1 column and 1 of 2 ambiguous columns</w:t>
       </w:r>
     </w:p>
     <w:tbl>
@@ -3691,7 +3691,6 @@
           </w:tcPr>
           <w:p>
             <w:pPr>
-              <w:keepNext/>
               <w:spacing w:before="0" w:after="0"/>
               <w:jc w:val="left"/>
             </w:pPr>
@@ -3701,7 +3700,7 @@
                 <w:sz w:val="18"/>
                 <w:szCs w:val="18"/>
               </w:rPr>
-              <w:t xml:space="preserve">kd_poli</w:t>
+              <w:t xml:space="preserve">kd_pj</w:t>
             </w:r>
           </w:p>
         </w:tc>
@@ -3717,17 +3716,16 @@
           </w:tcPr>
           <w:p>
             <w:pPr>
-              <w:keepNext/>
-              <w:spacing w:before="0" w:after="0"/>
-              <w:jc w:val="center"/>
-            </w:pPr>
-            <w:r>
-              <w:rPr>
-                <w:rFonts w:ascii="Times New Roman" w:hAnsi="Times New Roman"/>
-                <w:sz w:val="18"/>
-                <w:szCs w:val="18"/>
-              </w:rPr>
-              <w:t xml:space="preserve">clinic code</w:t>
+              <w:spacing w:before="0" w:after="0"/>
+              <w:jc w:val="center"/>
+            </w:pPr>
+            <w:r>
+              <w:rPr>
+                <w:rFonts w:ascii="Times New Roman" w:hAnsi="Times New Roman"/>
+                <w:sz w:val="18"/>
+                <w:szCs w:val="18"/>
+              </w:rPr>
+              <w:t xml:space="preserve">payer code</w:t>
             </w:r>
           </w:p>
         </w:tc>
@@ -3743,334 +3741,6 @@
           </w:tcPr>
           <w:p>
             <w:pPr>
-              <w:keepNext/>
-              <w:spacing w:before="0" w:after="0"/>
-              <w:jc w:val="center"/>
-            </w:pPr>
-            <w:r>
-              <w:rPr>
-                <w:rFonts w:ascii="Times New Roman" w:hAnsi="Times New Roman"/>
-                <w:sz w:val="18"/>
-                <w:szCs w:val="18"/>
-              </w:rPr>
-              <w:t xml:space="preserve">location.location</w:t>
-            </w:r>
-          </w:p>
-        </w:tc>
-        <w:tc>
-          <w:tcPr>
-            <w:tcW w:w="1120" w:type="dxa"/>
-            <w:tcBorders>
-              <w:top w:val="single" w:sz="4" w:space="0" w:color="000000"/>
-              <w:start w:val="single" w:sz="4" w:space="0" w:color="000000"/>
-              <w:bottom w:val="single" w:sz="4" w:space="0" w:color="000000"/>
-              <w:end w:val="single" w:sz="4" w:space="0" w:color="000000"/>
-            </w:tcBorders>
-          </w:tcPr>
-          <w:p>
-            <w:pPr>
-              <w:keepNext/>
-              <w:spacing w:before="0" w:after="0"/>
-              <w:jc w:val="center"/>
-            </w:pPr>
-            <w:r>
-              <w:rPr>
-                <w:rFonts w:ascii="Times New Roman" w:hAnsi="Times New Roman"/>
-                <w:sz w:val="18"/>
-                <w:szCs w:val="18"/>
-              </w:rPr>
-              <w:t xml:space="preserve">1:1</w:t>
-            </w:r>
-          </w:p>
-        </w:tc>
-      </w:tr>
-      <w:tr>
-        <w:trPr>
-          <w:cantSplit/>
-        </w:trPr>
-        <w:tc>
-          <w:tcPr>
-            <w:tcW w:w="1620" w:type="dxa"/>
-            <w:tcBorders>
-              <w:top w:val="single" w:sz="4" w:space="0" w:color="000000"/>
-              <w:start w:val="single" w:sz="4" w:space="0" w:color="000000"/>
-              <w:bottom w:val="single" w:sz="4" w:space="0" w:color="000000"/>
-              <w:end w:val="single" w:sz="4" w:space="0" w:color="000000"/>
-            </w:tcBorders>
-          </w:tcPr>
-          <w:p>
-            <w:pPr>
-              <w:keepNext/>
-              <w:spacing w:before="0" w:after="0"/>
-              <w:jc w:val="left"/>
-            </w:pPr>
-            <w:r>
-              <w:rPr>
-                <w:rFonts w:ascii="Times New Roman" w:hAnsi="Times New Roman"/>
-                <w:sz w:val="18"/>
-                <w:szCs w:val="18"/>
-              </w:rPr>
-              <w:t xml:space="preserve">stts</w:t>
-            </w:r>
-          </w:p>
-        </w:tc>
-        <w:tc>
-          <w:tcPr>
-            <w:tcW w:w="3344" w:type="dxa"/>
-            <w:tcBorders>
-              <w:top w:val="single" w:sz="4" w:space="0" w:color="000000"/>
-              <w:start w:val="single" w:sz="4" w:space="0" w:color="000000"/>
-              <w:bottom w:val="single" w:sz="4" w:space="0" w:color="000000"/>
-              <w:end w:val="single" w:sz="4" w:space="0" w:color="000000"/>
-            </w:tcBorders>
-          </w:tcPr>
-          <w:p>
-            <w:pPr>
-              <w:keepNext/>
-              <w:spacing w:before="0" w:after="0"/>
-              <w:jc w:val="center"/>
-            </w:pPr>
-            <w:r>
-              <w:rPr>
-                <w:rFonts w:ascii="Times New Roman" w:hAnsi="Times New Roman"/>
-                <w:sz w:val="18"/>
-                <w:szCs w:val="18"/>
-              </w:rPr>
-              <w:t xml:space="preserve">visit status</w:t>
-            </w:r>
-          </w:p>
-        </w:tc>
-        <w:tc>
-          <w:tcPr>
-            <w:tcW w:w="2420" w:type="dxa"/>
-            <w:tcBorders>
-              <w:top w:val="single" w:sz="4" w:space="0" w:color="000000"/>
-              <w:start w:val="single" w:sz="4" w:space="0" w:color="000000"/>
-              <w:bottom w:val="single" w:sz="4" w:space="0" w:color="000000"/>
-              <w:end w:val="single" w:sz="4" w:space="0" w:color="000000"/>
-            </w:tcBorders>
-          </w:tcPr>
-          <w:p>
-            <w:pPr>
-              <w:keepNext/>
-              <w:spacing w:before="0" w:after="0"/>
-              <w:jc w:val="center"/>
-            </w:pPr>
-            <w:r>
-              <w:rPr>
-                <w:rFonts w:ascii="Times New Roman" w:hAnsi="Times New Roman"/>
-                <w:sz w:val="18"/>
-                <w:szCs w:val="18"/>
-              </w:rPr>
-              <w:t xml:space="preserve">status</w:t>
-            </w:r>
-          </w:p>
-        </w:tc>
-        <w:tc>
-          <w:tcPr>
-            <w:tcW w:w="1120" w:type="dxa"/>
-            <w:tcBorders>
-              <w:top w:val="single" w:sz="4" w:space="0" w:color="000000"/>
-              <w:start w:val="single" w:sz="4" w:space="0" w:color="000000"/>
-              <w:bottom w:val="single" w:sz="4" w:space="0" w:color="000000"/>
-              <w:end w:val="single" w:sz="4" w:space="0" w:color="000000"/>
-            </w:tcBorders>
-          </w:tcPr>
-          <w:p>
-            <w:pPr>
-              <w:keepNext/>
-              <w:spacing w:before="0" w:after="0"/>
-              <w:jc w:val="center"/>
-            </w:pPr>
-            <w:r>
-              <w:rPr>
-                <w:rFonts w:ascii="Times New Roman" w:hAnsi="Times New Roman"/>
-                <w:sz w:val="18"/>
-                <w:szCs w:val="18"/>
-              </w:rPr>
-              <w:t xml:space="preserve">1:1</w:t>
-            </w:r>
-          </w:p>
-        </w:tc>
-      </w:tr>
-      <w:tr>
-        <w:trPr>
-          <w:cantSplit/>
-        </w:trPr>
-        <w:tc>
-          <w:tcPr>
-            <w:tcW w:w="1620" w:type="dxa"/>
-            <w:tcBorders>
-              <w:top w:val="single" w:sz="4" w:space="0" w:color="000000"/>
-              <w:start w:val="single" w:sz="4" w:space="0" w:color="000000"/>
-              <w:bottom w:val="single" w:sz="4" w:space="0" w:color="000000"/>
-              <w:end w:val="single" w:sz="4" w:space="0" w:color="000000"/>
-            </w:tcBorders>
-          </w:tcPr>
-          <w:p>
-            <w:pPr>
-              <w:keepNext/>
-              <w:spacing w:before="0" w:after="0"/>
-              <w:jc w:val="left"/>
-            </w:pPr>
-            <w:r>
-              <w:rPr>
-                <w:rFonts w:ascii="Times New Roman" w:hAnsi="Times New Roman"/>
-                <w:sz w:val="18"/>
-                <w:szCs w:val="18"/>
-              </w:rPr>
-              <w:t xml:space="preserve">status_lanjut</w:t>
-            </w:r>
-          </w:p>
-        </w:tc>
-        <w:tc>
-          <w:tcPr>
-            <w:tcW w:w="3344" w:type="dxa"/>
-            <w:tcBorders>
-              <w:top w:val="single" w:sz="4" w:space="0" w:color="000000"/>
-              <w:start w:val="single" w:sz="4" w:space="0" w:color="000000"/>
-              <w:bottom w:val="single" w:sz="4" w:space="0" w:color="000000"/>
-              <w:end w:val="single" w:sz="4" w:space="0" w:color="000000"/>
-            </w:tcBorders>
-          </w:tcPr>
-          <w:p>
-            <w:pPr>
-              <w:keepNext/>
-              <w:spacing w:before="0" w:after="0"/>
-              <w:jc w:val="center"/>
-            </w:pPr>
-            <w:r>
-              <w:rPr>
-                <w:rFonts w:ascii="Times New Roman" w:hAnsi="Times New Roman"/>
-                <w:sz w:val="18"/>
-                <w:szCs w:val="18"/>
-              </w:rPr>
-              <w:t xml:space="preserve">outpatient / inpatient</w:t>
-            </w:r>
-          </w:p>
-        </w:tc>
-        <w:tc>
-          <w:tcPr>
-            <w:tcW w:w="2420" w:type="dxa"/>
-            <w:tcBorders>
-              <w:top w:val="single" w:sz="4" w:space="0" w:color="000000"/>
-              <w:start w:val="single" w:sz="4" w:space="0" w:color="000000"/>
-              <w:bottom w:val="single" w:sz="4" w:space="0" w:color="000000"/>
-              <w:end w:val="single" w:sz="4" w:space="0" w:color="000000"/>
-            </w:tcBorders>
-          </w:tcPr>
-          <w:p>
-            <w:pPr>
-              <w:keepNext/>
-              <w:spacing w:before="0" w:after="0"/>
-              <w:jc w:val="center"/>
-            </w:pPr>
-            <w:r>
-              <w:rPr>
-                <w:rFonts w:ascii="Times New Roman" w:hAnsi="Times New Roman"/>
-                <w:sz w:val="18"/>
-                <w:szCs w:val="18"/>
-              </w:rPr>
-              <w:t xml:space="preserve">class</w:t>
-            </w:r>
-          </w:p>
-        </w:tc>
-        <w:tc>
-          <w:tcPr>
-            <w:tcW w:w="1120" w:type="dxa"/>
-            <w:tcBorders>
-              <w:top w:val="single" w:sz="4" w:space="0" w:color="000000"/>
-              <w:start w:val="single" w:sz="4" w:space="0" w:color="000000"/>
-              <w:bottom w:val="single" w:sz="4" w:space="0" w:color="000000"/>
-              <w:end w:val="single" w:sz="4" w:space="0" w:color="000000"/>
-            </w:tcBorders>
-          </w:tcPr>
-          <w:p>
-            <w:pPr>
-              <w:keepNext/>
-              <w:spacing w:before="0" w:after="0"/>
-              <w:jc w:val="center"/>
-            </w:pPr>
-            <w:r>
-              <w:rPr>
-                <w:rFonts w:ascii="Times New Roman" w:hAnsi="Times New Roman"/>
-                <w:sz w:val="18"/>
-                <w:szCs w:val="18"/>
-              </w:rPr>
-              <w:t xml:space="preserve">1:1</w:t>
-            </w:r>
-          </w:p>
-        </w:tc>
-      </w:tr>
-      <w:tr>
-        <w:trPr>
-          <w:cantSplit/>
-        </w:trPr>
-        <w:tc>
-          <w:tcPr>
-            <w:tcW w:w="1620" w:type="dxa"/>
-            <w:tcBorders>
-              <w:top w:val="single" w:sz="4" w:space="0" w:color="000000"/>
-              <w:start w:val="single" w:sz="4" w:space="0" w:color="000000"/>
-              <w:bottom w:val="single" w:sz="4" w:space="0" w:color="000000"/>
-              <w:end w:val="single" w:sz="4" w:space="0" w:color="000000"/>
-            </w:tcBorders>
-          </w:tcPr>
-          <w:p>
-            <w:pPr>
-              <w:keepNext/>
-              <w:spacing w:before="0" w:after="0"/>
-              <w:jc w:val="left"/>
-            </w:pPr>
-            <w:r>
-              <w:rPr>
-                <w:rFonts w:ascii="Times New Roman" w:hAnsi="Times New Roman"/>
-                <w:sz w:val="18"/>
-                <w:szCs w:val="18"/>
-              </w:rPr>
-              <w:t xml:space="preserve">kd_pj</w:t>
-            </w:r>
-          </w:p>
-        </w:tc>
-        <w:tc>
-          <w:tcPr>
-            <w:tcW w:w="3344" w:type="dxa"/>
-            <w:tcBorders>
-              <w:top w:val="single" w:sz="4" w:space="0" w:color="000000"/>
-              <w:start w:val="single" w:sz="4" w:space="0" w:color="000000"/>
-              <w:bottom w:val="single" w:sz="4" w:space="0" w:color="000000"/>
-              <w:end w:val="single" w:sz="4" w:space="0" w:color="000000"/>
-            </w:tcBorders>
-          </w:tcPr>
-          <w:p>
-            <w:pPr>
-              <w:keepNext/>
-              <w:spacing w:before="0" w:after="0"/>
-              <w:jc w:val="center"/>
-            </w:pPr>
-            <w:r>
-              <w:rPr>
-                <w:rFonts w:ascii="Times New Roman" w:hAnsi="Times New Roman"/>
-                <w:sz w:val="18"/>
-                <w:szCs w:val="18"/>
-              </w:rPr>
-              <w:t xml:space="preserve">payer code</w:t>
-            </w:r>
-          </w:p>
-        </w:tc>
-        <w:tc>
-          <w:tcPr>
-            <w:tcW w:w="2420" w:type="dxa"/>
-            <w:tcBorders>
-              <w:top w:val="single" w:sz="4" w:space="0" w:color="000000"/>
-              <w:start w:val="single" w:sz="4" w:space="0" w:color="000000"/>
-              <w:bottom w:val="single" w:sz="4" w:space="0" w:color="000000"/>
-              <w:end w:val="single" w:sz="4" w:space="0" w:color="000000"/>
-            </w:tcBorders>
-          </w:tcPr>
-          <w:p>
-            <w:pPr>
-              <w:keepNext/>
               <w:spacing w:before="0" w:after="0"/>
               <w:jc w:val="center"/>
             </w:pPr>
@@ -4081,112 +3751,6 @@
                 <w:szCs w:val="18"/>
               </w:rPr>
               <w:t xml:space="preserve">account</w:t>
-            </w:r>
-          </w:p>
-        </w:tc>
-        <w:tc>
-          <w:tcPr>
-            <w:tcW w:w="1120" w:type="dxa"/>
-            <w:tcBorders>
-              <w:top w:val="single" w:sz="4" w:space="0" w:color="000000"/>
-              <w:start w:val="single" w:sz="4" w:space="0" w:color="000000"/>
-              <w:bottom w:val="single" w:sz="4" w:space="0" w:color="000000"/>
-              <w:end w:val="single" w:sz="4" w:space="0" w:color="000000"/>
-            </w:tcBorders>
-          </w:tcPr>
-          <w:p>
-            <w:pPr>
-              <w:keepNext/>
-              <w:spacing w:before="0" w:after="0"/>
-              <w:jc w:val="center"/>
-            </w:pPr>
-            <w:r>
-              <w:rPr>
-                <w:rFonts w:ascii="Times New Roman" w:hAnsi="Times New Roman"/>
-                <w:sz w:val="18"/>
-                <w:szCs w:val="18"/>
-              </w:rPr>
-              <w:t xml:space="preserve">ambiguous</w:t>
-            </w:r>
-          </w:p>
-        </w:tc>
-      </w:tr>
-      <w:tr>
-        <w:trPr>
-          <w:cantSplit/>
-        </w:trPr>
-        <w:tc>
-          <w:tcPr>
-            <w:tcW w:w="1620" w:type="dxa"/>
-            <w:tcBorders>
-              <w:top w:val="single" w:sz="4" w:space="0" w:color="000000"/>
-              <w:start w:val="single" w:sz="4" w:space="0" w:color="000000"/>
-              <w:bottom w:val="single" w:sz="4" w:space="0" w:color="000000"/>
-              <w:end w:val="single" w:sz="4" w:space="0" w:color="000000"/>
-            </w:tcBorders>
-          </w:tcPr>
-          <w:p>
-            <w:pPr>
-              <w:spacing w:before="0" w:after="0"/>
-              <w:jc w:val="left"/>
-            </w:pPr>
-            <w:r>
-              <w:rPr>
-                <w:rFonts w:ascii="Times New Roman" w:hAnsi="Times New Roman"/>
-                <w:sz w:val="18"/>
-                <w:szCs w:val="18"/>
-              </w:rPr>
-              <w:t xml:space="preserve">hubunganpj</w:t>
-            </w:r>
-          </w:p>
-        </w:tc>
-        <w:tc>
-          <w:tcPr>
-            <w:tcW w:w="3344" w:type="dxa"/>
-            <w:tcBorders>
-              <w:top w:val="single" w:sz="4" w:space="0" w:color="000000"/>
-              <w:start w:val="single" w:sz="4" w:space="0" w:color="000000"/>
-              <w:bottom w:val="single" w:sz="4" w:space="0" w:color="000000"/>
-              <w:end w:val="single" w:sz="4" w:space="0" w:color="000000"/>
-            </w:tcBorders>
-          </w:tcPr>
-          <w:p>
-            <w:pPr>
-              <w:spacing w:before="0" w:after="0"/>
-              <w:jc w:val="center"/>
-            </w:pPr>
-            <w:r>
-              <w:rPr>
-                <w:rFonts w:ascii="Times New Roman" w:hAnsi="Times New Roman"/>
-                <w:sz w:val="18"/>
-                <w:szCs w:val="18"/>
-              </w:rPr>
-              <w:t xml:space="preserve">relation of responsible person</w:t>
-            </w:r>
-          </w:p>
-        </w:tc>
-        <w:tc>
-          <w:tcPr>
-            <w:tcW w:w="2420" w:type="dxa"/>
-            <w:tcBorders>
-              <w:top w:val="single" w:sz="4" w:space="0" w:color="000000"/>
-              <w:start w:val="single" w:sz="4" w:space="0" w:color="000000"/>
-              <w:bottom w:val="single" w:sz="4" w:space="0" w:color="000000"/>
-              <w:end w:val="single" w:sz="4" w:space="0" w:color="000000"/>
-            </w:tcBorders>
-          </w:tcPr>
-          <w:p>
-            <w:pPr>
-              <w:spacing w:before="0" w:after="0"/>
-              <w:jc w:val="center"/>
-            </w:pPr>
-            <w:r>
-              <w:rPr>
-                <w:rFonts w:ascii="Times New Roman" w:hAnsi="Times New Roman"/>
-                <w:sz w:val="18"/>
-                <w:szCs w:val="18"/>
-              </w:rPr>
-              <w:t xml:space="preserve">participant.type</w:t>
             </w:r>
           </w:p>
         </w:tc>
@@ -4243,7 +3807,22 @@
           <w:sz w:val="22"/>
           <w:szCs w:val="22"/>
         </w:rPr>
-        <w:t xml:space="preserve">The gold standard was drafted by the first annotator and checked by a second annotator, blind to the draft, in two phases. In phase 1, the second annotator chose the FHIR resource of each table independently, from table and column names only; in phase 2, they labelled all 713 columns with the same four labels against the assigned resource. We report four agreement measures: resource selection (raw agreement and Cohen's κ over the 11 resources), annotation category (κ over the four labels), target element (κ over per-column elements, excluding columns that either annotator marked ambiguous), and exact (source column, FHIR element) pairs (F1 between the two sets of 1:1 links). Disagreements were resolved by discussion, and the adjudicated labels form the gold standard [TBD: the four agreement values, the number of labels changed by adjudication, and two examples of disagreements that changed the gold standard].</w:t>
+        <w:t xml:space="preserve">The gold standard was drafted by the first annotator and checked by a second annotator, blind to the draft, in two phases. In phase 1, the second annotator chose the FHIR resource of each table independently, from table and column names only; in phase 2, they labelled all 713 columns with the same four labels against the assigned resource. We report four agreement measures: resource selection (raw agreement and Cohen's κ over the 11 resources), annotation category (κ over the four labels), target element (κ over per-column elements, excluding columns that either annotator marked ambiguous, computed over all columns and over the columns that at least one annotator mapped, because the dominant </w:t>
+      </w:r>
+      <w:r>
+        <w:rPr>
+          <w:sz w:val="22"/>
+          <w:szCs w:val="22"/>
+          <w:i/>
+        </w:rPr>
+        <w:t xml:space="preserve">none</w:t>
+      </w:r>
+      <w:r>
+        <w:rPr>
+          <w:sz w:val="22"/>
+          <w:szCs w:val="22"/>
+        </w:rPr>
+        <w:t xml:space="preserve"> label inflates κ over all columns), and exact (source column, FHIR element) pairs (F1 between the two sets of 1:1 links), which we treat as the primary agreement measure. Annotators see table names as well as column names, whereas the matchers deliberately receive only column names and types: the gold standard is a reference built with richer context than the models are given. Disagreements were resolved by discussion, and the adjudicated labels form the gold standard [TBD: the four agreement values, the number of labels changed by adjudication, and two examples of disagreements that changed the gold standard].</w:t>
       </w:r>
     </w:p>
     <w:p>
@@ -4931,7 +4510,7 @@
           <w:szCs w:val="22"/>
           <w:lang w:val="id-ID"/>
         </w:rPr>
-        <w:t xml:space="preserve">The table pair is the unit of analysis. Differences are computed from unrounded per-table values and reported with 95% bootstrap confidence intervals (10,000 resamples) and Wilcoxon signed-rank tests. The confirmatory analysis is limited to the pre-registered family of two hypotheses on confirm18 with Qwen3-8B and R@⁠|⁠GT⁠|: H1, primary &gt; llm-full, and H2, primary &gt; union, tested one-sided with Holm correction. All other tests, including every GLM result, pooled sets and the correspondence-level analysis (cluster bootstrap and cluster sign-flip permutation over tables), are exploratory and uncorrected.</w:t>
+        <w:t xml:space="preserve">The table pair is the unit of analysis. Differences are computed from unrounded per-table values and reported with 95% bootstrap confidence intervals (10,000 resamples) and Wilcoxon signed-rank tests. The confirmatory analysis is limited to the pre-registered family of two hypotheses on confirm18 with Qwen3-8B and R@⁠|⁠GT⁠|: H1, primary &gt; llm-full, and H2, primary &gt; union, tested one-sided with Holm correction. All other tests, including every GLM result and the pooled sets, are exploratory and uncorrected.</w:t>
       </w:r>
     </w:p>
     <w:p>
@@ -4950,7 +4529,7 @@
           <w:szCs w:val="22"/>
           <w:lang w:val="id-ID"/>
         </w:rPr>
-        <w:t xml:space="preserve">The pre-registration (configurations, hypotheses, metric, tests and the SHA-256 hashes of the confirm18 gold files) was written on 27 October 2026 before any matcher was run on confirm18, and the run script refuses to execute if the hashes differ. Analyses added after the first and second reviews (the deployment policies, oracle-B and the embedding baseline) are recorded in a dated addendum to the same file and are exploratory. It was not deposited with an external registry, so its timing cannot be verified independently; we follow the practice recommended in [26] and release it with the code. Data and code availability: table and column names with types, gold annotations, guidelines, prompts, parser, cached model responses, pre-registration and statistics scripts are available at [repository URL, commit hash]; source dumps are not redistributed.</w:t>
+        <w:t xml:space="preserve">The internally pre-registered protocol (configurations, hypotheses, metric, tests and the SHA-256 hashes of the confirm18 gold files) was written on 27 October 2026 before any matcher was run on confirm18, and the run script refuses to execute if the hashes differ. Analyses added after the first and second reviews (the deployment policies, oracle-B and the embedding baseline) are recorded in a dated addendum to the same file and are exploratory. The protocol is an internal document kept in the project repository; it was not deposited with an external registry, so its timing cannot be verified independently; we follow the practice recommended in [26] and release it with the code. Data and code availability: table and column names with types, gold annotations, guidelines, prompts, parser, cached model responses, pre-registration, statistics scripts and unit tests of the evaluator are available at [repository URL, commit hash]; source dumps are not redistributed.</w:t>
       </w:r>
     </w:p>
     <w:p>
@@ -9284,7 +8863,7 @@
           <w:sz w:val="22"/>
           <w:szCs w:val="22"/>
         </w:rPr>
-        <w:t xml:space="preserve">Restricting stage 2 to one resource is the effective ingredient. The union variant already halves the prompt, but its gain over llm-full is modest for Qwen (+6.8 points on dev41) and vanishes for GLM (+2.5 on dev41, −1.6 on confirm18), while the primary variant adds 7–10 points on top of union for both models. We distinguish three levels of evidence. Across model families, the development-set effect replicates: no design choice was made with GLM, and its effect (+12.7) is close to Qwen's (+13.7). On held-out systems, the effect is directionally consistent but not statistically confirmed: the pre-registered H1 has one-sided p = 0.069 (Holm-corrected 0.138), H2 has Holm-corrected p = 0.17, and the GLM gain is smaller (+7.9, p = 0.36). Thirteen of the 18 held-out tables are ties, because these schemas are smaller and less abbreviated (33% against 58% of columns). We therefore do not claim that the gain generalises across systems. Under the deployment-strict policy the GLM gain on confirm18 is +12.0 points (CI [0.5, 24.2], p = 0.037); this is exploratory evidence from an analysis added after the pre-registration and not corrected for multiplicity, not an independent confirmation of H1. A correspondence-level analysis gives the same ordering but no additional power (pooled +10.2 points, CI [1.4, 19.3], p = 0.029).</w:t>
+        <w:t xml:space="preserve">Restricting stage 2 to one resource is the effective ingredient. The union variant already halves the prompt, but its gain over llm-full is modest for Qwen (+6.8 points on dev41) and vanishes for GLM (+2.5 on dev41, −1.6 on confirm18), while the primary variant adds 7–10 points on top of union for both models. We distinguish three levels of evidence. Across model families, the development-set effect replicates: no design choice was made with GLM, and its effect (+12.7) is close to Qwen's (+13.7). On held-out systems, the effect is directionally consistent but not statistically confirmed: the pre-registered H1 has one-sided p = 0.069 (Holm-corrected 0.138), H2 has Holm-corrected p = 0.17, and the GLM gain is smaller (+7.9, p = 0.36). Thirteen of the 18 held-out tables are ties, because these schemas are smaller and less abbreviated (33% against 58% of columns). We therefore do not claim that the gain generalises across systems. Under the deployment-strict policy the GLM gain on confirm18 is +12.0 points (CI [0.5, 24.2], p = 0.037); this is exploratory evidence from an analysis added after the pre-registration and not corrected for multiplicity, not an independent confirmation of H1.</w:t>
       </w:r>
     </w:p>
     <w:p>
@@ -9915,7 +9494,7 @@
           <w:sz w:val="22"/>
           <w:szCs w:val="22"/>
         </w:rPr>
-        <w:t xml:space="preserve">Table 8 isolates the two components. Oracle-B exceeds oracle-A by 5.0 R@⁠|⁠GT⁠| points for Qwen (CI [0.5, 9.5], p = 0.026) and by 2.1 for GLM (CI [−1.9, 6.3], p = 0.35; both exploratory), so the prefixed presentation helps the smaller model and has little measurable effect on the larger one. Replacing the LLM in stage 1 by an embedding classifier, which ranks resources by bge-m3 similarity between the expanded column names and each resource's definition, ranks the gold resource first for only 27% of tables; with the same stage-2 LLM it falls below llm-full (Qwen −11.9 points, GLM −36.0). LLM resource selection is therefore more effective than the two simple embedding classifiers we tested; this does not show that no non-LLM classifier could work.</w:t>
+        <w:t xml:space="preserve">Table 8 isolates the two components. Oracle-B exceeds oracle-A by 5.0 R@⁠|⁠GT⁠| points for Qwen (CI [0.5, 9.5], p = 0.026) and by 2.1 for GLM (CI [−1.9, 6.3], p = 0.35; both exploratory), so the prefixed presentation helps the smaller model and has little measurable effect on the larger one. Replacing the LLM in stage 1 by an embedding classifier, which ranks resources by bge-m3 similarity between the expanded column names and each resource's definition, ranks the gold resource first for only 27% of tables (24% when element names are added, with lower end-to-end scores); with the same stage-2 LLM it falls below llm-full (Qwen −11.9 points, GLM −36.0). LLM resource selection is therefore more effective than the two simple embedding classifiers we tested; this does not show that no non-LLM classifier could work.</w:t>
       </w:r>
     </w:p>
     <w:p>
@@ -9949,13 +9528,13 @@
         </w:tblCellMar>
       </w:tblPr>
       <w:tblGrid>
-        <w:gridCol w:w="3163"/>
-        <w:gridCol w:w="915"/>
-        <w:gridCol w:w="1015"/>
-        <w:gridCol w:w="798"/>
-        <w:gridCol w:w="876"/>
-        <w:gridCol w:w="976"/>
-        <w:gridCol w:w="761"/>
+        <w:gridCol w:w="2884"/>
+        <w:gridCol w:w="982"/>
+        <w:gridCol w:w="1082"/>
+        <w:gridCol w:w="824"/>
+        <w:gridCol w:w="929"/>
+        <w:gridCol w:w="1029"/>
+        <w:gridCol w:w="774"/>
       </w:tblGrid>
       <w:tr>
         <w:trPr>
@@ -9964,7 +9543,7 @@
         </w:trPr>
         <w:tc>
           <w:tcPr>
-            <w:tcW w:w="3163" w:type="dxa"/>
+            <w:tcW w:w="2884" w:type="dxa"/>
             <w:tcBorders>
               <w:top w:val="single" w:sz="4" w:space="0" w:color="000000"/>
               <w:start w:val="single" w:sz="4" w:space="0" w:color="000000"/>
@@ -9990,7 +9569,7 @@
         </w:tc>
         <w:tc>
           <w:tcPr>
-            <w:tcW w:w="915" w:type="dxa"/>
+            <w:tcW w:w="982" w:type="dxa"/>
             <w:tcBorders>
               <w:top w:val="single" w:sz="4" w:space="0" w:color="000000"/>
               <w:start w:val="single" w:sz="4" w:space="0" w:color="000000"/>
@@ -10016,7 +9595,7 @@
         </w:tc>
         <w:tc>
           <w:tcPr>
-            <w:tcW w:w="1015" w:type="dxa"/>
+            <w:tcW w:w="1082" w:type="dxa"/>
             <w:tcBorders>
               <w:top w:val="single" w:sz="4" w:space="0" w:color="000000"/>
               <w:start w:val="single" w:sz="4" w:space="0" w:color="000000"/>
@@ -10042,7 +9621,7 @@
         </w:tc>
         <w:tc>
           <w:tcPr>
-            <w:tcW w:w="798" w:type="dxa"/>
+            <w:tcW w:w="824" w:type="dxa"/>
             <w:tcBorders>
               <w:top w:val="single" w:sz="4" w:space="0" w:color="000000"/>
               <w:start w:val="single" w:sz="4" w:space="0" w:color="000000"/>
@@ -10068,7 +9647,7 @@
         </w:tc>
         <w:tc>
           <w:tcPr>
-            <w:tcW w:w="876" w:type="dxa"/>
+            <w:tcW w:w="929" w:type="dxa"/>
             <w:tcBorders>
               <w:top w:val="single" w:sz="4" w:space="0" w:color="000000"/>
               <w:start w:val="single" w:sz="4" w:space="0" w:color="000000"/>
@@ -10094,7 +9673,7 @@
         </w:tc>
         <w:tc>
           <w:tcPr>
-            <w:tcW w:w="976" w:type="dxa"/>
+            <w:tcW w:w="1029" w:type="dxa"/>
             <w:tcBorders>
               <w:top w:val="single" w:sz="4" w:space="0" w:color="000000"/>
               <w:start w:val="single" w:sz="4" w:space="0" w:color="000000"/>
@@ -10120,7 +9699,7 @@
         </w:tc>
         <w:tc>
           <w:tcPr>
-            <w:tcW w:w="761" w:type="dxa"/>
+            <w:tcW w:w="774" w:type="dxa"/>
             <w:tcBorders>
               <w:top w:val="single" w:sz="4" w:space="0" w:color="000000"/>
               <w:start w:val="single" w:sz="4" w:space="0" w:color="000000"/>
@@ -10151,7 +9730,7 @@
         </w:trPr>
         <w:tc>
           <w:tcPr>
-            <w:tcW w:w="3163" w:type="dxa"/>
+            <w:tcW w:w="2884" w:type="dxa"/>
             <w:tcBorders>
               <w:top w:val="single" w:sz="4" w:space="0" w:color="000000"/>
               <w:start w:val="single" w:sz="4" w:space="0" w:color="000000"/>
@@ -10177,7 +9756,7 @@
         </w:tc>
         <w:tc>
           <w:tcPr>
-            <w:tcW w:w="915" w:type="dxa"/>
+            <w:tcW w:w="982" w:type="dxa"/>
             <w:tcBorders>
               <w:top w:val="single" w:sz="4" w:space="0" w:color="000000"/>
               <w:start w:val="single" w:sz="4" w:space="0" w:color="000000"/>
@@ -10203,7 +9782,7 @@
         </w:tc>
         <w:tc>
           <w:tcPr>
-            <w:tcW w:w="1015" w:type="dxa"/>
+            <w:tcW w:w="1082" w:type="dxa"/>
             <w:tcBorders>
               <w:top w:val="single" w:sz="4" w:space="0" w:color="000000"/>
               <w:start w:val="single" w:sz="4" w:space="0" w:color="000000"/>
@@ -10229,7 +9808,7 @@
         </w:tc>
         <w:tc>
           <w:tcPr>
-            <w:tcW w:w="798" w:type="dxa"/>
+            <w:tcW w:w="824" w:type="dxa"/>
             <w:tcBorders>
               <w:top w:val="single" w:sz="4" w:space="0" w:color="000000"/>
               <w:start w:val="single" w:sz="4" w:space="0" w:color="000000"/>
@@ -10255,7 +9834,7 @@
         </w:tc>
         <w:tc>
           <w:tcPr>
-            <w:tcW w:w="876" w:type="dxa"/>
+            <w:tcW w:w="929" w:type="dxa"/>
             <w:tcBorders>
               <w:top w:val="single" w:sz="4" w:space="0" w:color="000000"/>
               <w:start w:val="single" w:sz="4" w:space="0" w:color="000000"/>
@@ -10281,7 +9860,7 @@
         </w:tc>
         <w:tc>
           <w:tcPr>
-            <w:tcW w:w="976" w:type="dxa"/>
+            <w:tcW w:w="1029" w:type="dxa"/>
             <w:tcBorders>
               <w:top w:val="single" w:sz="4" w:space="0" w:color="000000"/>
               <w:start w:val="single" w:sz="4" w:space="0" w:color="000000"/>
@@ -10307,7 +9886,7 @@
         </w:tc>
         <w:tc>
           <w:tcPr>
-            <w:tcW w:w="761" w:type="dxa"/>
+            <w:tcW w:w="774" w:type="dxa"/>
             <w:tcBorders>
               <w:top w:val="single" w:sz="4" w:space="0" w:color="000000"/>
               <w:start w:val="single" w:sz="4" w:space="0" w:color="000000"/>
@@ -10338,7 +9917,7 @@
         </w:trPr>
         <w:tc>
           <w:tcPr>
-            <w:tcW w:w="3163" w:type="dxa"/>
+            <w:tcW w:w="2884" w:type="dxa"/>
             <w:tcBorders>
               <w:top w:val="single" w:sz="4" w:space="0" w:color="000000"/>
               <w:start w:val="single" w:sz="4" w:space="0" w:color="000000"/>
@@ -10364,7 +9943,7 @@
         </w:tc>
         <w:tc>
           <w:tcPr>
-            <w:tcW w:w="915" w:type="dxa"/>
+            <w:tcW w:w="982" w:type="dxa"/>
             <w:tcBorders>
               <w:top w:val="single" w:sz="4" w:space="0" w:color="000000"/>
               <w:start w:val="single" w:sz="4" w:space="0" w:color="000000"/>
@@ -10390,7 +9969,7 @@
         </w:tc>
         <w:tc>
           <w:tcPr>
-            <w:tcW w:w="1015" w:type="dxa"/>
+            <w:tcW w:w="1082" w:type="dxa"/>
             <w:tcBorders>
               <w:top w:val="single" w:sz="4" w:space="0" w:color="000000"/>
               <w:start w:val="single" w:sz="4" w:space="0" w:color="000000"/>
@@ -10416,7 +9995,7 @@
         </w:tc>
         <w:tc>
           <w:tcPr>
-            <w:tcW w:w="798" w:type="dxa"/>
+            <w:tcW w:w="824" w:type="dxa"/>
             <w:tcBorders>
               <w:top w:val="single" w:sz="4" w:space="0" w:color="000000"/>
               <w:start w:val="single" w:sz="4" w:space="0" w:color="000000"/>
@@ -10442,7 +10021,7 @@
         </w:tc>
         <w:tc>
           <w:tcPr>
-            <w:tcW w:w="876" w:type="dxa"/>
+            <w:tcW w:w="929" w:type="dxa"/>
             <w:tcBorders>
               <w:top w:val="single" w:sz="4" w:space="0" w:color="000000"/>
               <w:start w:val="single" w:sz="4" w:space="0" w:color="000000"/>
@@ -10468,7 +10047,7 @@
         </w:tc>
         <w:tc>
           <w:tcPr>
-            <w:tcW w:w="976" w:type="dxa"/>
+            <w:tcW w:w="1029" w:type="dxa"/>
             <w:tcBorders>
               <w:top w:val="single" w:sz="4" w:space="0" w:color="000000"/>
               <w:start w:val="single" w:sz="4" w:space="0" w:color="000000"/>
@@ -10494,7 +10073,7 @@
         </w:tc>
         <w:tc>
           <w:tcPr>
-            <w:tcW w:w="761" w:type="dxa"/>
+            <w:tcW w:w="774" w:type="dxa"/>
             <w:tcBorders>
               <w:top w:val="single" w:sz="4" w:space="0" w:color="000000"/>
               <w:start w:val="single" w:sz="4" w:space="0" w:color="000000"/>
@@ -10525,7 +10104,7 @@
         </w:trPr>
         <w:tc>
           <w:tcPr>
-            <w:tcW w:w="3163" w:type="dxa"/>
+            <w:tcW w:w="2884" w:type="dxa"/>
             <w:tcBorders>
               <w:top w:val="single" w:sz="4" w:space="0" w:color="000000"/>
               <w:start w:val="single" w:sz="4" w:space="0" w:color="000000"/>
@@ -10551,7 +10130,7 @@
         </w:tc>
         <w:tc>
           <w:tcPr>
-            <w:tcW w:w="915" w:type="dxa"/>
+            <w:tcW w:w="982" w:type="dxa"/>
             <w:tcBorders>
               <w:top w:val="single" w:sz="4" w:space="0" w:color="000000"/>
               <w:start w:val="single" w:sz="4" w:space="0" w:color="000000"/>
@@ -10577,7 +10156,7 @@
         </w:tc>
         <w:tc>
           <w:tcPr>
-            <w:tcW w:w="1015" w:type="dxa"/>
+            <w:tcW w:w="1082" w:type="dxa"/>
             <w:tcBorders>
               <w:top w:val="single" w:sz="4" w:space="0" w:color="000000"/>
               <w:start w:val="single" w:sz="4" w:space="0" w:color="000000"/>
@@ -10603,7 +10182,7 @@
         </w:tc>
         <w:tc>
           <w:tcPr>
-            <w:tcW w:w="798" w:type="dxa"/>
+            <w:tcW w:w="824" w:type="dxa"/>
             <w:tcBorders>
               <w:top w:val="single" w:sz="4" w:space="0" w:color="000000"/>
               <w:start w:val="single" w:sz="4" w:space="0" w:color="000000"/>
@@ -10629,7 +10208,7 @@
         </w:tc>
         <w:tc>
           <w:tcPr>
-            <w:tcW w:w="876" w:type="dxa"/>
+            <w:tcW w:w="929" w:type="dxa"/>
             <w:tcBorders>
               <w:top w:val="single" w:sz="4" w:space="0" w:color="000000"/>
               <w:start w:val="single" w:sz="4" w:space="0" w:color="000000"/>
@@ -10655,7 +10234,7 @@
         </w:tc>
         <w:tc>
           <w:tcPr>
-            <w:tcW w:w="976" w:type="dxa"/>
+            <w:tcW w:w="1029" w:type="dxa"/>
             <w:tcBorders>
               <w:top w:val="single" w:sz="4" w:space="0" w:color="000000"/>
               <w:start w:val="single" w:sz="4" w:space="0" w:color="000000"/>
@@ -10681,7 +10260,7 @@
         </w:tc>
         <w:tc>
           <w:tcPr>
-            <w:tcW w:w="761" w:type="dxa"/>
+            <w:tcW w:w="774" w:type="dxa"/>
             <w:tcBorders>
               <w:top w:val="single" w:sz="4" w:space="0" w:color="000000"/>
               <w:start w:val="single" w:sz="4" w:space="0" w:color="000000"/>
@@ -10712,7 +10291,7 @@
         </w:trPr>
         <w:tc>
           <w:tcPr>
-            <w:tcW w:w="3163" w:type="dxa"/>
+            <w:tcW w:w="2884" w:type="dxa"/>
             <w:tcBorders>
               <w:top w:val="single" w:sz="4" w:space="0" w:color="000000"/>
               <w:start w:val="single" w:sz="4" w:space="0" w:color="000000"/>
@@ -10738,7 +10317,7 @@
         </w:tc>
         <w:tc>
           <w:tcPr>
-            <w:tcW w:w="915" w:type="dxa"/>
+            <w:tcW w:w="982" w:type="dxa"/>
             <w:tcBorders>
               <w:top w:val="single" w:sz="4" w:space="0" w:color="000000"/>
               <w:start w:val="single" w:sz="4" w:space="0" w:color="000000"/>
@@ -10764,7 +10343,7 @@
         </w:tc>
         <w:tc>
           <w:tcPr>
-            <w:tcW w:w="1015" w:type="dxa"/>
+            <w:tcW w:w="1082" w:type="dxa"/>
             <w:tcBorders>
               <w:top w:val="single" w:sz="4" w:space="0" w:color="000000"/>
               <w:start w:val="single" w:sz="4" w:space="0" w:color="000000"/>
@@ -10790,7 +10369,7 @@
         </w:tc>
         <w:tc>
           <w:tcPr>
-            <w:tcW w:w="798" w:type="dxa"/>
+            <w:tcW w:w="824" w:type="dxa"/>
             <w:tcBorders>
               <w:top w:val="single" w:sz="4" w:space="0" w:color="000000"/>
               <w:start w:val="single" w:sz="4" w:space="0" w:color="000000"/>
@@ -10816,7 +10395,7 @@
         </w:tc>
         <w:tc>
           <w:tcPr>
-            <w:tcW w:w="876" w:type="dxa"/>
+            <w:tcW w:w="929" w:type="dxa"/>
             <w:tcBorders>
               <w:top w:val="single" w:sz="4" w:space="0" w:color="000000"/>
               <w:start w:val="single" w:sz="4" w:space="0" w:color="000000"/>
@@ -10842,7 +10421,7 @@
         </w:tc>
         <w:tc>
           <w:tcPr>
-            <w:tcW w:w="976" w:type="dxa"/>
+            <w:tcW w:w="1029" w:type="dxa"/>
             <w:tcBorders>
               <w:top w:val="single" w:sz="4" w:space="0" w:color="000000"/>
               <w:start w:val="single" w:sz="4" w:space="0" w:color="000000"/>
@@ -10868,7 +10447,7 @@
         </w:tc>
         <w:tc>
           <w:tcPr>
-            <w:tcW w:w="761" w:type="dxa"/>
+            <w:tcW w:w="774" w:type="dxa"/>
             <w:tcBorders>
               <w:top w:val="single" w:sz="4" w:space="0" w:color="000000"/>
               <w:start w:val="single" w:sz="4" w:space="0" w:color="000000"/>
@@ -10899,17 +10478,16 @@
         </w:trPr>
         <w:tc>
           <w:tcPr>
-            <w:tcW w:w="3163" w:type="dxa"/>
-            <w:tcBorders>
-              <w:top w:val="single" w:sz="4" w:space="0" w:color="000000"/>
-              <w:start w:val="single" w:sz="4" w:space="0" w:color="000000"/>
-              <w:bottom w:val="single" w:sz="4" w:space="0" w:color="000000"/>
-              <w:end w:val="single" w:sz="4" w:space="0" w:color="000000"/>
-            </w:tcBorders>
-          </w:tcPr>
-          <w:p>
-            <w:pPr>
-              <w:keepNext/>
+            <w:tcW w:w="2884" w:type="dxa"/>
+            <w:tcBorders>
+              <w:top w:val="single" w:sz="4" w:space="0" w:color="000000"/>
+              <w:start w:val="single" w:sz="4" w:space="0" w:color="000000"/>
+              <w:bottom w:val="single" w:sz="4" w:space="0" w:color="000000"/>
+              <w:end w:val="single" w:sz="4" w:space="0" w:color="000000"/>
+            </w:tcBorders>
+          </w:tcPr>
+          <w:p>
+            <w:pPr>
               <w:spacing w:before="0" w:after="0"/>
               <w:jc w:val="left"/>
             </w:pPr>
@@ -10919,199 +10497,13 @@
                 <w:sz w:val="18"/>
                 <w:szCs w:val="18"/>
               </w:rPr>
-              <w:t xml:space="preserve">primary, embedding stage 1 (definition + element names)</w:t>
-            </w:r>
-          </w:p>
-        </w:tc>
-        <w:tc>
-          <w:tcPr>
-            <w:tcW w:w="915" w:type="dxa"/>
-            <w:tcBorders>
-              <w:top w:val="single" w:sz="4" w:space="0" w:color="000000"/>
-              <w:start w:val="single" w:sz="4" w:space="0" w:color="000000"/>
-              <w:bottom w:val="single" w:sz="4" w:space="0" w:color="000000"/>
-              <w:end w:val="single" w:sz="4" w:space="0" w:color="000000"/>
-            </w:tcBorders>
-          </w:tcPr>
-          <w:p>
-            <w:pPr>
-              <w:keepNext/>
-              <w:spacing w:before="0" w:after="0"/>
-              <w:jc w:val="center"/>
-            </w:pPr>
-            <w:r>
-              <w:rPr>
-                <w:rFonts w:ascii="Times New Roman" w:hAnsi="Times New Roman"/>
-                <w:sz w:val="18"/>
-                <w:szCs w:val="18"/>
-              </w:rPr>
-              <w:t xml:space="preserve">0.24</w:t>
-            </w:r>
-          </w:p>
-        </w:tc>
-        <w:tc>
-          <w:tcPr>
-            <w:tcW w:w="1015" w:type="dxa"/>
-            <w:tcBorders>
-              <w:top w:val="single" w:sz="4" w:space="0" w:color="000000"/>
-              <w:start w:val="single" w:sz="4" w:space="0" w:color="000000"/>
-              <w:bottom w:val="single" w:sz="4" w:space="0" w:color="000000"/>
-              <w:end w:val="single" w:sz="4" w:space="0" w:color="000000"/>
-            </w:tcBorders>
-          </w:tcPr>
-          <w:p>
-            <w:pPr>
-              <w:keepNext/>
-              <w:spacing w:before="0" w:after="0"/>
-              <w:jc w:val="center"/>
-            </w:pPr>
-            <w:r>
-              <w:rPr>
-                <w:rFonts w:ascii="Times New Roman" w:hAnsi="Times New Roman"/>
-                <w:sz w:val="18"/>
-                <w:szCs w:val="18"/>
-              </w:rPr>
-              <w:t xml:space="preserve">0.189</w:t>
-            </w:r>
-          </w:p>
-        </w:tc>
-        <w:tc>
-          <w:tcPr>
-            <w:tcW w:w="798" w:type="dxa"/>
-            <w:tcBorders>
-              <w:top w:val="single" w:sz="4" w:space="0" w:color="000000"/>
-              <w:start w:val="single" w:sz="4" w:space="0" w:color="000000"/>
-              <w:bottom w:val="single" w:sz="4" w:space="0" w:color="000000"/>
-              <w:end w:val="single" w:sz="4" w:space="0" w:color="000000"/>
-            </w:tcBorders>
-          </w:tcPr>
-          <w:p>
-            <w:pPr>
-              <w:keepNext/>
-              <w:spacing w:before="0" w:after="0"/>
-              <w:jc w:val="center"/>
-            </w:pPr>
-            <w:r>
-              <w:rPr>
-                <w:rFonts w:ascii="Times New Roman" w:hAnsi="Times New Roman"/>
-                <w:sz w:val="18"/>
-                <w:szCs w:val="18"/>
-              </w:rPr>
-              <w:t xml:space="preserve">0.168</w:t>
-            </w:r>
-          </w:p>
-        </w:tc>
-        <w:tc>
-          <w:tcPr>
-            <w:tcW w:w="876" w:type="dxa"/>
-            <w:tcBorders>
-              <w:top w:val="single" w:sz="4" w:space="0" w:color="000000"/>
-              <w:start w:val="single" w:sz="4" w:space="0" w:color="000000"/>
-              <w:bottom w:val="single" w:sz="4" w:space="0" w:color="000000"/>
-              <w:end w:val="single" w:sz="4" w:space="0" w:color="000000"/>
-            </w:tcBorders>
-          </w:tcPr>
-          <w:p>
-            <w:pPr>
-              <w:keepNext/>
-              <w:spacing w:before="0" w:after="0"/>
-              <w:jc w:val="center"/>
-            </w:pPr>
-            <w:r>
-              <w:rPr>
-                <w:rFonts w:ascii="Times New Roman" w:hAnsi="Times New Roman"/>
-                <w:sz w:val="18"/>
-                <w:szCs w:val="18"/>
-              </w:rPr>
-              <w:t xml:space="preserve">0.24</w:t>
-            </w:r>
-          </w:p>
-        </w:tc>
-        <w:tc>
-          <w:tcPr>
-            <w:tcW w:w="976" w:type="dxa"/>
-            <w:tcBorders>
-              <w:top w:val="single" w:sz="4" w:space="0" w:color="000000"/>
-              <w:start w:val="single" w:sz="4" w:space="0" w:color="000000"/>
-              <w:bottom w:val="single" w:sz="4" w:space="0" w:color="000000"/>
-              <w:end w:val="single" w:sz="4" w:space="0" w:color="000000"/>
-            </w:tcBorders>
-          </w:tcPr>
-          <w:p>
-            <w:pPr>
-              <w:keepNext/>
-              <w:spacing w:before="0" w:after="0"/>
-              <w:jc w:val="center"/>
-            </w:pPr>
-            <w:r>
-              <w:rPr>
-                <w:rFonts w:ascii="Times New Roman" w:hAnsi="Times New Roman"/>
-                <w:sz w:val="18"/>
-                <w:szCs w:val="18"/>
-              </w:rPr>
-              <w:t xml:space="preserve">0.197</w:t>
-            </w:r>
-          </w:p>
-        </w:tc>
-        <w:tc>
-          <w:tcPr>
-            <w:tcW w:w="761" w:type="dxa"/>
-            <w:tcBorders>
-              <w:top w:val="single" w:sz="4" w:space="0" w:color="000000"/>
-              <w:start w:val="single" w:sz="4" w:space="0" w:color="000000"/>
-              <w:bottom w:val="single" w:sz="4" w:space="0" w:color="000000"/>
-              <w:end w:val="single" w:sz="4" w:space="0" w:color="000000"/>
-            </w:tcBorders>
-          </w:tcPr>
-          <w:p>
-            <w:pPr>
-              <w:keepNext/>
-              <w:spacing w:before="0" w:after="0"/>
-              <w:jc w:val="center"/>
-            </w:pPr>
-            <w:r>
-              <w:rPr>
-                <w:rFonts w:ascii="Times New Roman" w:hAnsi="Times New Roman"/>
-                <w:sz w:val="18"/>
-                <w:szCs w:val="18"/>
-              </w:rPr>
-              <w:t xml:space="preserve">0.183</w:t>
-            </w:r>
-          </w:p>
-        </w:tc>
-      </w:tr>
-      <w:tr>
-        <w:trPr>
-          <w:cantSplit/>
-        </w:trPr>
-        <w:tc>
-          <w:tcPr>
-            <w:tcW w:w="3163" w:type="dxa"/>
-            <w:tcBorders>
-              <w:top w:val="single" w:sz="4" w:space="0" w:color="000000"/>
-              <w:start w:val="single" w:sz="4" w:space="0" w:color="000000"/>
-              <w:bottom w:val="single" w:sz="4" w:space="0" w:color="000000"/>
-              <w:end w:val="single" w:sz="4" w:space="0" w:color="000000"/>
-            </w:tcBorders>
-          </w:tcPr>
-          <w:p>
-            <w:pPr>
-              <w:spacing w:before="0" w:after="0"/>
-              <w:jc w:val="left"/>
-            </w:pPr>
-            <w:r>
-              <w:rPr>
-                <w:rFonts w:ascii="Times New Roman" w:hAnsi="Times New Roman"/>
-                <w:sz w:val="18"/>
-                <w:szCs w:val="18"/>
-              </w:rPr>
               <w:t xml:space="preserve">llm-full (no stage 1)</w:t>
             </w:r>
           </w:p>
         </w:tc>
         <w:tc>
           <w:tcPr>
-            <w:tcW w:w="915" w:type="dxa"/>
+            <w:tcW w:w="982" w:type="dxa"/>
             <w:tcBorders>
               <w:top w:val="single" w:sz="4" w:space="0" w:color="000000"/>
               <w:start w:val="single" w:sz="4" w:space="0" w:color="000000"/>
@@ -11136,7 +10528,7 @@
         </w:tc>
         <w:tc>
           <w:tcPr>
-            <w:tcW w:w="1015" w:type="dxa"/>
+            <w:tcW w:w="1082" w:type="dxa"/>
             <w:tcBorders>
               <w:top w:val="single" w:sz="4" w:space="0" w:color="000000"/>
               <w:start w:val="single" w:sz="4" w:space="0" w:color="000000"/>
@@ -11161,7 +10553,7 @@
         </w:tc>
         <w:tc>
           <w:tcPr>
-            <w:tcW w:w="798" w:type="dxa"/>
+            <w:tcW w:w="824" w:type="dxa"/>
             <w:tcBorders>
               <w:top w:val="single" w:sz="4" w:space="0" w:color="000000"/>
               <w:start w:val="single" w:sz="4" w:space="0" w:color="000000"/>
@@ -11186,7 +10578,7 @@
         </w:tc>
         <w:tc>
           <w:tcPr>
-            <w:tcW w:w="876" w:type="dxa"/>
+            <w:tcW w:w="929" w:type="dxa"/>
             <w:tcBorders>
               <w:top w:val="single" w:sz="4" w:space="0" w:color="000000"/>
               <w:start w:val="single" w:sz="4" w:space="0" w:color="000000"/>
@@ -11211,7 +10603,7 @@
         </w:tc>
         <w:tc>
           <w:tcPr>
-            <w:tcW w:w="976" w:type="dxa"/>
+            <w:tcW w:w="1029" w:type="dxa"/>
             <w:tcBorders>
               <w:top w:val="single" w:sz="4" w:space="0" w:color="000000"/>
               <w:start w:val="single" w:sz="4" w:space="0" w:color="000000"/>
@@ -11236,7 +10628,7 @@
         </w:tc>
         <w:tc>
           <w:tcPr>
-            <w:tcW w:w="761" w:type="dxa"/>
+            <w:tcW w:w="774" w:type="dxa"/>
             <w:tcBorders>
               <w:top w:val="single" w:sz="4" w:space="0" w:color="000000"/>
               <w:start w:val="single" w:sz="4" w:space="0" w:color="000000"/>
@@ -11287,7 +10679,7 @@
           <w:sz w:val="22"/>
           <w:szCs w:val="22"/>
         </w:rPr>
-        <w:t xml:space="preserve">The gain is also not uniform across resources (Table 9). It is largest for MedicationRequest, Organization and, for GLM, ServiceRequest, and negative where the rank-1 choice is often wrong, such as Practitioner for Qwen. Higher primary than oracle scores, e.g. Qwen on Condition, follow from the target-format difference in Table 8 and from small n.</w:t>
+        <w:t xml:space="preserve">The gain is also not uniform across resources (Table 9). It is largest for MedicationRequest, Organization and, for GLM, ServiceRequest, and negative where the rank-1 choice is often wrong, such as Practitioner for Qwen. Higher primary than oracle scores, e.g. Qwen on Condition, follow from the target-format difference in Table 8 and from small n. The average improvement does not hold for every resource: with Qwen, ServiceRequest, which carries referrals and orders, stays at 0 and Practitioner drops, so mappings into such resources need stricter manual validation before use.</w:t>
       </w:r>
     </w:p>
     <w:p>
@@ -15497,7 +14889,6 @@
           </w:tcPr>
           <w:p>
             <w:pPr>
-              <w:keepNext/>
               <w:spacing w:before="0" w:after="0"/>
               <w:jc w:val="left"/>
             </w:pPr>
@@ -15507,7 +14898,7 @@
                 <w:sz w:val="18"/>
                 <w:szCs w:val="18"/>
               </w:rPr>
-              <w:t xml:space="preserve">two-stage union</w:t>
+              <w:t xml:space="preserve">two-stage primary</w:t>
             </w:r>
           </w:p>
         </w:tc>
@@ -15523,17 +14914,16 @@
           </w:tcPr>
           <w:p>
             <w:pPr>
-              <w:keepNext/>
-              <w:spacing w:before="0" w:after="0"/>
-              <w:jc w:val="center"/>
-            </w:pPr>
-            <w:r>
-              <w:rPr>
-                <w:rFonts w:ascii="Times New Roman" w:hAnsi="Times New Roman"/>
-                <w:sz w:val="18"/>
-                <w:szCs w:val="18"/>
-              </w:rPr>
-              <w:t xml:space="preserve">1,287</w:t>
+              <w:spacing w:before="0" w:after="0"/>
+              <w:jc w:val="center"/>
+            </w:pPr>
+            <w:r>
+              <w:rPr>
+                <w:rFonts w:ascii="Times New Roman" w:hAnsi="Times New Roman"/>
+                <w:sz w:val="18"/>
+                <w:szCs w:val="18"/>
+              </w:rPr>
+              <w:t xml:space="preserve">1,015</w:t>
             </w:r>
           </w:p>
         </w:tc>
@@ -15549,17 +14939,16 @@
           </w:tcPr>
           <w:p>
             <w:pPr>
-              <w:keepNext/>
-              <w:spacing w:before="0" w:after="0"/>
-              <w:jc w:val="center"/>
-            </w:pPr>
-            <w:r>
-              <w:rPr>
-                <w:rFonts w:ascii="Times New Roman" w:hAnsi="Times New Roman"/>
-                <w:sz w:val="18"/>
-                <w:szCs w:val="18"/>
-              </w:rPr>
-              <w:t xml:space="preserve">395</w:t>
+              <w:spacing w:before="0" w:after="0"/>
+              <w:jc w:val="center"/>
+            </w:pPr>
+            <w:r>
+              <w:rPr>
+                <w:rFonts w:ascii="Times New Roman" w:hAnsi="Times New Roman"/>
+                <w:sz w:val="18"/>
+                <w:szCs w:val="18"/>
+              </w:rPr>
+              <w:t xml:space="preserve">324</w:t>
             </w:r>
           </w:p>
         </w:tc>
@@ -15575,17 +14964,16 @@
           </w:tcPr>
           <w:p>
             <w:pPr>
-              <w:keepNext/>
-              <w:spacing w:before="0" w:after="0"/>
-              <w:jc w:val="center"/>
-            </w:pPr>
-            <w:r>
-              <w:rPr>
-                <w:rFonts w:ascii="Times New Roman" w:hAnsi="Times New Roman"/>
-                <w:sz w:val="18"/>
-                <w:szCs w:val="18"/>
-              </w:rPr>
-              <w:t xml:space="preserve">17.1</w:t>
+              <w:spacing w:before="0" w:after="0"/>
+              <w:jc w:val="center"/>
+            </w:pPr>
+            <w:r>
+              <w:rPr>
+                <w:rFonts w:ascii="Times New Roman" w:hAnsi="Times New Roman"/>
+                <w:sz w:val="18"/>
+                <w:szCs w:val="18"/>
+              </w:rPr>
+              <w:t xml:space="preserve">16.1</w:t>
             </w:r>
           </w:p>
         </w:tc>
@@ -15601,17 +14989,16 @@
           </w:tcPr>
           <w:p>
             <w:pPr>
-              <w:keepNext/>
-              <w:spacing w:before="0" w:after="0"/>
-              <w:jc w:val="center"/>
-            </w:pPr>
-            <w:r>
-              <w:rPr>
-                <w:rFonts w:ascii="Times New Roman" w:hAnsi="Times New Roman"/>
-                <w:sz w:val="18"/>
-                <w:szCs w:val="18"/>
-              </w:rPr>
-              <w:t xml:space="preserve">1,153</w:t>
+              <w:spacing w:before="0" w:after="0"/>
+              <w:jc w:val="center"/>
+            </w:pPr>
+            <w:r>
+              <w:rPr>
+                <w:rFonts w:ascii="Times New Roman" w:hAnsi="Times New Roman"/>
+                <w:sz w:val="18"/>
+                <w:szCs w:val="18"/>
+              </w:rPr>
+              <w:t xml:space="preserve">1,022</w:t>
             </w:r>
           </w:p>
         </w:tc>
@@ -15627,17 +15014,16 @@
           </w:tcPr>
           <w:p>
             <w:pPr>
-              <w:keepNext/>
-              <w:spacing w:before="0" w:after="0"/>
-              <w:jc w:val="center"/>
-            </w:pPr>
-            <w:r>
-              <w:rPr>
-                <w:rFonts w:ascii="Times New Roman" w:hAnsi="Times New Roman"/>
-                <w:sz w:val="18"/>
-                <w:szCs w:val="18"/>
-              </w:rPr>
-              <w:t xml:space="preserve">326</w:t>
+              <w:spacing w:before="0" w:after="0"/>
+              <w:jc w:val="center"/>
+            </w:pPr>
+            <w:r>
+              <w:rPr>
+                <w:rFonts w:ascii="Times New Roman" w:hAnsi="Times New Roman"/>
+                <w:sz w:val="18"/>
+                <w:szCs w:val="18"/>
+              </w:rPr>
+              <w:t xml:space="preserve">265</w:t>
             </w:r>
           </w:p>
         </w:tc>
@@ -15653,194 +15039,6 @@
           </w:tcPr>
           <w:p>
             <w:pPr>
-              <w:keepNext/>
-              <w:spacing w:before="0" w:after="0"/>
-              <w:jc w:val="center"/>
-            </w:pPr>
-            <w:r>
-              <w:rPr>
-                <w:rFonts w:ascii="Times New Roman" w:hAnsi="Times New Roman"/>
-                <w:sz w:val="18"/>
-                <w:szCs w:val="18"/>
-              </w:rPr>
-              <w:t xml:space="preserve">3.3</w:t>
-            </w:r>
-          </w:p>
-        </w:tc>
-      </w:tr>
-      <w:tr>
-        <w:trPr>
-          <w:cantSplit/>
-        </w:trPr>
-        <w:tc>
-          <w:tcPr>
-            <w:tcW w:w="1914" w:type="dxa"/>
-            <w:tcBorders>
-              <w:top w:val="single" w:sz="4" w:space="0" w:color="000000"/>
-              <w:start w:val="single" w:sz="4" w:space="0" w:color="000000"/>
-              <w:bottom w:val="single" w:sz="4" w:space="0" w:color="000000"/>
-              <w:end w:val="single" w:sz="4" w:space="0" w:color="000000"/>
-            </w:tcBorders>
-          </w:tcPr>
-          <w:p>
-            <w:pPr>
-              <w:keepNext/>
-              <w:spacing w:before="0" w:after="0"/>
-              <w:jc w:val="left"/>
-            </w:pPr>
-            <w:r>
-              <w:rPr>
-                <w:rFonts w:ascii="Times New Roman" w:hAnsi="Times New Roman"/>
-                <w:sz w:val="18"/>
-                <w:szCs w:val="18"/>
-              </w:rPr>
-              <w:t xml:space="preserve">two-stage primary</w:t>
-            </w:r>
-          </w:p>
-        </w:tc>
-        <w:tc>
-          <w:tcPr>
-            <w:tcW w:w="1313" w:type="dxa"/>
-            <w:tcBorders>
-              <w:top w:val="single" w:sz="4" w:space="0" w:color="000000"/>
-              <w:start w:val="single" w:sz="4" w:space="0" w:color="000000"/>
-              <w:bottom w:val="single" w:sz="4" w:space="0" w:color="000000"/>
-              <w:end w:val="single" w:sz="4" w:space="0" w:color="000000"/>
-            </w:tcBorders>
-          </w:tcPr>
-          <w:p>
-            <w:pPr>
-              <w:keepNext/>
-              <w:spacing w:before="0" w:after="0"/>
-              <w:jc w:val="center"/>
-            </w:pPr>
-            <w:r>
-              <w:rPr>
-                <w:rFonts w:ascii="Times New Roman" w:hAnsi="Times New Roman"/>
-                <w:sz w:val="18"/>
-                <w:szCs w:val="18"/>
-              </w:rPr>
-              <w:t xml:space="preserve">1,015</w:t>
-            </w:r>
-          </w:p>
-        </w:tc>
-        <w:tc>
-          <w:tcPr>
-            <w:tcW w:w="1313" w:type="dxa"/>
-            <w:tcBorders>
-              <w:top w:val="single" w:sz="4" w:space="0" w:color="000000"/>
-              <w:start w:val="single" w:sz="4" w:space="0" w:color="000000"/>
-              <w:bottom w:val="single" w:sz="4" w:space="0" w:color="000000"/>
-              <w:end w:val="single" w:sz="4" w:space="0" w:color="000000"/>
-            </w:tcBorders>
-          </w:tcPr>
-          <w:p>
-            <w:pPr>
-              <w:keepNext/>
-              <w:spacing w:before="0" w:after="0"/>
-              <w:jc w:val="center"/>
-            </w:pPr>
-            <w:r>
-              <w:rPr>
-                <w:rFonts w:ascii="Times New Roman" w:hAnsi="Times New Roman"/>
-                <w:sz w:val="18"/>
-                <w:szCs w:val="18"/>
-              </w:rPr>
-              <w:t xml:space="preserve">324</w:t>
-            </w:r>
-          </w:p>
-        </w:tc>
-        <w:tc>
-          <w:tcPr>
-            <w:tcW w:w="817" w:type="dxa"/>
-            <w:tcBorders>
-              <w:top w:val="single" w:sz="4" w:space="0" w:color="000000"/>
-              <w:start w:val="single" w:sz="4" w:space="0" w:color="000000"/>
-              <w:bottom w:val="single" w:sz="4" w:space="0" w:color="000000"/>
-              <w:end w:val="single" w:sz="4" w:space="0" w:color="000000"/>
-            </w:tcBorders>
-          </w:tcPr>
-          <w:p>
-            <w:pPr>
-              <w:keepNext/>
-              <w:spacing w:before="0" w:after="0"/>
-              <w:jc w:val="center"/>
-            </w:pPr>
-            <w:r>
-              <w:rPr>
-                <w:rFonts w:ascii="Times New Roman" w:hAnsi="Times New Roman"/>
-                <w:sz w:val="18"/>
-                <w:szCs w:val="18"/>
-              </w:rPr>
-              <w:t xml:space="preserve">16.1</w:t>
-            </w:r>
-          </w:p>
-        </w:tc>
-        <w:tc>
-          <w:tcPr>
-            <w:tcW w:w="1214" w:type="dxa"/>
-            <w:tcBorders>
-              <w:top w:val="single" w:sz="4" w:space="0" w:color="000000"/>
-              <w:start w:val="single" w:sz="4" w:space="0" w:color="000000"/>
-              <w:bottom w:val="single" w:sz="4" w:space="0" w:color="000000"/>
-              <w:end w:val="single" w:sz="4" w:space="0" w:color="000000"/>
-            </w:tcBorders>
-          </w:tcPr>
-          <w:p>
-            <w:pPr>
-              <w:keepNext/>
-              <w:spacing w:before="0" w:after="0"/>
-              <w:jc w:val="center"/>
-            </w:pPr>
-            <w:r>
-              <w:rPr>
-                <w:rFonts w:ascii="Times New Roman" w:hAnsi="Times New Roman"/>
-                <w:sz w:val="18"/>
-                <w:szCs w:val="18"/>
-              </w:rPr>
-              <w:t xml:space="preserve">1,022</w:t>
-            </w:r>
-          </w:p>
-        </w:tc>
-        <w:tc>
-          <w:tcPr>
-            <w:tcW w:w="1214" w:type="dxa"/>
-            <w:tcBorders>
-              <w:top w:val="single" w:sz="4" w:space="0" w:color="000000"/>
-              <w:start w:val="single" w:sz="4" w:space="0" w:color="000000"/>
-              <w:bottom w:val="single" w:sz="4" w:space="0" w:color="000000"/>
-              <w:end w:val="single" w:sz="4" w:space="0" w:color="000000"/>
-            </w:tcBorders>
-          </w:tcPr>
-          <w:p>
-            <w:pPr>
-              <w:keepNext/>
-              <w:spacing w:before="0" w:after="0"/>
-              <w:jc w:val="center"/>
-            </w:pPr>
-            <w:r>
-              <w:rPr>
-                <w:rFonts w:ascii="Times New Roman" w:hAnsi="Times New Roman"/>
-                <w:sz w:val="18"/>
-                <w:szCs w:val="18"/>
-              </w:rPr>
-              <w:t xml:space="preserve">265</w:t>
-            </w:r>
-          </w:p>
-        </w:tc>
-        <w:tc>
-          <w:tcPr>
-            <w:tcW w:w="719" w:type="dxa"/>
-            <w:tcBorders>
-              <w:top w:val="single" w:sz="4" w:space="0" w:color="000000"/>
-              <w:start w:val="single" w:sz="4" w:space="0" w:color="000000"/>
-              <w:bottom w:val="single" w:sz="4" w:space="0" w:color="000000"/>
-              <w:end w:val="single" w:sz="4" w:space="0" w:color="000000"/>
-            </w:tcBorders>
-          </w:tcPr>
-          <w:p>
-            <w:pPr>
-              <w:keepNext/>
               <w:spacing w:before="0" w:after="0"/>
               <w:jc w:val="center"/>
             </w:pPr>
@@ -15851,186 +15049,6 @@
                 <w:szCs w:val="18"/>
               </w:rPr>
               <w:t xml:space="preserve">3.2</w:t>
-            </w:r>
-          </w:p>
-        </w:tc>
-      </w:tr>
-      <w:tr>
-        <w:trPr>
-          <w:cantSplit/>
-        </w:trPr>
-        <w:tc>
-          <w:tcPr>
-            <w:tcW w:w="1914" w:type="dxa"/>
-            <w:tcBorders>
-              <w:top w:val="single" w:sz="4" w:space="0" w:color="000000"/>
-              <w:start w:val="single" w:sz="4" w:space="0" w:color="000000"/>
-              <w:bottom w:val="single" w:sz="4" w:space="0" w:color="000000"/>
-              <w:end w:val="single" w:sz="4" w:space="0" w:color="000000"/>
-            </w:tcBorders>
-          </w:tcPr>
-          <w:p>
-            <w:pPr>
-              <w:spacing w:before="0" w:after="0"/>
-              <w:jc w:val="left"/>
-            </w:pPr>
-            <w:r>
-              <w:rPr>
-                <w:rFonts w:ascii="Times New Roman" w:hAnsi="Times New Roman"/>
-                <w:sz w:val="18"/>
-                <w:szCs w:val="18"/>
-              </w:rPr>
-              <w:t xml:space="preserve">oracle</w:t>
-            </w:r>
-          </w:p>
-        </w:tc>
-        <w:tc>
-          <w:tcPr>
-            <w:tcW w:w="1313" w:type="dxa"/>
-            <w:tcBorders>
-              <w:top w:val="single" w:sz="4" w:space="0" w:color="000000"/>
-              <w:start w:val="single" w:sz="4" w:space="0" w:color="000000"/>
-              <w:bottom w:val="single" w:sz="4" w:space="0" w:color="000000"/>
-              <w:end w:val="single" w:sz="4" w:space="0" w:color="000000"/>
-            </w:tcBorders>
-          </w:tcPr>
-          <w:p>
-            <w:pPr>
-              <w:spacing w:before="0" w:after="0"/>
-              <w:jc w:val="center"/>
-            </w:pPr>
-            <w:r>
-              <w:rPr>
-                <w:rFonts w:ascii="Times New Roman" w:hAnsi="Times New Roman"/>
-                <w:sz w:val="18"/>
-                <w:szCs w:val="18"/>
-              </w:rPr>
-              <w:t xml:space="preserve">294</w:t>
-            </w:r>
-          </w:p>
-        </w:tc>
-        <w:tc>
-          <w:tcPr>
-            <w:tcW w:w="1313" w:type="dxa"/>
-            <w:tcBorders>
-              <w:top w:val="single" w:sz="4" w:space="0" w:color="000000"/>
-              <w:start w:val="single" w:sz="4" w:space="0" w:color="000000"/>
-              <w:bottom w:val="single" w:sz="4" w:space="0" w:color="000000"/>
-              <w:end w:val="single" w:sz="4" w:space="0" w:color="000000"/>
-            </w:tcBorders>
-          </w:tcPr>
-          <w:p>
-            <w:pPr>
-              <w:spacing w:before="0" w:after="0"/>
-              <w:jc w:val="center"/>
-            </w:pPr>
-            <w:r>
-              <w:rPr>
-                <w:rFonts w:ascii="Times New Roman" w:hAnsi="Times New Roman"/>
-                <w:sz w:val="18"/>
-                <w:szCs w:val="18"/>
-              </w:rPr>
-              <w:t xml:space="preserve">285</w:t>
-            </w:r>
-          </w:p>
-        </w:tc>
-        <w:tc>
-          <w:tcPr>
-            <w:tcW w:w="817" w:type="dxa"/>
-            <w:tcBorders>
-              <w:top w:val="single" w:sz="4" w:space="0" w:color="000000"/>
-              <w:start w:val="single" w:sz="4" w:space="0" w:color="000000"/>
-              <w:bottom w:val="single" w:sz="4" w:space="0" w:color="000000"/>
-              <w:end w:val="single" w:sz="4" w:space="0" w:color="000000"/>
-            </w:tcBorders>
-          </w:tcPr>
-          <w:p>
-            <w:pPr>
-              <w:spacing w:before="0" w:after="0"/>
-              <w:jc w:val="center"/>
-            </w:pPr>
-            <w:r>
-              <w:rPr>
-                <w:rFonts w:ascii="Times New Roman" w:hAnsi="Times New Roman"/>
-                <w:sz w:val="18"/>
-                <w:szCs w:val="18"/>
-              </w:rPr>
-              <w:t xml:space="preserve">10.7</w:t>
-            </w:r>
-          </w:p>
-        </w:tc>
-        <w:tc>
-          <w:tcPr>
-            <w:tcW w:w="1214" w:type="dxa"/>
-            <w:tcBorders>
-              <w:top w:val="single" w:sz="4" w:space="0" w:color="000000"/>
-              <w:start w:val="single" w:sz="4" w:space="0" w:color="000000"/>
-              <w:bottom w:val="single" w:sz="4" w:space="0" w:color="000000"/>
-              <w:end w:val="single" w:sz="4" w:space="0" w:color="000000"/>
-            </w:tcBorders>
-          </w:tcPr>
-          <w:p>
-            <w:pPr>
-              <w:spacing w:before="0" w:after="0"/>
-              <w:jc w:val="center"/>
-            </w:pPr>
-            <w:r>
-              <w:rPr>
-                <w:rFonts w:ascii="Times New Roman" w:hAnsi="Times New Roman"/>
-                <w:sz w:val="18"/>
-                <w:szCs w:val="18"/>
-              </w:rPr>
-              <w:t xml:space="preserve">290</w:t>
-            </w:r>
-          </w:p>
-        </w:tc>
-        <w:tc>
-          <w:tcPr>
-            <w:tcW w:w="1214" w:type="dxa"/>
-            <w:tcBorders>
-              <w:top w:val="single" w:sz="4" w:space="0" w:color="000000"/>
-              <w:start w:val="single" w:sz="4" w:space="0" w:color="000000"/>
-              <w:bottom w:val="single" w:sz="4" w:space="0" w:color="000000"/>
-              <w:end w:val="single" w:sz="4" w:space="0" w:color="000000"/>
-            </w:tcBorders>
-          </w:tcPr>
-          <w:p>
-            <w:pPr>
-              <w:spacing w:before="0" w:after="0"/>
-              <w:jc w:val="center"/>
-            </w:pPr>
-            <w:r>
-              <w:rPr>
-                <w:rFonts w:ascii="Times New Roman" w:hAnsi="Times New Roman"/>
-                <w:sz w:val="18"/>
-                <w:szCs w:val="18"/>
-              </w:rPr>
-              <w:t xml:space="preserve">259</w:t>
-            </w:r>
-          </w:p>
-        </w:tc>
-        <w:tc>
-          <w:tcPr>
-            <w:tcW w:w="719" w:type="dxa"/>
-            <w:tcBorders>
-              <w:top w:val="single" w:sz="4" w:space="0" w:color="000000"/>
-              <w:start w:val="single" w:sz="4" w:space="0" w:color="000000"/>
-              <w:bottom w:val="single" w:sz="4" w:space="0" w:color="000000"/>
-              <w:end w:val="single" w:sz="4" w:space="0" w:color="000000"/>
-            </w:tcBorders>
-          </w:tcPr>
-          <w:p>
-            <w:pPr>
-              <w:spacing w:before="0" w:after="0"/>
-              <w:jc w:val="center"/>
-            </w:pPr>
-            <w:r>
-              <w:rPr>
-                <w:rFonts w:ascii="Times New Roman" w:hAnsi="Times New Roman"/>
-                <w:sz w:val="18"/>
-                <w:szCs w:val="18"/>
-              </w:rPr>
-              <w:t xml:space="preserve">1.9</w:t>
             </w:r>
           </w:p>
         </w:tc>

</xml_diff>